<commit_message>
Add Grunenthal third-party contract previews
</commit_message>
<xml_diff>
--- a/app/public/client/grunenthal/third-party-contracts/analisisderelacionesgrunenthal.docx
+++ b/app/public/client/grunenthal/third-party-contracts/analisisderelacionesgrunenthal.docx
@@ -1,6 +1,6 @@
 
 <file path=word/document.xml><?xml version="1.0" encoding="utf-8"?>
-<w:document xmlns:wpc="http://schemas.microsoft.com/office/word/2010/wordprocessingCanvas" xmlns:cx="http://schemas.microsoft.com/office/drawing/2014/chartex" xmlns:cx1="http://schemas.microsoft.com/office/drawing/2015/9/8/chartex" xmlns:cx2="http://schemas.microsoft.com/office/drawing/2015/10/21/chartex" xmlns:cx3="http://schemas.microsoft.com/office/drawing/2016/5/9/chartex" xmlns:cx4="http://schemas.microsoft.com/office/drawing/2016/5/10/chartex" xmlns:cx5="http://schemas.microsoft.com/office/drawing/2016/5/11/chartex" xmlns:cx6="http://schemas.microsoft.com/office/drawing/2016/5/12/chartex" xmlns:cx7="http://schemas.microsoft.com/office/drawing/2016/5/13/chartex" xmlns:cx8="http://schemas.microsoft.com/office/drawing/2016/5/14/chartex" xmlns:mc="http://schemas.openxmlformats.org/markup-compatibility/2006" xmlns:aink="http://schemas.microsoft.com/office/drawing/2016/ink" xmlns:am3d="http://schemas.microsoft.com/office/drawing/2017/model3d" xmlns:o="urn:schemas-microsoft-com:office:office" xmlns:oel="http://schemas.microsoft.com/office/2019/extlst" xmlns:r="http://schemas.openxmlformats.org/officeDocument/2006/relationships" xmlns:m="http://schemas.openxmlformats.org/officeDocument/2006/math" xmlns:v="urn:schemas-microsoft-com:vml" xmlns:wp14="http://schemas.microsoft.com/office/word/2010/wordprocessingDrawing" xmlns:wp="http://schemas.openxmlformats.org/drawingml/2006/wordprocessingDrawing" xmlns:w10="urn:schemas-microsoft-com:office:word" xmlns:w="http://schemas.openxmlformats.org/wordprocessingml/2006/main" xmlns:w14="http://schemas.microsoft.com/office/word/2010/wordml" xmlns:w15="http://schemas.microsoft.com/office/word/2012/wordml" xmlns:w16cex="http://schemas.microsoft.com/office/word/2018/wordml/cex" xmlns:w16cid="http://schemas.microsoft.com/office/word/2016/wordml/cid" xmlns:w16="http://schemas.microsoft.com/office/word/2018/wordml" xmlns:w16du="http://schemas.microsoft.com/office/word/2023/wordml/word16du" xmlns:w16sdtdh="http://schemas.microsoft.com/office/word/2020/wordml/sdtdatahash" xmlns:w16sdtfl="http://schemas.microsoft.com/office/word/2024/wordml/sdtformatlock" xmlns:w16se="http://schemas.microsoft.com/office/word/2015/wordml/symex" xmlns:wpg="http://schemas.microsoft.com/office/word/2010/wordprocessingGroup" xmlns:wpi="http://schemas.microsoft.com/office/word/2010/wordprocessingInk" xmlns:wne="http://schemas.microsoft.com/office/word/2006/wordml" xmlns:wps="http://schemas.microsoft.com/office/word/2010/wordprocessingShape" mc:Ignorable="w14 w15 w16se w16cid w16 w16cex w16sdtdh w16sdtfl w16du wp14">
+<w:document xmlns:wpc="http://schemas.microsoft.com/office/word/2010/wordprocessingCanvas" xmlns:cx="http://schemas.microsoft.com/office/drawing/2014/chartex" xmlns:cx1="http://schemas.microsoft.com/office/drawing/2015/9/8/chartex" xmlns:cx2="http://schemas.microsoft.com/office/drawing/2015/10/21/chartex" xmlns:cx3="http://schemas.microsoft.com/office/drawing/2016/5/9/chartex" xmlns:cx4="http://schemas.microsoft.com/office/drawing/2016/5/10/chartex" xmlns:cx5="http://schemas.microsoft.com/office/drawing/2016/5/11/chartex" xmlns:cx6="http://schemas.microsoft.com/office/drawing/2016/5/12/chartex" xmlns:cx7="http://schemas.microsoft.com/office/drawing/2016/5/13/chartex" xmlns:cx8="http://schemas.microsoft.com/office/drawing/2016/5/14/chartex" xmlns:mc="http://schemas.openxmlformats.org/markup-compatibility/2006" xmlns:m="http://schemas.openxmlformats.org/officeDocument/2006/math" xmlns:aink="http://schemas.microsoft.com/office/drawing/2016/ink" xmlns:am3d="http://schemas.microsoft.com/office/drawing/2017/model3d" xmlns:oel="http://schemas.microsoft.com/office/2019/extlst" xmlns:r="http://schemas.openxmlformats.org/officeDocument/2006/relationships" xmlns:wp14="http://schemas.microsoft.com/office/word/2010/wordprocessingDrawing" xmlns:wp="http://schemas.openxmlformats.org/drawingml/2006/wordprocessingDrawing" xmlns:wpg="http://schemas.microsoft.com/office/word/2010/wordprocessingGroup" xmlns:wpi="http://schemas.microsoft.com/office/word/2010/wordprocessingInk" xmlns:wps="http://schemas.microsoft.com/office/word/2010/wordprocessingShape" xmlns:o="urn:schemas-microsoft-com:office:office" xmlns:v="urn:schemas-microsoft-com:vml" xmlns:w10="urn:schemas-microsoft-com:office:word" xmlns:w="http://schemas.openxmlformats.org/wordprocessingml/2006/main" xmlns:w14="http://schemas.microsoft.com/office/word/2010/wordml" xmlns:w15="http://schemas.microsoft.com/office/word/2012/wordml" xmlns:w16cex="http://schemas.microsoft.com/office/word/2018/wordml/cex" xmlns:w16cid="http://schemas.microsoft.com/office/word/2016/wordml/cid" xmlns:w16="http://schemas.microsoft.com/office/word/2018/wordml" xmlns:w16sdtdh="http://schemas.microsoft.com/office/word/2020/wordml/sdtdatahash" xmlns:w16sdtfl="http://schemas.microsoft.com/office/word/2024/wordml/sdtformatlock" xmlns:w16se="http://schemas.microsoft.com/office/word/2015/wordml/symex" xmlns:w16du="http://schemas.microsoft.com/office/word/2023/wordml/word16du" xmlns:wne="http://schemas.microsoft.com/office/word/2006/wordml" mc:Ignorable="w14 w15 w16se w16cid w16 w16cex w16sdtdh w16sdtfl w16du wp14">
   <w:body>
     <w:p>
       <w:pPr>
@@ -690,7 +690,7 @@
           <w:noProof/>
         </w:rPr>
         <w:drawing>
-          <wp:anchor distT="0" distB="0" distL="114300" distR="114300" simplePos="0" relativeHeight="251659264" behindDoc="0" locked="0" layoutInCell="1" allowOverlap="1" wp14:anchorId="2F849ABF" wp14:editId="2D6EB215">
+          <wp:anchor distT="0" distB="0" distL="114300" distR="114300" simplePos="0" relativeHeight="251659264" behindDoc="0" locked="0" layoutInCell="1" allowOverlap="1" wp14:anchorId="2F849ABF" wp14:editId="715CC156">
             <wp:simplePos x="0" y="0"/>
             <wp:positionH relativeFrom="column">
               <wp:posOffset>3299791</wp:posOffset>
@@ -7518,6 +7518,298 @@
           </w:p>
         </w:tc>
       </w:tr>
+      <w:tr>
+        <w:tc>
+          <w:tcPr>
+            <w:tcW w:w="2987" w:type="dxa"/>
+            <w:shd w:val="clear" w:color="auto" w:fill="FFFFFF" w:themeFill="background1"/>
+            <w:vAlign w:val="center"/>
+          </w:tcPr>
+          <w:p>
+            <w:pPr>
+              <w:jc w:val="center"/>
+              <w:rPr>
+                <w:rFonts w:ascii="Calibri" w:hAnsi="Calibri" w:cs="Calibri"/>
+                <w:color w:val="000000" w:themeColor="text1"/>
+                <w:sz w:val="20"/>
+                <w:szCs w:val="20"/>
+                <w:lang w:val="en-US"/>
+              </w:rPr>
+            </w:pPr>
+            <w:r>
+              <w:rPr>
+                <w:rFonts w:ascii="Calibri" w:hAnsi="Calibri" w:cs="Calibri"/>
+                <w:color w:val="000000" w:themeColor="text1"/>
+                <w:sz w:val="20"/>
+                <w:szCs w:val="20"/>
+                <w:lang w:val="en-US"/>
+              </w:rPr>
+              <w:t>VIMEO</w:t>
+            </w:r>
+          </w:p>
+        </w:tc>
+        <w:tc>
+          <w:tcPr>
+            <w:tcW w:w="3344" w:type="dxa"/>
+            <w:shd w:val="clear" w:color="auto" w:fill="FFFFFF" w:themeFill="background1"/>
+            <w:vAlign w:val="center"/>
+          </w:tcPr>
+          <w:p>
+            <w:pPr>
+              <w:jc w:val="center"/>
+              <w:rPr>
+                <w:rFonts w:ascii="Calibri" w:hAnsi="Calibri" w:cs="Calibri"/>
+                <w:color w:val="000000" w:themeColor="text1"/>
+                <w:sz w:val="20"/>
+                <w:szCs w:val="20"/>
+                <w:lang w:val="es-ES_tradnl"/>
+              </w:rPr>
+            </w:pPr>
+            <w:r>
+              <w:rPr>
+                <w:rFonts w:ascii="Calibri" w:hAnsi="Calibri" w:cs="Calibri"/>
+                <w:color w:val="000000" w:themeColor="text1"/>
+                <w:sz w:val="20"/>
+                <w:szCs w:val="20"/>
+                <w:lang w:val="es-ES"/>
+              </w:rPr>
+              <w:t>Términos de Uso de plataforma para la creación y divulgación de videos</w:t>
+            </w:r>
+          </w:p>
+        </w:tc>
+        <w:tc>
+          <w:tcPr>
+            <w:tcW w:w="3144" w:type="dxa"/>
+            <w:shd w:val="clear" w:color="auto" w:fill="FFFFFF" w:themeFill="background1"/>
+            <w:vAlign w:val="center"/>
+          </w:tcPr>
+          <w:p>
+            <w:pPr>
+              <w:jc w:val="center"/>
+              <w:rPr>
+                <w:rFonts w:ascii="Calibri" w:hAnsi="Calibri" w:cs="Calibri"/>
+                <w:bCs/>
+                <w:color w:val="000000" w:themeColor="text1"/>
+                <w:sz w:val="20"/>
+                <w:szCs w:val="20"/>
+                <w:lang w:val="es-ES_tradnl"/>
+              </w:rPr>
+            </w:pPr>
+            <w:r>
+              <w:rPr>
+                <w:rFonts w:ascii="Calibri" w:hAnsi="Calibri" w:cs="Calibri"/>
+                <w:color w:val="000000" w:themeColor="text1"/>
+                <w:sz w:val="20"/>
+                <w:szCs w:val="20"/>
+                <w:lang w:val="es-ES"/>
+              </w:rPr>
+              <w:t>Transferencia</w:t>
+            </w:r>
+          </w:p>
+        </w:tc>
+      </w:tr>
+      <w:tr>
+        <w:tc>
+          <w:tcPr>
+            <w:tcW w:w="2987" w:type="dxa"/>
+            <w:shd w:val="clear" w:color="auto" w:fill="FFFFFF" w:themeFill="background1"/>
+            <w:vAlign w:val="center"/>
+          </w:tcPr>
+          <w:p>
+            <w:pPr>
+              <w:jc w:val="center"/>
+              <w:rPr>
+                <w:rFonts w:ascii="Calibri" w:hAnsi="Calibri" w:cs="Calibri"/>
+                <w:color w:val="000000" w:themeColor="text1"/>
+                <w:sz w:val="20"/>
+                <w:szCs w:val="20"/>
+                <w:lang w:val="en-US"/>
+              </w:rPr>
+            </w:pPr>
+            <w:r>
+              <w:rPr>
+                <w:rFonts w:ascii="Calibri" w:hAnsi="Calibri" w:cs="Calibri"/>
+                <w:color w:val="000000" w:themeColor="text1"/>
+                <w:sz w:val="20"/>
+                <w:szCs w:val="20"/>
+                <w:lang w:val="en-US"/>
+              </w:rPr>
+              <w:t>GPTW Deutschland GmbH</w:t>
+            </w:r>
+          </w:p>
+        </w:tc>
+        <w:tc>
+          <w:tcPr>
+            <w:tcW w:w="3344" w:type="dxa"/>
+            <w:shd w:val="clear" w:color="auto" w:fill="FFFFFF" w:themeFill="background1"/>
+            <w:vAlign w:val="center"/>
+          </w:tcPr>
+          <w:p>
+            <w:pPr>
+              <w:jc w:val="center"/>
+              <w:rPr>
+                <w:rFonts w:ascii="Calibri" w:hAnsi="Calibri" w:cs="Calibri"/>
+                <w:color w:val="000000" w:themeColor="text1"/>
+                <w:sz w:val="20"/>
+                <w:szCs w:val="20"/>
+                <w:lang w:val="es-ES_tradnl"/>
+              </w:rPr>
+            </w:pPr>
+            <w:r>
+              <w:rPr>
+                <w:rFonts w:ascii="Calibri" w:hAnsi="Calibri" w:cs="Calibri"/>
+                <w:color w:val="000000" w:themeColor="text1"/>
+                <w:sz w:val="20"/>
+                <w:szCs w:val="20"/>
+                <w:lang w:val="es-ES"/>
+              </w:rPr>
+              <w:t xml:space="preserve">Contrato de servicios para la certificación como Great Place </w:t>
+            </w:r>
+            <w:proofErr w:type="spellStart"/>
+            <w:r>
+              <w:rPr>
+                <w:rFonts w:ascii="Calibri" w:hAnsi="Calibri" w:cs="Calibri"/>
+                <w:color w:val="000000" w:themeColor="text1"/>
+                <w:sz w:val="20"/>
+                <w:szCs w:val="20"/>
+                <w:lang w:val="es-ES"/>
+              </w:rPr>
+              <w:t>To</w:t>
+            </w:r>
+            <w:proofErr w:type="spellEnd"/>
+            <w:r>
+              <w:rPr>
+                <w:rFonts w:ascii="Calibri" w:hAnsi="Calibri" w:cs="Calibri"/>
+                <w:color w:val="000000" w:themeColor="text1"/>
+                <w:sz w:val="20"/>
+                <w:szCs w:val="20"/>
+                <w:lang w:val="es-ES"/>
+              </w:rPr>
+              <w:t xml:space="preserve"> Work </w:t>
+            </w:r>
+          </w:p>
+        </w:tc>
+        <w:tc>
+          <w:tcPr>
+            <w:tcW w:w="3144" w:type="dxa"/>
+            <w:shd w:val="clear" w:color="auto" w:fill="FFFFFF" w:themeFill="background1"/>
+            <w:vAlign w:val="center"/>
+          </w:tcPr>
+          <w:p>
+            <w:pPr>
+              <w:jc w:val="center"/>
+              <w:rPr>
+                <w:rFonts w:ascii="Calibri" w:hAnsi="Calibri" w:cs="Calibri"/>
+                <w:bCs/>
+                <w:color w:val="000000" w:themeColor="text1"/>
+                <w:sz w:val="20"/>
+                <w:szCs w:val="20"/>
+                <w:lang w:val="es-ES_tradnl"/>
+              </w:rPr>
+            </w:pPr>
+            <w:r>
+              <w:rPr>
+                <w:rFonts w:ascii="Calibri" w:hAnsi="Calibri" w:cs="Calibri"/>
+                <w:color w:val="000000" w:themeColor="text1"/>
+                <w:sz w:val="20"/>
+                <w:szCs w:val="20"/>
+                <w:lang w:val="es-ES"/>
+              </w:rPr>
+              <w:t>Transferencias</w:t>
+            </w:r>
+          </w:p>
+        </w:tc>
+      </w:tr>
+      <w:tr>
+        <w:tc>
+          <w:tcPr>
+            <w:tcW w:w="2987" w:type="dxa"/>
+            <w:shd w:val="clear" w:color="auto" w:fill="FFFFFF" w:themeFill="background1"/>
+            <w:vAlign w:val="center"/>
+          </w:tcPr>
+          <w:p>
+            <w:pPr>
+              <w:jc w:val="center"/>
+              <w:rPr>
+                <w:rFonts w:ascii="Calibri" w:hAnsi="Calibri" w:cs="Calibri"/>
+                <w:color w:val="000000" w:themeColor="text1"/>
+                <w:sz w:val="20"/>
+                <w:szCs w:val="20"/>
+                <w:lang w:val="en-US"/>
+              </w:rPr>
+            </w:pPr>
+            <w:r>
+              <w:rPr>
+                <w:rFonts w:ascii="Calibri" w:hAnsi="Calibri" w:cs="Calibri"/>
+                <w:color w:val="000000" w:themeColor="text1"/>
+                <w:sz w:val="20"/>
+                <w:szCs w:val="20"/>
+                <w:lang w:val="en-US"/>
+              </w:rPr>
+              <w:t xml:space="preserve">MASTER CONTROL INC. </w:t>
+            </w:r>
+          </w:p>
+        </w:tc>
+        <w:tc>
+          <w:tcPr>
+            <w:tcW w:w="3344" w:type="dxa"/>
+            <w:shd w:val="clear" w:color="auto" w:fill="FFFFFF" w:themeFill="background1"/>
+            <w:vAlign w:val="center"/>
+          </w:tcPr>
+          <w:p>
+            <w:pPr>
+              <w:jc w:val="center"/>
+              <w:rPr>
+                <w:rFonts w:ascii="Calibri" w:hAnsi="Calibri" w:cs="Calibri"/>
+                <w:color w:val="000000" w:themeColor="text1"/>
+                <w:sz w:val="20"/>
+                <w:szCs w:val="20"/>
+                <w:lang w:val="es-ES_tradnl"/>
+              </w:rPr>
+            </w:pPr>
+            <w:r>
+              <w:rPr>
+                <w:rFonts w:ascii="Calibri" w:hAnsi="Calibri" w:cs="Calibri"/>
+                <w:color w:val="000000" w:themeColor="text1"/>
+                <w:sz w:val="20"/>
+                <w:szCs w:val="20"/>
+                <w:lang w:val="es-ES"/>
+              </w:rPr>
+              <w:t xml:space="preserve">Contrato de licencia de uso de software y prestación de servicios de capacitación. </w:t>
+            </w:r>
+          </w:p>
+        </w:tc>
+        <w:tc>
+          <w:tcPr>
+            <w:tcW w:w="3144" w:type="dxa"/>
+            <w:shd w:val="clear" w:color="auto" w:fill="FFFFFF" w:themeFill="background1"/>
+            <w:vAlign w:val="center"/>
+          </w:tcPr>
+          <w:p>
+            <w:pPr>
+              <w:jc w:val="center"/>
+              <w:rPr>
+                <w:rFonts w:ascii="Calibri" w:hAnsi="Calibri" w:cs="Calibri"/>
+                <w:bCs/>
+                <w:color w:val="000000" w:themeColor="text1"/>
+                <w:sz w:val="20"/>
+                <w:szCs w:val="20"/>
+                <w:lang w:val="es-ES_tradnl"/>
+              </w:rPr>
+            </w:pPr>
+            <w:r>
+              <w:rPr>
+                <w:rFonts w:ascii="Calibri" w:hAnsi="Calibri" w:cs="Calibri"/>
+                <w:color w:val="000000" w:themeColor="text1"/>
+                <w:sz w:val="20"/>
+                <w:szCs w:val="20"/>
+                <w:lang w:val="es-ES"/>
+              </w:rPr>
+              <w:t>Remisión</w:t>
+            </w:r>
+          </w:p>
+        </w:tc>
+      </w:tr>
     </w:tbl>
     <w:p>
       <w:pPr>
@@ -15393,18 +15685,18 @@
                 <w:color w:val="000000" w:themeColor="text1"/>
                 <w:sz w:val="20"/>
                 <w:szCs w:val="20"/>
-                <w:lang w:val="es-ES_tradnl"/>
-              </w:rPr>
-            </w:pPr>
-            <w:r>
-              <w:rPr>
-                <w:rFonts w:ascii="Calibri" w:hAnsi="Calibri" w:cs="Calibri"/>
-                <w:color w:val="000000" w:themeColor="text1"/>
-                <w:sz w:val="20"/>
-                <w:szCs w:val="20"/>
-                <w:lang w:val="es-ES"/>
-              </w:rPr>
-              <w:t>La cláusula si cumplen con los requisitos de la LFPDPPP y su Reglamento.</w:t>
+                <w:lang w:val="es-ES"/>
+              </w:rPr>
+            </w:pPr>
+            <w:r>
+              <w:rPr>
+                <w:rFonts w:ascii="Calibri" w:hAnsi="Calibri" w:cs="Calibri"/>
+                <w:color w:val="000000" w:themeColor="text1"/>
+                <w:sz w:val="20"/>
+                <w:szCs w:val="20"/>
+                <w:lang w:val="es-ES"/>
+              </w:rPr>
+              <w:t xml:space="preserve">La cláusula si cumplen con los requisitos de la LFPDPPP. </w:t>
             </w:r>
           </w:p>
         </w:tc>
@@ -16102,7 +16394,7 @@
               <w:pStyle w:val="Prrafodelista"/>
               <w:numPr>
                 <w:ilvl w:val="0"/>
-                <w:numId w:val="8"/>
+                <w:numId w:val="10"/>
               </w:numPr>
               <w:rPr>
                 <w:rFonts w:ascii="Calibri" w:hAnsi="Calibri" w:cs="Calibri"/>
@@ -19451,47 +19743,7 @@
                 <w:szCs w:val="20"/>
                 <w:lang w:val="es-ES"/>
               </w:rPr>
-              <w:t xml:space="preserve">La cláusula </w:t>
-            </w:r>
-            <w:r>
-              <w:rPr>
-                <w:rFonts w:ascii="Calibri" w:hAnsi="Calibri" w:cs="Calibri"/>
-                <w:color w:val="000000" w:themeColor="text1"/>
-                <w:sz w:val="20"/>
-                <w:szCs w:val="20"/>
-                <w:lang w:val="es-ES"/>
-              </w:rPr>
-              <w:t xml:space="preserve">no </w:t>
-            </w:r>
-            <w:r>
-              <w:rPr>
-                <w:rFonts w:ascii="Calibri" w:hAnsi="Calibri" w:cs="Calibri"/>
-                <w:color w:val="000000" w:themeColor="text1"/>
-                <w:sz w:val="20"/>
-                <w:szCs w:val="20"/>
-                <w:lang w:val="es-ES"/>
-              </w:rPr>
-              <w:t>cumple</w:t>
-            </w:r>
-            <w:r>
-              <w:rPr>
-                <w:rFonts w:ascii="Calibri" w:hAnsi="Calibri" w:cs="Calibri"/>
-                <w:color w:val="000000" w:themeColor="text1"/>
-                <w:sz w:val="20"/>
-                <w:szCs w:val="20"/>
-                <w:lang w:val="es-ES"/>
-              </w:rPr>
-              <w:t xml:space="preserve"> </w:t>
-            </w:r>
-            <w:r>
-              <w:rPr>
-                <w:rFonts w:ascii="Calibri" w:hAnsi="Calibri" w:cs="Calibri"/>
-                <w:color w:val="000000" w:themeColor="text1"/>
-                <w:sz w:val="20"/>
-                <w:szCs w:val="20"/>
-                <w:lang w:val="es-ES"/>
-              </w:rPr>
-              <w:t xml:space="preserve"> con los requisitos de la LFPDPPP. </w:t>
+              <w:t xml:space="preserve">La cláusula no cumple con los requisitos de la LFPDPPP. </w:t>
             </w:r>
           </w:p>
           <w:p>
@@ -19605,12 +19857,12 @@
         <w:tblLook w:val="04A0" w:firstRow="1" w:lastRow="0" w:firstColumn="1" w:lastColumn="0" w:noHBand="0" w:noVBand="1"/>
       </w:tblPr>
       <w:tblGrid>
-        <w:gridCol w:w="1909"/>
-        <w:gridCol w:w="1595"/>
-        <w:gridCol w:w="1453"/>
-        <w:gridCol w:w="2095"/>
-        <w:gridCol w:w="1418"/>
-        <w:gridCol w:w="1873"/>
+        <w:gridCol w:w="1796"/>
+        <w:gridCol w:w="1496"/>
+        <w:gridCol w:w="1429"/>
+        <w:gridCol w:w="2587"/>
+        <w:gridCol w:w="1294"/>
+        <w:gridCol w:w="1741"/>
       </w:tblGrid>
       <w:tr>
         <w:trPr>
@@ -19657,7 +19909,7 @@
         </w:trPr>
         <w:tc>
           <w:tcPr>
-            <w:tcW w:w="1909" w:type="dxa"/>
+            <w:tcW w:w="1796" w:type="dxa"/>
             <w:shd w:val="clear" w:color="auto" w:fill="00A159"/>
             <w:vAlign w:val="center"/>
           </w:tcPr>
@@ -19686,7 +19938,7 @@
         </w:tc>
         <w:tc>
           <w:tcPr>
-            <w:tcW w:w="1595" w:type="dxa"/>
+            <w:tcW w:w="1496" w:type="dxa"/>
             <w:shd w:val="clear" w:color="auto" w:fill="00A159"/>
             <w:vAlign w:val="center"/>
           </w:tcPr>
@@ -19715,7 +19967,7 @@
         </w:tc>
         <w:tc>
           <w:tcPr>
-            <w:tcW w:w="1453" w:type="dxa"/>
+            <w:tcW w:w="1429" w:type="dxa"/>
             <w:shd w:val="clear" w:color="auto" w:fill="00A159"/>
             <w:vAlign w:val="center"/>
           </w:tcPr>
@@ -19744,7 +19996,7 @@
         </w:tc>
         <w:tc>
           <w:tcPr>
-            <w:tcW w:w="2095" w:type="dxa"/>
+            <w:tcW w:w="2587" w:type="dxa"/>
             <w:shd w:val="clear" w:color="auto" w:fill="00A159"/>
             <w:vAlign w:val="center"/>
           </w:tcPr>
@@ -19773,7 +20025,7 @@
         </w:tc>
         <w:tc>
           <w:tcPr>
-            <w:tcW w:w="1418" w:type="dxa"/>
+            <w:tcW w:w="1294" w:type="dxa"/>
             <w:shd w:val="clear" w:color="auto" w:fill="00A159"/>
             <w:vAlign w:val="center"/>
           </w:tcPr>
@@ -19802,7 +20054,7 @@
         </w:tc>
         <w:tc>
           <w:tcPr>
-            <w:tcW w:w="1873" w:type="dxa"/>
+            <w:tcW w:w="1741" w:type="dxa"/>
             <w:shd w:val="clear" w:color="auto" w:fill="00A159"/>
             <w:vAlign w:val="center"/>
           </w:tcPr>
@@ -19877,7 +20129,7 @@
         </w:trPr>
         <w:tc>
           <w:tcPr>
-            <w:tcW w:w="1909" w:type="dxa"/>
+            <w:tcW w:w="1796" w:type="dxa"/>
             <w:shd w:val="clear" w:color="auto" w:fill="A6A6A6" w:themeFill="background1" w:themeFillShade="A6"/>
             <w:vAlign w:val="center"/>
           </w:tcPr>
@@ -19910,7 +20162,7 @@
         </w:tc>
         <w:tc>
           <w:tcPr>
-            <w:tcW w:w="1595" w:type="dxa"/>
+            <w:tcW w:w="1496" w:type="dxa"/>
             <w:vAlign w:val="center"/>
           </w:tcPr>
           <w:p>
@@ -19938,7 +20190,7 @@
         </w:tc>
         <w:tc>
           <w:tcPr>
-            <w:tcW w:w="1453" w:type="dxa"/>
+            <w:tcW w:w="1429" w:type="dxa"/>
             <w:vAlign w:val="center"/>
           </w:tcPr>
           <w:p>
@@ -19968,7 +20220,7 @@
         </w:tc>
         <w:tc>
           <w:tcPr>
-            <w:tcW w:w="2095" w:type="dxa"/>
+            <w:tcW w:w="2587" w:type="dxa"/>
             <w:vAlign w:val="center"/>
           </w:tcPr>
           <w:p>
@@ -19996,7 +20248,7 @@
         </w:tc>
         <w:tc>
           <w:tcPr>
-            <w:tcW w:w="1418" w:type="dxa"/>
+            <w:tcW w:w="1294" w:type="dxa"/>
             <w:vAlign w:val="center"/>
           </w:tcPr>
           <w:p>
@@ -20024,29 +20276,29 @@
         </w:tc>
         <w:tc>
           <w:tcPr>
-            <w:tcW w:w="1873" w:type="dxa"/>
-            <w:vAlign w:val="center"/>
-          </w:tcPr>
-          <w:p>
-            <w:pPr>
-              <w:jc w:val="center"/>
-              <w:rPr>
-                <w:rFonts w:ascii="Calibri" w:hAnsi="Calibri" w:cs="Calibri"/>
-                <w:color w:val="000000" w:themeColor="text1"/>
-                <w:sz w:val="20"/>
-                <w:szCs w:val="20"/>
-                <w:lang w:val="es-ES_tradnl"/>
-              </w:rPr>
-            </w:pPr>
-            <w:r>
-              <w:rPr>
-                <w:rFonts w:ascii="Calibri" w:hAnsi="Calibri" w:cs="Calibri"/>
-                <w:color w:val="000000" w:themeColor="text1"/>
-                <w:sz w:val="20"/>
-                <w:szCs w:val="20"/>
-                <w:lang w:val="es-ES_tradnl"/>
-              </w:rPr>
-              <w:t>La cláusula si cumplen con los requisitos de la LFPDPPP y su Reglamento.</w:t>
+            <w:tcW w:w="1741" w:type="dxa"/>
+            <w:vAlign w:val="center"/>
+          </w:tcPr>
+          <w:p>
+            <w:pPr>
+              <w:jc w:val="center"/>
+              <w:rPr>
+                <w:rFonts w:ascii="Calibri" w:hAnsi="Calibri" w:cs="Calibri"/>
+                <w:color w:val="000000" w:themeColor="text1"/>
+                <w:sz w:val="20"/>
+                <w:szCs w:val="20"/>
+                <w:lang w:val="es-ES"/>
+              </w:rPr>
+            </w:pPr>
+            <w:r>
+              <w:rPr>
+                <w:rFonts w:ascii="Calibri" w:hAnsi="Calibri" w:cs="Calibri"/>
+                <w:color w:val="000000" w:themeColor="text1"/>
+                <w:sz w:val="20"/>
+                <w:szCs w:val="20"/>
+                <w:lang w:val="es-ES"/>
+              </w:rPr>
+              <w:t>La cláusula si cumplen con los requisitos de la LFPDPPP</w:t>
             </w:r>
           </w:p>
         </w:tc>
@@ -20058,7 +20310,7 @@
         </w:trPr>
         <w:tc>
           <w:tcPr>
-            <w:tcW w:w="1909" w:type="dxa"/>
+            <w:tcW w:w="1796" w:type="dxa"/>
             <w:shd w:val="clear" w:color="auto" w:fill="A6A6A6" w:themeFill="background1" w:themeFillShade="A6"/>
             <w:vAlign w:val="center"/>
           </w:tcPr>
@@ -20091,7 +20343,7 @@
         </w:tc>
         <w:tc>
           <w:tcPr>
-            <w:tcW w:w="1595" w:type="dxa"/>
+            <w:tcW w:w="1496" w:type="dxa"/>
             <w:vAlign w:val="center"/>
           </w:tcPr>
           <w:p>
@@ -20129,7 +20381,7 @@
         </w:tc>
         <w:tc>
           <w:tcPr>
-            <w:tcW w:w="1453" w:type="dxa"/>
+            <w:tcW w:w="1429" w:type="dxa"/>
             <w:vAlign w:val="center"/>
           </w:tcPr>
           <w:p>
@@ -20159,7 +20411,7 @@
         </w:tc>
         <w:tc>
           <w:tcPr>
-            <w:tcW w:w="2095" w:type="dxa"/>
+            <w:tcW w:w="2587" w:type="dxa"/>
             <w:vAlign w:val="center"/>
           </w:tcPr>
           <w:p>
@@ -20205,7 +20457,7 @@
         </w:tc>
         <w:tc>
           <w:tcPr>
-            <w:tcW w:w="1418" w:type="dxa"/>
+            <w:tcW w:w="1294" w:type="dxa"/>
             <w:vAlign w:val="center"/>
           </w:tcPr>
           <w:p>
@@ -20233,29 +20485,29 @@
         </w:tc>
         <w:tc>
           <w:tcPr>
-            <w:tcW w:w="1873" w:type="dxa"/>
-            <w:vAlign w:val="center"/>
-          </w:tcPr>
-          <w:p>
-            <w:pPr>
-              <w:jc w:val="center"/>
-              <w:rPr>
-                <w:rFonts w:ascii="Calibri" w:hAnsi="Calibri" w:cs="Calibri"/>
-                <w:color w:val="000000" w:themeColor="text1"/>
-                <w:sz w:val="20"/>
-                <w:szCs w:val="20"/>
-                <w:lang w:val="es-ES_tradnl"/>
-              </w:rPr>
-            </w:pPr>
-            <w:r>
-              <w:rPr>
-                <w:rFonts w:ascii="Calibri" w:hAnsi="Calibri" w:cs="Calibri"/>
-                <w:color w:val="000000" w:themeColor="text1"/>
-                <w:sz w:val="20"/>
-                <w:szCs w:val="20"/>
-                <w:lang w:val="es-ES_tradnl"/>
-              </w:rPr>
-              <w:t>La cláusula si cumplen con los requisitos de la LFPDPPP y su Reglamento</w:t>
+            <w:tcW w:w="1741" w:type="dxa"/>
+            <w:vAlign w:val="center"/>
+          </w:tcPr>
+          <w:p>
+            <w:pPr>
+              <w:jc w:val="center"/>
+              <w:rPr>
+                <w:rFonts w:ascii="Calibri" w:hAnsi="Calibri" w:cs="Calibri"/>
+                <w:color w:val="000000" w:themeColor="text1"/>
+                <w:sz w:val="20"/>
+                <w:szCs w:val="20"/>
+                <w:lang w:val="es-ES"/>
+              </w:rPr>
+            </w:pPr>
+            <w:r>
+              <w:rPr>
+                <w:rFonts w:ascii="Calibri" w:hAnsi="Calibri" w:cs="Calibri"/>
+                <w:color w:val="000000" w:themeColor="text1"/>
+                <w:sz w:val="20"/>
+                <w:szCs w:val="20"/>
+                <w:lang w:val="es-ES"/>
+              </w:rPr>
+              <w:t xml:space="preserve">La cláusula si cumplen con los requisitos de la LFPDPPP. </w:t>
             </w:r>
           </w:p>
         </w:tc>
@@ -20267,7 +20519,7 @@
         </w:trPr>
         <w:tc>
           <w:tcPr>
-            <w:tcW w:w="1909" w:type="dxa"/>
+            <w:tcW w:w="1796" w:type="dxa"/>
             <w:shd w:val="clear" w:color="auto" w:fill="A6A6A6" w:themeFill="background1" w:themeFillShade="A6"/>
             <w:vAlign w:val="center"/>
           </w:tcPr>
@@ -20300,7 +20552,7 @@
         </w:tc>
         <w:tc>
           <w:tcPr>
-            <w:tcW w:w="1595" w:type="dxa"/>
+            <w:tcW w:w="1496" w:type="dxa"/>
             <w:vAlign w:val="center"/>
           </w:tcPr>
           <w:p>
@@ -20328,7 +20580,7 @@
         </w:tc>
         <w:tc>
           <w:tcPr>
-            <w:tcW w:w="1453" w:type="dxa"/>
+            <w:tcW w:w="1429" w:type="dxa"/>
             <w:vAlign w:val="center"/>
           </w:tcPr>
           <w:p>
@@ -20358,7 +20610,7 @@
         </w:tc>
         <w:tc>
           <w:tcPr>
-            <w:tcW w:w="2095" w:type="dxa"/>
+            <w:tcW w:w="2587" w:type="dxa"/>
             <w:vAlign w:val="center"/>
           </w:tcPr>
           <w:p>
@@ -20386,7 +20638,7 @@
         </w:tc>
         <w:tc>
           <w:tcPr>
-            <w:tcW w:w="1418" w:type="dxa"/>
+            <w:tcW w:w="1294" w:type="dxa"/>
             <w:vAlign w:val="center"/>
           </w:tcPr>
           <w:p>
@@ -20414,29 +20666,29 @@
         </w:tc>
         <w:tc>
           <w:tcPr>
-            <w:tcW w:w="1873" w:type="dxa"/>
-            <w:vAlign w:val="center"/>
-          </w:tcPr>
-          <w:p>
-            <w:pPr>
-              <w:jc w:val="center"/>
-              <w:rPr>
-                <w:rFonts w:ascii="Calibri" w:hAnsi="Calibri" w:cs="Calibri"/>
-                <w:color w:val="000000" w:themeColor="text1"/>
-                <w:sz w:val="20"/>
-                <w:szCs w:val="20"/>
-                <w:lang w:val="es-ES_tradnl"/>
-              </w:rPr>
-            </w:pPr>
-            <w:r>
-              <w:rPr>
-                <w:rFonts w:ascii="Calibri" w:hAnsi="Calibri" w:cs="Calibri"/>
-                <w:color w:val="000000" w:themeColor="text1"/>
-                <w:sz w:val="20"/>
-                <w:szCs w:val="20"/>
-                <w:lang w:val="es-ES_tradnl"/>
-              </w:rPr>
-              <w:t>La cláusula si cumplen con los requisitos de la LFPDPPP y su Reglamento</w:t>
+            <w:tcW w:w="1741" w:type="dxa"/>
+            <w:vAlign w:val="center"/>
+          </w:tcPr>
+          <w:p>
+            <w:pPr>
+              <w:jc w:val="center"/>
+              <w:rPr>
+                <w:rFonts w:ascii="Calibri" w:hAnsi="Calibri" w:cs="Calibri"/>
+                <w:color w:val="000000" w:themeColor="text1"/>
+                <w:sz w:val="20"/>
+                <w:szCs w:val="20"/>
+                <w:lang w:val="es-ES"/>
+              </w:rPr>
+            </w:pPr>
+            <w:r>
+              <w:rPr>
+                <w:rFonts w:ascii="Calibri" w:hAnsi="Calibri" w:cs="Calibri"/>
+                <w:color w:val="000000" w:themeColor="text1"/>
+                <w:sz w:val="20"/>
+                <w:szCs w:val="20"/>
+                <w:lang w:val="es-ES"/>
+              </w:rPr>
+              <w:t>La cláusula si cumplen con los requisitos de la LFPDPPP.</w:t>
             </w:r>
           </w:p>
         </w:tc>
@@ -20448,7 +20700,7 @@
         </w:trPr>
         <w:tc>
           <w:tcPr>
-            <w:tcW w:w="1909" w:type="dxa"/>
+            <w:tcW w:w="1796" w:type="dxa"/>
             <w:shd w:val="clear" w:color="auto" w:fill="A6A6A6" w:themeFill="background1" w:themeFillShade="A6"/>
             <w:vAlign w:val="center"/>
           </w:tcPr>
@@ -20481,7 +20733,7 @@
         </w:tc>
         <w:tc>
           <w:tcPr>
-            <w:tcW w:w="1595" w:type="dxa"/>
+            <w:tcW w:w="1496" w:type="dxa"/>
             <w:vAlign w:val="center"/>
           </w:tcPr>
           <w:p>
@@ -20529,7 +20781,7 @@
         </w:tc>
         <w:tc>
           <w:tcPr>
-            <w:tcW w:w="1453" w:type="dxa"/>
+            <w:tcW w:w="1429" w:type="dxa"/>
             <w:vAlign w:val="center"/>
           </w:tcPr>
           <w:p>
@@ -20559,7 +20811,7 @@
         </w:tc>
         <w:tc>
           <w:tcPr>
-            <w:tcW w:w="2095" w:type="dxa"/>
+            <w:tcW w:w="2587" w:type="dxa"/>
             <w:vAlign w:val="center"/>
           </w:tcPr>
           <w:p>
@@ -20587,7 +20839,7 @@
         </w:tc>
         <w:tc>
           <w:tcPr>
-            <w:tcW w:w="1418" w:type="dxa"/>
+            <w:tcW w:w="1294" w:type="dxa"/>
             <w:vAlign w:val="center"/>
           </w:tcPr>
           <w:p>
@@ -20615,29 +20867,29 @@
         </w:tc>
         <w:tc>
           <w:tcPr>
-            <w:tcW w:w="1873" w:type="dxa"/>
-            <w:vAlign w:val="center"/>
-          </w:tcPr>
-          <w:p>
-            <w:pPr>
-              <w:jc w:val="center"/>
-              <w:rPr>
-                <w:rFonts w:ascii="Calibri" w:hAnsi="Calibri" w:cs="Calibri"/>
-                <w:color w:val="000000" w:themeColor="text1"/>
-                <w:sz w:val="20"/>
-                <w:szCs w:val="20"/>
-                <w:lang w:val="es-ES_tradnl"/>
-              </w:rPr>
-            </w:pPr>
-            <w:r>
-              <w:rPr>
-                <w:rFonts w:ascii="Calibri" w:hAnsi="Calibri" w:cs="Calibri"/>
-                <w:color w:val="000000" w:themeColor="text1"/>
-                <w:sz w:val="20"/>
-                <w:szCs w:val="20"/>
-                <w:lang w:val="es-ES_tradnl"/>
-              </w:rPr>
-              <w:t>La cláusula si cumplen con los requisitos de la LFPDPPP y su Reglamento</w:t>
+            <w:tcW w:w="1741" w:type="dxa"/>
+            <w:vAlign w:val="center"/>
+          </w:tcPr>
+          <w:p>
+            <w:pPr>
+              <w:jc w:val="center"/>
+              <w:rPr>
+                <w:rFonts w:ascii="Calibri" w:hAnsi="Calibri" w:cs="Calibri"/>
+                <w:color w:val="000000" w:themeColor="text1"/>
+                <w:sz w:val="20"/>
+                <w:szCs w:val="20"/>
+                <w:lang w:val="es-ES"/>
+              </w:rPr>
+            </w:pPr>
+            <w:r>
+              <w:rPr>
+                <w:rFonts w:ascii="Calibri" w:hAnsi="Calibri" w:cs="Calibri"/>
+                <w:color w:val="000000" w:themeColor="text1"/>
+                <w:sz w:val="20"/>
+                <w:szCs w:val="20"/>
+                <w:lang w:val="es-ES"/>
+              </w:rPr>
+              <w:t>La cláusula si cumplen con los requisitos de la LFPDPPP.</w:t>
             </w:r>
           </w:p>
         </w:tc>
@@ -20649,7 +20901,7 @@
         </w:trPr>
         <w:tc>
           <w:tcPr>
-            <w:tcW w:w="1909" w:type="dxa"/>
+            <w:tcW w:w="1796" w:type="dxa"/>
             <w:shd w:val="clear" w:color="auto" w:fill="A6A6A6" w:themeFill="background1" w:themeFillShade="A6"/>
             <w:vAlign w:val="center"/>
           </w:tcPr>
@@ -20682,35 +20934,35 @@
         </w:tc>
         <w:tc>
           <w:tcPr>
-            <w:tcW w:w="1595" w:type="dxa"/>
-            <w:vAlign w:val="center"/>
-          </w:tcPr>
-          <w:p>
-            <w:pPr>
-              <w:jc w:val="center"/>
-              <w:rPr>
-                <w:rFonts w:ascii="Calibri" w:hAnsi="Calibri" w:cs="Calibri"/>
-                <w:color w:val="000000" w:themeColor="text1"/>
-                <w:sz w:val="20"/>
-                <w:szCs w:val="20"/>
-                <w:lang w:val="es-ES_tradnl"/>
-              </w:rPr>
-            </w:pPr>
-            <w:r>
-              <w:rPr>
-                <w:rFonts w:ascii="Calibri" w:hAnsi="Calibri" w:cs="Calibri"/>
-                <w:color w:val="000000" w:themeColor="text1"/>
-                <w:sz w:val="20"/>
-                <w:szCs w:val="20"/>
-                <w:lang w:val="es-ES_tradnl"/>
-              </w:rPr>
-              <w:t xml:space="preserve">Contrato de prestación de servicios de </w:t>
-            </w:r>
-          </w:p>
-        </w:tc>
-        <w:tc>
-          <w:tcPr>
-            <w:tcW w:w="1453" w:type="dxa"/>
+            <w:tcW w:w="1496" w:type="dxa"/>
+            <w:vAlign w:val="center"/>
+          </w:tcPr>
+          <w:p>
+            <w:pPr>
+              <w:jc w:val="center"/>
+              <w:rPr>
+                <w:rFonts w:ascii="Calibri" w:hAnsi="Calibri" w:cs="Calibri"/>
+                <w:color w:val="000000" w:themeColor="text1"/>
+                <w:sz w:val="20"/>
+                <w:szCs w:val="20"/>
+                <w:lang w:val="es-ES"/>
+              </w:rPr>
+            </w:pPr>
+            <w:r>
+              <w:rPr>
+                <w:rFonts w:ascii="Calibri" w:hAnsi="Calibri" w:cs="Calibri"/>
+                <w:color w:val="000000" w:themeColor="text1"/>
+                <w:sz w:val="20"/>
+                <w:szCs w:val="20"/>
+                <w:lang w:val="es-ES"/>
+              </w:rPr>
+              <w:t xml:space="preserve">Contrato de prestación de servicios de software. </w:t>
+            </w:r>
+          </w:p>
+        </w:tc>
+        <w:tc>
+          <w:tcPr>
+            <w:tcW w:w="1429" w:type="dxa"/>
             <w:vAlign w:val="center"/>
           </w:tcPr>
           <w:p>
@@ -20740,7 +20992,7 @@
         </w:tc>
         <w:tc>
           <w:tcPr>
-            <w:tcW w:w="2095" w:type="dxa"/>
+            <w:tcW w:w="2587" w:type="dxa"/>
             <w:vAlign w:val="center"/>
           </w:tcPr>
           <w:p>
@@ -20768,7 +21020,7 @@
         </w:tc>
         <w:tc>
           <w:tcPr>
-            <w:tcW w:w="1418" w:type="dxa"/>
+            <w:tcW w:w="1294" w:type="dxa"/>
             <w:vAlign w:val="center"/>
           </w:tcPr>
           <w:p>
@@ -20796,29 +21048,602 @@
         </w:tc>
         <w:tc>
           <w:tcPr>
-            <w:tcW w:w="1873" w:type="dxa"/>
-            <w:vAlign w:val="center"/>
-          </w:tcPr>
-          <w:p>
-            <w:pPr>
-              <w:jc w:val="center"/>
-              <w:rPr>
-                <w:rFonts w:ascii="Calibri" w:hAnsi="Calibri" w:cs="Calibri"/>
-                <w:color w:val="000000" w:themeColor="text1"/>
-                <w:sz w:val="20"/>
-                <w:szCs w:val="20"/>
-                <w:lang w:val="es-ES_tradnl"/>
-              </w:rPr>
-            </w:pPr>
-            <w:r>
-              <w:rPr>
-                <w:rFonts w:ascii="Calibri" w:hAnsi="Calibri" w:cs="Calibri"/>
-                <w:color w:val="000000" w:themeColor="text1"/>
-                <w:sz w:val="20"/>
-                <w:szCs w:val="20"/>
-                <w:lang w:val="es-ES_tradnl"/>
-              </w:rPr>
-              <w:t>La cláusula si cumplen con los requisitos de la LFPDPPP y su Reglamento</w:t>
+            <w:tcW w:w="1741" w:type="dxa"/>
+            <w:vAlign w:val="center"/>
+          </w:tcPr>
+          <w:p>
+            <w:pPr>
+              <w:jc w:val="center"/>
+              <w:rPr>
+                <w:rFonts w:ascii="Calibri" w:hAnsi="Calibri" w:cs="Calibri"/>
+                <w:color w:val="000000" w:themeColor="text1"/>
+                <w:sz w:val="20"/>
+                <w:szCs w:val="20"/>
+                <w:lang w:val="es-ES"/>
+              </w:rPr>
+            </w:pPr>
+            <w:r>
+              <w:rPr>
+                <w:rFonts w:ascii="Calibri" w:hAnsi="Calibri" w:cs="Calibri"/>
+                <w:color w:val="000000" w:themeColor="text1"/>
+                <w:sz w:val="20"/>
+                <w:szCs w:val="20"/>
+                <w:lang w:val="es-ES"/>
+              </w:rPr>
+              <w:t xml:space="preserve">La cláusula si cumplen con los requisitos de la LFPDPPP. </w:t>
+            </w:r>
+          </w:p>
+        </w:tc>
+      </w:tr>
+      <w:tr>
+        <w:trPr>
+          <w:trHeight w:val="716"/>
+          <w:jc w:val="center"/>
+        </w:trPr>
+        <w:tc>
+          <w:tcPr>
+            <w:tcW w:w="1796" w:type="dxa"/>
+            <w:shd w:val="clear" w:color="auto" w:fill="A6A6A6" w:themeFill="background1" w:themeFillShade="A6"/>
+            <w:vAlign w:val="center"/>
+          </w:tcPr>
+          <w:p>
+            <w:pPr>
+              <w:jc w:val="center"/>
+            </w:pPr>
+            <w:r>
+              <w:rPr>
+                <w:rFonts w:ascii="Calibri" w:hAnsi="Calibri" w:cs="Calibri"/>
+                <w:b/>
+                <w:bCs/>
+                <w:color w:val="FFFFFF" w:themeColor="background1"/>
+                <w:sz w:val="20"/>
+                <w:szCs w:val="20"/>
+                <w:lang w:val="en-US"/>
+              </w:rPr>
+              <w:t>VIMEO</w:t>
+            </w:r>
+          </w:p>
+        </w:tc>
+        <w:tc>
+          <w:tcPr>
+            <w:tcW w:w="1496" w:type="dxa"/>
+            <w:vAlign w:val="center"/>
+          </w:tcPr>
+          <w:p>
+            <w:pPr>
+              <w:jc w:val="center"/>
+              <w:rPr>
+                <w:rFonts w:ascii="Calibri" w:hAnsi="Calibri" w:cs="Calibri"/>
+                <w:color w:val="000000" w:themeColor="text1"/>
+                <w:sz w:val="20"/>
+                <w:szCs w:val="20"/>
+                <w:lang w:val="es-ES"/>
+              </w:rPr>
+            </w:pPr>
+            <w:r>
+              <w:rPr>
+                <w:rFonts w:ascii="Calibri" w:hAnsi="Calibri" w:cs="Calibri"/>
+                <w:color w:val="000000" w:themeColor="text1"/>
+                <w:sz w:val="20"/>
+                <w:szCs w:val="20"/>
+                <w:lang w:val="es-ES"/>
+              </w:rPr>
+              <w:t>Términos de Uso de plataforma para la creación y divulgación de videos</w:t>
+            </w:r>
+          </w:p>
+        </w:tc>
+        <w:tc>
+          <w:tcPr>
+            <w:tcW w:w="1429" w:type="dxa"/>
+            <w:vAlign w:val="center"/>
+          </w:tcPr>
+          <w:p>
+            <w:pPr>
+              <w:jc w:val="center"/>
+              <w:rPr>
+                <w:rFonts w:ascii="Calibri" w:hAnsi="Calibri" w:cs="Calibri"/>
+                <w:color w:val="000000" w:themeColor="text1"/>
+                <w:sz w:val="20"/>
+                <w:szCs w:val="20"/>
+                <w:lang w:val="es-ES"/>
+              </w:rPr>
+            </w:pPr>
+            <w:r>
+              <w:rPr>
+                <w:rFonts w:ascii="Calibri" w:hAnsi="Calibri" w:cs="Calibri"/>
+                <w:color w:val="000000" w:themeColor="text1"/>
+                <w:sz w:val="20"/>
+                <w:szCs w:val="20"/>
+                <w:lang w:val="es-ES"/>
+              </w:rPr>
+              <w:t>Transferencia</w:t>
+            </w:r>
+          </w:p>
+        </w:tc>
+        <w:tc>
+          <w:tcPr>
+            <w:tcW w:w="2587" w:type="dxa"/>
+            <w:vAlign w:val="center"/>
+          </w:tcPr>
+          <w:p>
+            <w:pPr>
+              <w:jc w:val="center"/>
+              <w:rPr>
+                <w:rFonts w:ascii="Calibri" w:hAnsi="Calibri" w:cs="Calibri"/>
+                <w:color w:val="000000" w:themeColor="text1"/>
+                <w:sz w:val="20"/>
+                <w:szCs w:val="20"/>
+                <w:lang w:val="es-ES"/>
+              </w:rPr>
+            </w:pPr>
+            <w:r>
+              <w:rPr>
+                <w:rFonts w:ascii="Calibri" w:hAnsi="Calibri" w:cs="Calibri"/>
+                <w:color w:val="000000" w:themeColor="text1"/>
+                <w:sz w:val="20"/>
+                <w:szCs w:val="20"/>
+                <w:lang w:val="es-ES"/>
+              </w:rPr>
+              <w:t>(1) Privacy policy</w:t>
+            </w:r>
+          </w:p>
+        </w:tc>
+        <w:tc>
+          <w:tcPr>
+            <w:tcW w:w="1294" w:type="dxa"/>
+            <w:vAlign w:val="center"/>
+          </w:tcPr>
+          <w:p>
+            <w:pPr>
+              <w:jc w:val="center"/>
+              <w:rPr>
+                <w:rFonts w:ascii="Calibri" w:hAnsi="Calibri" w:cs="Calibri"/>
+                <w:color w:val="000000" w:themeColor="text1"/>
+                <w:sz w:val="20"/>
+                <w:szCs w:val="20"/>
+                <w:lang w:val="es-ES"/>
+              </w:rPr>
+            </w:pPr>
+            <w:r>
+              <w:rPr>
+                <w:rFonts w:ascii="Calibri" w:hAnsi="Calibri" w:cs="Calibri"/>
+                <w:color w:val="000000" w:themeColor="text1"/>
+                <w:sz w:val="20"/>
+                <w:szCs w:val="20"/>
+                <w:lang w:val="es-ES"/>
+              </w:rPr>
+              <w:t>Sí cumple</w:t>
+            </w:r>
+          </w:p>
+        </w:tc>
+        <w:tc>
+          <w:tcPr>
+            <w:tcW w:w="1741" w:type="dxa"/>
+            <w:vAlign w:val="center"/>
+          </w:tcPr>
+          <w:p>
+            <w:pPr>
+              <w:jc w:val="center"/>
+              <w:rPr>
+                <w:rFonts w:ascii="Calibri" w:hAnsi="Calibri" w:cs="Calibri"/>
+                <w:color w:val="000000" w:themeColor="text1"/>
+                <w:sz w:val="20"/>
+                <w:szCs w:val="20"/>
+                <w:lang w:val="es-ES"/>
+              </w:rPr>
+            </w:pPr>
+            <w:r>
+              <w:rPr>
+                <w:rFonts w:ascii="Calibri" w:hAnsi="Calibri" w:cs="Calibri"/>
+                <w:color w:val="000000" w:themeColor="text1"/>
+                <w:sz w:val="20"/>
+                <w:szCs w:val="20"/>
+                <w:lang w:val="es-ES"/>
+              </w:rPr>
+              <w:t>La cláusula si cumplen con los requisitos de la LFPDPPP.</w:t>
+            </w:r>
+          </w:p>
+        </w:tc>
+      </w:tr>
+      <w:tr>
+        <w:trPr>
+          <w:trHeight w:val="716"/>
+          <w:jc w:val="center"/>
+        </w:trPr>
+        <w:tc>
+          <w:tcPr>
+            <w:tcW w:w="1796" w:type="dxa"/>
+            <w:shd w:val="clear" w:color="auto" w:fill="A6A6A6" w:themeFill="background1" w:themeFillShade="A6"/>
+            <w:vAlign w:val="center"/>
+          </w:tcPr>
+          <w:p>
+            <w:pPr>
+              <w:jc w:val="center"/>
+              <w:rPr>
+                <w:rFonts w:ascii="Calibri" w:hAnsi="Calibri" w:cs="Calibri"/>
+                <w:b/>
+                <w:bCs/>
+                <w:color w:val="FFFFFF" w:themeColor="background1"/>
+                <w:sz w:val="20"/>
+                <w:szCs w:val="20"/>
+                <w:lang w:val="en-US"/>
+              </w:rPr>
+            </w:pPr>
+            <w:r>
+              <w:rPr>
+                <w:rFonts w:asciiTheme="minorHAnsi" w:eastAsiaTheme="minorEastAsia" w:hAnsiTheme="minorHAnsi"/>
+                <w:b/>
+                <w:bCs/>
+                <w:color w:val="FFFFFF" w:themeColor="background1"/>
+                <w:sz w:val="20"/>
+                <w:szCs w:val="20"/>
+                <w:lang w:val="en-US"/>
+              </w:rPr>
+              <w:t>GPTW Deutschland GmbH</w:t>
+            </w:r>
+          </w:p>
+        </w:tc>
+        <w:tc>
+          <w:tcPr>
+            <w:tcW w:w="1496" w:type="dxa"/>
+            <w:vAlign w:val="center"/>
+          </w:tcPr>
+          <w:p>
+            <w:pPr>
+              <w:jc w:val="center"/>
+              <w:rPr>
+                <w:rFonts w:ascii="Calibri" w:hAnsi="Calibri" w:cs="Calibri"/>
+                <w:color w:val="000000" w:themeColor="text1"/>
+                <w:sz w:val="20"/>
+                <w:szCs w:val="20"/>
+                <w:lang w:val="es-ES"/>
+              </w:rPr>
+            </w:pPr>
+            <w:r>
+              <w:rPr>
+                <w:rFonts w:ascii="Calibri" w:hAnsi="Calibri" w:cs="Calibri"/>
+                <w:color w:val="000000" w:themeColor="text1"/>
+                <w:sz w:val="20"/>
+                <w:szCs w:val="20"/>
+                <w:lang w:val="es-ES"/>
+              </w:rPr>
+              <w:t xml:space="preserve">Contrato de servicios para la certificación como Great Place To Work </w:t>
+            </w:r>
+          </w:p>
+        </w:tc>
+        <w:tc>
+          <w:tcPr>
+            <w:tcW w:w="1429" w:type="dxa"/>
+            <w:vAlign w:val="center"/>
+          </w:tcPr>
+          <w:p>
+            <w:pPr>
+              <w:jc w:val="center"/>
+              <w:rPr>
+                <w:rFonts w:ascii="Calibri" w:hAnsi="Calibri" w:cs="Calibri"/>
+                <w:color w:val="000000" w:themeColor="text1"/>
+                <w:sz w:val="20"/>
+                <w:szCs w:val="20"/>
+                <w:lang w:val="es-ES"/>
+              </w:rPr>
+            </w:pPr>
+            <w:r>
+              <w:rPr>
+                <w:rFonts w:ascii="Calibri" w:hAnsi="Calibri" w:cs="Calibri"/>
+                <w:color w:val="000000" w:themeColor="text1"/>
+                <w:sz w:val="20"/>
+                <w:szCs w:val="20"/>
+                <w:lang w:val="es-ES"/>
+              </w:rPr>
+              <w:t>Transferencias</w:t>
+            </w:r>
+          </w:p>
+        </w:tc>
+        <w:tc>
+          <w:tcPr>
+            <w:tcW w:w="2587" w:type="dxa"/>
+            <w:vAlign w:val="center"/>
+          </w:tcPr>
+          <w:p>
+            <w:pPr>
+              <w:jc w:val="center"/>
+              <w:rPr>
+                <w:rFonts w:ascii="Calibri" w:hAnsi="Calibri" w:cs="Calibri"/>
+                <w:color w:val="000000" w:themeColor="text1"/>
+                <w:sz w:val="20"/>
+                <w:szCs w:val="20"/>
+                <w:lang w:val="es-ES"/>
+              </w:rPr>
+            </w:pPr>
+            <w:r>
+              <w:rPr>
+                <w:rFonts w:ascii="Calibri" w:hAnsi="Calibri" w:cs="Calibri"/>
+                <w:color w:val="000000" w:themeColor="text1"/>
+                <w:sz w:val="20"/>
+                <w:szCs w:val="20"/>
+                <w:lang w:val="es-ES"/>
+              </w:rPr>
+              <w:t xml:space="preserve">(1) </w:t>
+            </w:r>
+            <w:r>
+              <w:rPr>
+                <w:rFonts w:ascii="Calibri" w:eastAsia="Calibri" w:hAnsi="Calibri" w:cs="Calibri"/>
+                <w:sz w:val="20"/>
+                <w:szCs w:val="20"/>
+                <w:lang w:val="es-ES"/>
+              </w:rPr>
+              <w:t>Auftragsverarbeitungsvertrag</w:t>
+            </w:r>
+          </w:p>
+        </w:tc>
+        <w:tc>
+          <w:tcPr>
+            <w:tcW w:w="1294" w:type="dxa"/>
+            <w:vAlign w:val="center"/>
+          </w:tcPr>
+          <w:p>
+            <w:pPr>
+              <w:jc w:val="center"/>
+              <w:rPr>
+                <w:rFonts w:ascii="Calibri" w:hAnsi="Calibri" w:cs="Calibri"/>
+                <w:color w:val="000000" w:themeColor="text1"/>
+                <w:sz w:val="20"/>
+                <w:szCs w:val="20"/>
+                <w:lang w:val="es-ES"/>
+              </w:rPr>
+            </w:pPr>
+            <w:r>
+              <w:rPr>
+                <w:rFonts w:ascii="Calibri" w:hAnsi="Calibri" w:cs="Calibri"/>
+                <w:color w:val="000000" w:themeColor="text1"/>
+                <w:sz w:val="20"/>
+                <w:szCs w:val="20"/>
+                <w:lang w:val="es-ES"/>
+              </w:rPr>
+              <w:t>No cumple</w:t>
+            </w:r>
+          </w:p>
+        </w:tc>
+        <w:tc>
+          <w:tcPr>
+            <w:tcW w:w="1741" w:type="dxa"/>
+            <w:vAlign w:val="center"/>
+          </w:tcPr>
+          <w:p>
+            <w:pPr>
+              <w:jc w:val="center"/>
+              <w:rPr>
+                <w:rFonts w:ascii="Calibri" w:hAnsi="Calibri" w:cs="Calibri"/>
+                <w:color w:val="000000" w:themeColor="text1"/>
+                <w:sz w:val="20"/>
+                <w:szCs w:val="20"/>
+                <w:lang w:val="es-ES"/>
+              </w:rPr>
+            </w:pPr>
+            <w:r>
+              <w:rPr>
+                <w:rFonts w:ascii="Calibri" w:hAnsi="Calibri" w:cs="Calibri"/>
+                <w:color w:val="000000" w:themeColor="text1"/>
+                <w:sz w:val="20"/>
+                <w:szCs w:val="20"/>
+                <w:lang w:val="es-ES"/>
+              </w:rPr>
+              <w:t xml:space="preserve">El contrato regula una remisión de datos personales, como el responsable trata los datos personales de manera independiente de Grünenthal, con el objetivo de funcionar como un certificador independiente, se </w:t>
+            </w:r>
+            <w:r>
+              <w:rPr>
+                <w:rFonts w:ascii="Calibri" w:hAnsi="Calibri" w:cs="Calibri"/>
+                <w:color w:val="000000" w:themeColor="text1"/>
+                <w:sz w:val="20"/>
+                <w:szCs w:val="20"/>
+                <w:lang w:val="es-ES"/>
+              </w:rPr>
+              <w:lastRenderedPageBreak/>
+              <w:t xml:space="preserve">debe de considerar una transferencia. </w:t>
+            </w:r>
+          </w:p>
+          <w:p>
+            <w:pPr>
+              <w:jc w:val="center"/>
+              <w:rPr>
+                <w:rFonts w:ascii="Calibri" w:hAnsi="Calibri" w:cs="Calibri"/>
+                <w:color w:val="000000" w:themeColor="text1"/>
+                <w:sz w:val="20"/>
+                <w:szCs w:val="20"/>
+                <w:lang w:val="es-ES"/>
+              </w:rPr>
+            </w:pPr>
+          </w:p>
+          <w:p>
+            <w:pPr>
+              <w:jc w:val="center"/>
+              <w:rPr>
+                <w:rFonts w:ascii="Calibri" w:hAnsi="Calibri" w:cs="Calibri"/>
+                <w:color w:val="000000" w:themeColor="text1"/>
+                <w:sz w:val="20"/>
+                <w:szCs w:val="20"/>
+                <w:lang w:val="es-ES"/>
+              </w:rPr>
+            </w:pPr>
+          </w:p>
+        </w:tc>
+      </w:tr>
+      <w:tr>
+        <w:trPr>
+          <w:trHeight w:val="716"/>
+          <w:jc w:val="center"/>
+        </w:trPr>
+        <w:tc>
+          <w:tcPr>
+            <w:tcW w:w="1796" w:type="dxa"/>
+            <w:shd w:val="clear" w:color="auto" w:fill="A6A6A6" w:themeFill="background1" w:themeFillShade="A6"/>
+            <w:vAlign w:val="center"/>
+          </w:tcPr>
+          <w:p>
+            <w:pPr>
+              <w:jc w:val="center"/>
+              <w:rPr>
+                <w:rFonts w:ascii="Calibri" w:hAnsi="Calibri" w:cs="Calibri"/>
+                <w:b/>
+                <w:bCs/>
+                <w:color w:val="FFFFFF" w:themeColor="background1"/>
+                <w:sz w:val="20"/>
+                <w:szCs w:val="20"/>
+                <w:lang w:val="en-US"/>
+              </w:rPr>
+            </w:pPr>
+            <w:r>
+              <w:rPr>
+                <w:rFonts w:asciiTheme="minorHAnsi" w:eastAsiaTheme="minorEastAsia" w:hAnsiTheme="minorHAnsi"/>
+                <w:b/>
+                <w:bCs/>
+                <w:color w:val="FFFFFF" w:themeColor="background1"/>
+                <w:sz w:val="20"/>
+                <w:szCs w:val="20"/>
+                <w:lang w:val="en-US"/>
+              </w:rPr>
+              <w:lastRenderedPageBreak/>
+              <w:t xml:space="preserve">MASTER CONTROL INC. </w:t>
+            </w:r>
+          </w:p>
+        </w:tc>
+        <w:tc>
+          <w:tcPr>
+            <w:tcW w:w="1496" w:type="dxa"/>
+            <w:vAlign w:val="center"/>
+          </w:tcPr>
+          <w:p>
+            <w:pPr>
+              <w:jc w:val="center"/>
+              <w:rPr>
+                <w:rFonts w:ascii="Calibri" w:hAnsi="Calibri" w:cs="Calibri"/>
+                <w:color w:val="000000" w:themeColor="text1"/>
+                <w:sz w:val="20"/>
+                <w:szCs w:val="20"/>
+                <w:lang w:val="es-ES"/>
+              </w:rPr>
+            </w:pPr>
+            <w:r>
+              <w:rPr>
+                <w:rFonts w:ascii="Calibri" w:hAnsi="Calibri" w:cs="Calibri"/>
+                <w:color w:val="000000" w:themeColor="text1"/>
+                <w:sz w:val="20"/>
+                <w:szCs w:val="20"/>
+                <w:lang w:val="es-ES"/>
+              </w:rPr>
+              <w:t xml:space="preserve">Contrato de licencia de uso de software y prestación de servicios de capacitación. </w:t>
+            </w:r>
+          </w:p>
+        </w:tc>
+        <w:tc>
+          <w:tcPr>
+            <w:tcW w:w="1429" w:type="dxa"/>
+            <w:vAlign w:val="center"/>
+          </w:tcPr>
+          <w:p>
+            <w:pPr>
+              <w:jc w:val="center"/>
+              <w:rPr>
+                <w:rFonts w:ascii="Calibri" w:hAnsi="Calibri" w:cs="Calibri"/>
+                <w:color w:val="000000" w:themeColor="text1"/>
+                <w:sz w:val="20"/>
+                <w:szCs w:val="20"/>
+                <w:lang w:val="es-ES"/>
+              </w:rPr>
+            </w:pPr>
+            <w:r>
+              <w:rPr>
+                <w:rFonts w:ascii="Calibri" w:hAnsi="Calibri" w:cs="Calibri"/>
+                <w:color w:val="000000" w:themeColor="text1"/>
+                <w:sz w:val="20"/>
+                <w:szCs w:val="20"/>
+                <w:lang w:val="es-ES"/>
+              </w:rPr>
+              <w:t>Remisión</w:t>
+            </w:r>
+          </w:p>
+        </w:tc>
+        <w:tc>
+          <w:tcPr>
+            <w:tcW w:w="2587" w:type="dxa"/>
+            <w:vAlign w:val="center"/>
+          </w:tcPr>
+          <w:p>
+            <w:pPr>
+              <w:jc w:val="center"/>
+              <w:rPr>
+                <w:rFonts w:ascii="Calibri" w:hAnsi="Calibri" w:cs="Calibri"/>
+                <w:color w:val="000000" w:themeColor="text1"/>
+                <w:sz w:val="20"/>
+                <w:szCs w:val="20"/>
+                <w:lang w:val="es-ES"/>
+              </w:rPr>
+            </w:pPr>
+            <w:r>
+              <w:rPr>
+                <w:rFonts w:ascii="Calibri" w:hAnsi="Calibri" w:cs="Calibri"/>
+                <w:color w:val="000000" w:themeColor="text1"/>
+                <w:sz w:val="20"/>
+                <w:szCs w:val="20"/>
+                <w:lang w:val="es-ES"/>
+              </w:rPr>
+              <w:t>(1) Data Processing Addendum</w:t>
+            </w:r>
+          </w:p>
+        </w:tc>
+        <w:tc>
+          <w:tcPr>
+            <w:tcW w:w="1294" w:type="dxa"/>
+            <w:vAlign w:val="center"/>
+          </w:tcPr>
+          <w:p>
+            <w:pPr>
+              <w:jc w:val="center"/>
+              <w:rPr>
+                <w:rFonts w:ascii="Calibri" w:hAnsi="Calibri" w:cs="Calibri"/>
+                <w:color w:val="000000" w:themeColor="text1"/>
+                <w:sz w:val="20"/>
+                <w:szCs w:val="20"/>
+                <w:lang w:val="es-ES"/>
+              </w:rPr>
+            </w:pPr>
+            <w:r>
+              <w:rPr>
+                <w:rFonts w:ascii="Calibri" w:hAnsi="Calibri" w:cs="Calibri"/>
+                <w:color w:val="000000" w:themeColor="text1"/>
+                <w:sz w:val="20"/>
+                <w:szCs w:val="20"/>
+                <w:lang w:val="es-ES"/>
+              </w:rPr>
+              <w:t>Sí cumple</w:t>
+            </w:r>
+          </w:p>
+        </w:tc>
+        <w:tc>
+          <w:tcPr>
+            <w:tcW w:w="1741" w:type="dxa"/>
+            <w:vAlign w:val="center"/>
+          </w:tcPr>
+          <w:p>
+            <w:pPr>
+              <w:jc w:val="center"/>
+              <w:rPr>
+                <w:rFonts w:ascii="Calibri" w:hAnsi="Calibri" w:cs="Calibri"/>
+                <w:color w:val="000000" w:themeColor="text1"/>
+                <w:sz w:val="20"/>
+                <w:szCs w:val="20"/>
+                <w:lang w:val="es-ES"/>
+              </w:rPr>
+            </w:pPr>
+            <w:r>
+              <w:rPr>
+                <w:rFonts w:ascii="Calibri" w:hAnsi="Calibri" w:cs="Calibri"/>
+                <w:color w:val="000000" w:themeColor="text1"/>
+                <w:sz w:val="20"/>
+                <w:szCs w:val="20"/>
+                <w:lang w:val="es-ES"/>
+              </w:rPr>
+              <w:t xml:space="preserve">La cláusula si cumplen con los requisitos de la LFPDPPP. </w:t>
             </w:r>
           </w:p>
         </w:tc>
@@ -20855,7 +21680,7 @@
 </file>
 
 <file path=word/endnotes.xml><?xml version="1.0" encoding="utf-8"?>
-<w:endnotes xmlns:wpc="http://schemas.microsoft.com/office/word/2010/wordprocessingCanvas" xmlns:cx="http://schemas.microsoft.com/office/drawing/2014/chartex" xmlns:cx1="http://schemas.microsoft.com/office/drawing/2015/9/8/chartex" xmlns:cx2="http://schemas.microsoft.com/office/drawing/2015/10/21/chartex" xmlns:cx3="http://schemas.microsoft.com/office/drawing/2016/5/9/chartex" xmlns:cx4="http://schemas.microsoft.com/office/drawing/2016/5/10/chartex" xmlns:cx5="http://schemas.microsoft.com/office/drawing/2016/5/11/chartex" xmlns:cx6="http://schemas.microsoft.com/office/drawing/2016/5/12/chartex" xmlns:cx7="http://schemas.microsoft.com/office/drawing/2016/5/13/chartex" xmlns:cx8="http://schemas.microsoft.com/office/drawing/2016/5/14/chartex" xmlns:mc="http://schemas.openxmlformats.org/markup-compatibility/2006" xmlns:aink="http://schemas.microsoft.com/office/drawing/2016/ink" xmlns:am3d="http://schemas.microsoft.com/office/drawing/2017/model3d" xmlns:o="urn:schemas-microsoft-com:office:office" xmlns:oel="http://schemas.microsoft.com/office/2019/extlst" xmlns:r="http://schemas.openxmlformats.org/officeDocument/2006/relationships" xmlns:m="http://schemas.openxmlformats.org/officeDocument/2006/math" xmlns:v="urn:schemas-microsoft-com:vml" xmlns:wp14="http://schemas.microsoft.com/office/word/2010/wordprocessingDrawing" xmlns:wp="http://schemas.openxmlformats.org/drawingml/2006/wordprocessingDrawing" xmlns:w10="urn:schemas-microsoft-com:office:word" xmlns:w="http://schemas.openxmlformats.org/wordprocessingml/2006/main" xmlns:w14="http://schemas.microsoft.com/office/word/2010/wordml" xmlns:w15="http://schemas.microsoft.com/office/word/2012/wordml" xmlns:w16cex="http://schemas.microsoft.com/office/word/2018/wordml/cex" xmlns:w16cid="http://schemas.microsoft.com/office/word/2016/wordml/cid" xmlns:w16="http://schemas.microsoft.com/office/word/2018/wordml" xmlns:w16du="http://schemas.microsoft.com/office/word/2023/wordml/word16du" xmlns:w16sdtdh="http://schemas.microsoft.com/office/word/2020/wordml/sdtdatahash" xmlns:w16sdtfl="http://schemas.microsoft.com/office/word/2024/wordml/sdtformatlock" xmlns:w16se="http://schemas.microsoft.com/office/word/2015/wordml/symex" xmlns:wpg="http://schemas.microsoft.com/office/word/2010/wordprocessingGroup" xmlns:wpi="http://schemas.microsoft.com/office/word/2010/wordprocessingInk" xmlns:wne="http://schemas.microsoft.com/office/word/2006/wordml" xmlns:wps="http://schemas.microsoft.com/office/word/2010/wordprocessingShape" mc:Ignorable="w14 w15 w16se w16cid w16 w16cex w16sdtdh w16sdtfl w16du wp14">
+<w:endnotes xmlns:wpc="http://schemas.microsoft.com/office/word/2010/wordprocessingCanvas" xmlns:cx="http://schemas.microsoft.com/office/drawing/2014/chartex" xmlns:cx1="http://schemas.microsoft.com/office/drawing/2015/9/8/chartex" xmlns:cx2="http://schemas.microsoft.com/office/drawing/2015/10/21/chartex" xmlns:cx3="http://schemas.microsoft.com/office/drawing/2016/5/9/chartex" xmlns:cx4="http://schemas.microsoft.com/office/drawing/2016/5/10/chartex" xmlns:cx5="http://schemas.microsoft.com/office/drawing/2016/5/11/chartex" xmlns:cx6="http://schemas.microsoft.com/office/drawing/2016/5/12/chartex" xmlns:cx7="http://schemas.microsoft.com/office/drawing/2016/5/13/chartex" xmlns:cx8="http://schemas.microsoft.com/office/drawing/2016/5/14/chartex" xmlns:mc="http://schemas.openxmlformats.org/markup-compatibility/2006" xmlns:m="http://schemas.openxmlformats.org/officeDocument/2006/math" xmlns:aink="http://schemas.microsoft.com/office/drawing/2016/ink" xmlns:am3d="http://schemas.microsoft.com/office/drawing/2017/model3d" xmlns:oel="http://schemas.microsoft.com/office/2019/extlst" xmlns:r="http://schemas.openxmlformats.org/officeDocument/2006/relationships" xmlns:wp14="http://schemas.microsoft.com/office/word/2010/wordprocessingDrawing" xmlns:wp="http://schemas.openxmlformats.org/drawingml/2006/wordprocessingDrawing" xmlns:wpg="http://schemas.microsoft.com/office/word/2010/wordprocessingGroup" xmlns:wpi="http://schemas.microsoft.com/office/word/2010/wordprocessingInk" xmlns:wps="http://schemas.microsoft.com/office/word/2010/wordprocessingShape" xmlns:o="urn:schemas-microsoft-com:office:office" xmlns:v="urn:schemas-microsoft-com:vml" xmlns:w10="urn:schemas-microsoft-com:office:word" xmlns:w="http://schemas.openxmlformats.org/wordprocessingml/2006/main" xmlns:w14="http://schemas.microsoft.com/office/word/2010/wordml" xmlns:w15="http://schemas.microsoft.com/office/word/2012/wordml" xmlns:w16cex="http://schemas.microsoft.com/office/word/2018/wordml/cex" xmlns:w16cid="http://schemas.microsoft.com/office/word/2016/wordml/cid" xmlns:w16="http://schemas.microsoft.com/office/word/2018/wordml" xmlns:w16sdtdh="http://schemas.microsoft.com/office/word/2020/wordml/sdtdatahash" xmlns:w16sdtfl="http://schemas.microsoft.com/office/word/2024/wordml/sdtformatlock" xmlns:w16se="http://schemas.microsoft.com/office/word/2015/wordml/symex" xmlns:w16du="http://schemas.microsoft.com/office/word/2023/wordml/word16du" xmlns:wne="http://schemas.microsoft.com/office/word/2006/wordml" mc:Ignorable="w14 w15 w16se w16cid w16 w16cex w16sdtdh w16sdtfl w16du wp14">
   <w:endnote w:type="separator" w:id="-1">
     <w:p>
       <w:pPr>
@@ -20880,7 +21705,7 @@
 </file>
 
 <file path=word/footer1.xml><?xml version="1.0" encoding="utf-8"?>
-<w:ftr xmlns:wpc="http://schemas.microsoft.com/office/word/2010/wordprocessingCanvas" xmlns:cx="http://schemas.microsoft.com/office/drawing/2014/chartex" xmlns:cx1="http://schemas.microsoft.com/office/drawing/2015/9/8/chartex" xmlns:cx2="http://schemas.microsoft.com/office/drawing/2015/10/21/chartex" xmlns:cx3="http://schemas.microsoft.com/office/drawing/2016/5/9/chartex" xmlns:cx4="http://schemas.microsoft.com/office/drawing/2016/5/10/chartex" xmlns:cx5="http://schemas.microsoft.com/office/drawing/2016/5/11/chartex" xmlns:cx6="http://schemas.microsoft.com/office/drawing/2016/5/12/chartex" xmlns:cx7="http://schemas.microsoft.com/office/drawing/2016/5/13/chartex" xmlns:cx8="http://schemas.microsoft.com/office/drawing/2016/5/14/chartex" xmlns:mc="http://schemas.openxmlformats.org/markup-compatibility/2006" xmlns:aink="http://schemas.microsoft.com/office/drawing/2016/ink" xmlns:am3d="http://schemas.microsoft.com/office/drawing/2017/model3d" xmlns:o="urn:schemas-microsoft-com:office:office" xmlns:oel="http://schemas.microsoft.com/office/2019/extlst" xmlns:r="http://schemas.openxmlformats.org/officeDocument/2006/relationships" xmlns:m="http://schemas.openxmlformats.org/officeDocument/2006/math" xmlns:v="urn:schemas-microsoft-com:vml" xmlns:wp14="http://schemas.microsoft.com/office/word/2010/wordprocessingDrawing" xmlns:wp="http://schemas.openxmlformats.org/drawingml/2006/wordprocessingDrawing" xmlns:w10="urn:schemas-microsoft-com:office:word" xmlns:w="http://schemas.openxmlformats.org/wordprocessingml/2006/main" xmlns:w14="http://schemas.microsoft.com/office/word/2010/wordml" xmlns:w15="http://schemas.microsoft.com/office/word/2012/wordml" xmlns:w16cex="http://schemas.microsoft.com/office/word/2018/wordml/cex" xmlns:w16cid="http://schemas.microsoft.com/office/word/2016/wordml/cid" xmlns:w16="http://schemas.microsoft.com/office/word/2018/wordml" xmlns:w16du="http://schemas.microsoft.com/office/word/2023/wordml/word16du" xmlns:w16sdtdh="http://schemas.microsoft.com/office/word/2020/wordml/sdtdatahash" xmlns:w16sdtfl="http://schemas.microsoft.com/office/word/2024/wordml/sdtformatlock" xmlns:w16se="http://schemas.microsoft.com/office/word/2015/wordml/symex" xmlns:wpg="http://schemas.microsoft.com/office/word/2010/wordprocessingGroup" xmlns:wpi="http://schemas.microsoft.com/office/word/2010/wordprocessingInk" xmlns:wne="http://schemas.microsoft.com/office/word/2006/wordml" xmlns:wps="http://schemas.microsoft.com/office/word/2010/wordprocessingShape" mc:Ignorable="w14 w15 w16se w16cid w16 w16cex w16sdtdh w16sdtfl w16du wp14">
+<w:ftr xmlns:wpc="http://schemas.microsoft.com/office/word/2010/wordprocessingCanvas" xmlns:cx="http://schemas.microsoft.com/office/drawing/2014/chartex" xmlns:cx1="http://schemas.microsoft.com/office/drawing/2015/9/8/chartex" xmlns:cx2="http://schemas.microsoft.com/office/drawing/2015/10/21/chartex" xmlns:cx3="http://schemas.microsoft.com/office/drawing/2016/5/9/chartex" xmlns:cx4="http://schemas.microsoft.com/office/drawing/2016/5/10/chartex" xmlns:cx5="http://schemas.microsoft.com/office/drawing/2016/5/11/chartex" xmlns:cx6="http://schemas.microsoft.com/office/drawing/2016/5/12/chartex" xmlns:cx7="http://schemas.microsoft.com/office/drawing/2016/5/13/chartex" xmlns:cx8="http://schemas.microsoft.com/office/drawing/2016/5/14/chartex" xmlns:mc="http://schemas.openxmlformats.org/markup-compatibility/2006" xmlns:m="http://schemas.openxmlformats.org/officeDocument/2006/math" xmlns:aink="http://schemas.microsoft.com/office/drawing/2016/ink" xmlns:am3d="http://schemas.microsoft.com/office/drawing/2017/model3d" xmlns:oel="http://schemas.microsoft.com/office/2019/extlst" xmlns:r="http://schemas.openxmlformats.org/officeDocument/2006/relationships" xmlns:wp14="http://schemas.microsoft.com/office/word/2010/wordprocessingDrawing" xmlns:wp="http://schemas.openxmlformats.org/drawingml/2006/wordprocessingDrawing" xmlns:wpg="http://schemas.microsoft.com/office/word/2010/wordprocessingGroup" xmlns:wpi="http://schemas.microsoft.com/office/word/2010/wordprocessingInk" xmlns:wps="http://schemas.microsoft.com/office/word/2010/wordprocessingShape" xmlns:o="urn:schemas-microsoft-com:office:office" xmlns:v="urn:schemas-microsoft-com:vml" xmlns:w10="urn:schemas-microsoft-com:office:word" xmlns:w="http://schemas.openxmlformats.org/wordprocessingml/2006/main" xmlns:w14="http://schemas.microsoft.com/office/word/2010/wordml" xmlns:w15="http://schemas.microsoft.com/office/word/2012/wordml" xmlns:w16cex="http://schemas.microsoft.com/office/word/2018/wordml/cex" xmlns:w16cid="http://schemas.microsoft.com/office/word/2016/wordml/cid" xmlns:w16="http://schemas.microsoft.com/office/word/2018/wordml" xmlns:w16sdtdh="http://schemas.microsoft.com/office/word/2020/wordml/sdtdatahash" xmlns:w16sdtfl="http://schemas.microsoft.com/office/word/2024/wordml/sdtformatlock" xmlns:w16se="http://schemas.microsoft.com/office/word/2015/wordml/symex" xmlns:w16du="http://schemas.microsoft.com/office/word/2023/wordml/word16du" xmlns:wne="http://schemas.microsoft.com/office/word/2006/wordml" mc:Ignorable="w14 w15 w16se w16cid w16 w16cex w16sdtdh w16sdtfl w16du wp14">
   <w:p>
     <w:pPr>
       <w:pBdr>
@@ -21008,7 +21833,7 @@
 </file>
 
 <file path=word/footer2.xml><?xml version="1.0" encoding="utf-8"?>
-<w:ftr xmlns:wpc="http://schemas.microsoft.com/office/word/2010/wordprocessingCanvas" xmlns:cx="http://schemas.microsoft.com/office/drawing/2014/chartex" xmlns:cx1="http://schemas.microsoft.com/office/drawing/2015/9/8/chartex" xmlns:cx2="http://schemas.microsoft.com/office/drawing/2015/10/21/chartex" xmlns:cx3="http://schemas.microsoft.com/office/drawing/2016/5/9/chartex" xmlns:cx4="http://schemas.microsoft.com/office/drawing/2016/5/10/chartex" xmlns:cx5="http://schemas.microsoft.com/office/drawing/2016/5/11/chartex" xmlns:cx6="http://schemas.microsoft.com/office/drawing/2016/5/12/chartex" xmlns:cx7="http://schemas.microsoft.com/office/drawing/2016/5/13/chartex" xmlns:cx8="http://schemas.microsoft.com/office/drawing/2016/5/14/chartex" xmlns:mc="http://schemas.openxmlformats.org/markup-compatibility/2006" xmlns:aink="http://schemas.microsoft.com/office/drawing/2016/ink" xmlns:am3d="http://schemas.microsoft.com/office/drawing/2017/model3d" xmlns:o="urn:schemas-microsoft-com:office:office" xmlns:oel="http://schemas.microsoft.com/office/2019/extlst" xmlns:r="http://schemas.openxmlformats.org/officeDocument/2006/relationships" xmlns:m="http://schemas.openxmlformats.org/officeDocument/2006/math" xmlns:v="urn:schemas-microsoft-com:vml" xmlns:wp14="http://schemas.microsoft.com/office/word/2010/wordprocessingDrawing" xmlns:wp="http://schemas.openxmlformats.org/drawingml/2006/wordprocessingDrawing" xmlns:w10="urn:schemas-microsoft-com:office:word" xmlns:w="http://schemas.openxmlformats.org/wordprocessingml/2006/main" xmlns:w14="http://schemas.microsoft.com/office/word/2010/wordml" xmlns:w15="http://schemas.microsoft.com/office/word/2012/wordml" xmlns:w16cex="http://schemas.microsoft.com/office/word/2018/wordml/cex" xmlns:w16cid="http://schemas.microsoft.com/office/word/2016/wordml/cid" xmlns:w16="http://schemas.microsoft.com/office/word/2018/wordml" xmlns:w16du="http://schemas.microsoft.com/office/word/2023/wordml/word16du" xmlns:w16sdtdh="http://schemas.microsoft.com/office/word/2020/wordml/sdtdatahash" xmlns:w16sdtfl="http://schemas.microsoft.com/office/word/2024/wordml/sdtformatlock" xmlns:w16se="http://schemas.microsoft.com/office/word/2015/wordml/symex" xmlns:wpg="http://schemas.microsoft.com/office/word/2010/wordprocessingGroup" xmlns:wpi="http://schemas.microsoft.com/office/word/2010/wordprocessingInk" xmlns:wne="http://schemas.microsoft.com/office/word/2006/wordml" xmlns:wps="http://schemas.microsoft.com/office/word/2010/wordprocessingShape" mc:Ignorable="w14 w15 w16se w16cid w16 w16cex w16sdtdh w16sdtfl w16du wp14">
+<w:ftr xmlns:wpc="http://schemas.microsoft.com/office/word/2010/wordprocessingCanvas" xmlns:cx="http://schemas.microsoft.com/office/drawing/2014/chartex" xmlns:cx1="http://schemas.microsoft.com/office/drawing/2015/9/8/chartex" xmlns:cx2="http://schemas.microsoft.com/office/drawing/2015/10/21/chartex" xmlns:cx3="http://schemas.microsoft.com/office/drawing/2016/5/9/chartex" xmlns:cx4="http://schemas.microsoft.com/office/drawing/2016/5/10/chartex" xmlns:cx5="http://schemas.microsoft.com/office/drawing/2016/5/11/chartex" xmlns:cx6="http://schemas.microsoft.com/office/drawing/2016/5/12/chartex" xmlns:cx7="http://schemas.microsoft.com/office/drawing/2016/5/13/chartex" xmlns:cx8="http://schemas.microsoft.com/office/drawing/2016/5/14/chartex" xmlns:mc="http://schemas.openxmlformats.org/markup-compatibility/2006" xmlns:m="http://schemas.openxmlformats.org/officeDocument/2006/math" xmlns:aink="http://schemas.microsoft.com/office/drawing/2016/ink" xmlns:am3d="http://schemas.microsoft.com/office/drawing/2017/model3d" xmlns:oel="http://schemas.microsoft.com/office/2019/extlst" xmlns:r="http://schemas.openxmlformats.org/officeDocument/2006/relationships" xmlns:wp14="http://schemas.microsoft.com/office/word/2010/wordprocessingDrawing" xmlns:wp="http://schemas.openxmlformats.org/drawingml/2006/wordprocessingDrawing" xmlns:wpg="http://schemas.microsoft.com/office/word/2010/wordprocessingGroup" xmlns:wpi="http://schemas.microsoft.com/office/word/2010/wordprocessingInk" xmlns:wps="http://schemas.microsoft.com/office/word/2010/wordprocessingShape" xmlns:o="urn:schemas-microsoft-com:office:office" xmlns:v="urn:schemas-microsoft-com:vml" xmlns:w10="urn:schemas-microsoft-com:office:word" xmlns:w="http://schemas.openxmlformats.org/wordprocessingml/2006/main" xmlns:w14="http://schemas.microsoft.com/office/word/2010/wordml" xmlns:w15="http://schemas.microsoft.com/office/word/2012/wordml" xmlns:w16cex="http://schemas.microsoft.com/office/word/2018/wordml/cex" xmlns:w16cid="http://schemas.microsoft.com/office/word/2016/wordml/cid" xmlns:w16="http://schemas.microsoft.com/office/word/2018/wordml" xmlns:w16sdtdh="http://schemas.microsoft.com/office/word/2020/wordml/sdtdatahash" xmlns:w16sdtfl="http://schemas.microsoft.com/office/word/2024/wordml/sdtformatlock" xmlns:w16se="http://schemas.microsoft.com/office/word/2015/wordml/symex" xmlns:w16du="http://schemas.microsoft.com/office/word/2023/wordml/word16du" xmlns:wne="http://schemas.microsoft.com/office/word/2006/wordml" mc:Ignorable="w14 w15 w16se w16cid w16 w16cex w16sdtdh w16sdtfl w16du wp14">
   <w:tbl>
     <w:tblPr>
       <w:tblW w:w="0" w:type="auto"/>
@@ -21070,7 +21895,7 @@
 </file>
 
 <file path=word/footnotes.xml><?xml version="1.0" encoding="utf-8"?>
-<w:footnotes xmlns:wpc="http://schemas.microsoft.com/office/word/2010/wordprocessingCanvas" xmlns:cx="http://schemas.microsoft.com/office/drawing/2014/chartex" xmlns:cx1="http://schemas.microsoft.com/office/drawing/2015/9/8/chartex" xmlns:cx2="http://schemas.microsoft.com/office/drawing/2015/10/21/chartex" xmlns:cx3="http://schemas.microsoft.com/office/drawing/2016/5/9/chartex" xmlns:cx4="http://schemas.microsoft.com/office/drawing/2016/5/10/chartex" xmlns:cx5="http://schemas.microsoft.com/office/drawing/2016/5/11/chartex" xmlns:cx6="http://schemas.microsoft.com/office/drawing/2016/5/12/chartex" xmlns:cx7="http://schemas.microsoft.com/office/drawing/2016/5/13/chartex" xmlns:cx8="http://schemas.microsoft.com/office/drawing/2016/5/14/chartex" xmlns:mc="http://schemas.openxmlformats.org/markup-compatibility/2006" xmlns:aink="http://schemas.microsoft.com/office/drawing/2016/ink" xmlns:am3d="http://schemas.microsoft.com/office/drawing/2017/model3d" xmlns:o="urn:schemas-microsoft-com:office:office" xmlns:oel="http://schemas.microsoft.com/office/2019/extlst" xmlns:r="http://schemas.openxmlformats.org/officeDocument/2006/relationships" xmlns:m="http://schemas.openxmlformats.org/officeDocument/2006/math" xmlns:v="urn:schemas-microsoft-com:vml" xmlns:wp14="http://schemas.microsoft.com/office/word/2010/wordprocessingDrawing" xmlns:wp="http://schemas.openxmlformats.org/drawingml/2006/wordprocessingDrawing" xmlns:w10="urn:schemas-microsoft-com:office:word" xmlns:w="http://schemas.openxmlformats.org/wordprocessingml/2006/main" xmlns:w14="http://schemas.microsoft.com/office/word/2010/wordml" xmlns:w15="http://schemas.microsoft.com/office/word/2012/wordml" xmlns:w16cex="http://schemas.microsoft.com/office/word/2018/wordml/cex" xmlns:w16cid="http://schemas.microsoft.com/office/word/2016/wordml/cid" xmlns:w16="http://schemas.microsoft.com/office/word/2018/wordml" xmlns:w16du="http://schemas.microsoft.com/office/word/2023/wordml/word16du" xmlns:w16sdtdh="http://schemas.microsoft.com/office/word/2020/wordml/sdtdatahash" xmlns:w16sdtfl="http://schemas.microsoft.com/office/word/2024/wordml/sdtformatlock" xmlns:w16se="http://schemas.microsoft.com/office/word/2015/wordml/symex" xmlns:wpg="http://schemas.microsoft.com/office/word/2010/wordprocessingGroup" xmlns:wpi="http://schemas.microsoft.com/office/word/2010/wordprocessingInk" xmlns:wne="http://schemas.microsoft.com/office/word/2006/wordml" xmlns:wps="http://schemas.microsoft.com/office/word/2010/wordprocessingShape" mc:Ignorable="w14 w15 w16se w16cid w16 w16cex w16sdtdh w16sdtfl w16du wp14">
+<w:footnotes xmlns:wpc="http://schemas.microsoft.com/office/word/2010/wordprocessingCanvas" xmlns:cx="http://schemas.microsoft.com/office/drawing/2014/chartex" xmlns:cx1="http://schemas.microsoft.com/office/drawing/2015/9/8/chartex" xmlns:cx2="http://schemas.microsoft.com/office/drawing/2015/10/21/chartex" xmlns:cx3="http://schemas.microsoft.com/office/drawing/2016/5/9/chartex" xmlns:cx4="http://schemas.microsoft.com/office/drawing/2016/5/10/chartex" xmlns:cx5="http://schemas.microsoft.com/office/drawing/2016/5/11/chartex" xmlns:cx6="http://schemas.microsoft.com/office/drawing/2016/5/12/chartex" xmlns:cx7="http://schemas.microsoft.com/office/drawing/2016/5/13/chartex" xmlns:cx8="http://schemas.microsoft.com/office/drawing/2016/5/14/chartex" xmlns:mc="http://schemas.openxmlformats.org/markup-compatibility/2006" xmlns:m="http://schemas.openxmlformats.org/officeDocument/2006/math" xmlns:aink="http://schemas.microsoft.com/office/drawing/2016/ink" xmlns:am3d="http://schemas.microsoft.com/office/drawing/2017/model3d" xmlns:oel="http://schemas.microsoft.com/office/2019/extlst" xmlns:r="http://schemas.openxmlformats.org/officeDocument/2006/relationships" xmlns:wp14="http://schemas.microsoft.com/office/word/2010/wordprocessingDrawing" xmlns:wp="http://schemas.openxmlformats.org/drawingml/2006/wordprocessingDrawing" xmlns:wpg="http://schemas.microsoft.com/office/word/2010/wordprocessingGroup" xmlns:wpi="http://schemas.microsoft.com/office/word/2010/wordprocessingInk" xmlns:wps="http://schemas.microsoft.com/office/word/2010/wordprocessingShape" xmlns:o="urn:schemas-microsoft-com:office:office" xmlns:v="urn:schemas-microsoft-com:vml" xmlns:w10="urn:schemas-microsoft-com:office:word" xmlns:w="http://schemas.openxmlformats.org/wordprocessingml/2006/main" xmlns:w14="http://schemas.microsoft.com/office/word/2010/wordml" xmlns:w15="http://schemas.microsoft.com/office/word/2012/wordml" xmlns:w16cex="http://schemas.microsoft.com/office/word/2018/wordml/cex" xmlns:w16cid="http://schemas.microsoft.com/office/word/2016/wordml/cid" xmlns:w16="http://schemas.microsoft.com/office/word/2018/wordml" xmlns:w16sdtdh="http://schemas.microsoft.com/office/word/2020/wordml/sdtdatahash" xmlns:w16sdtfl="http://schemas.microsoft.com/office/word/2024/wordml/sdtformatlock" xmlns:w16se="http://schemas.microsoft.com/office/word/2015/wordml/symex" xmlns:w16du="http://schemas.microsoft.com/office/word/2023/wordml/word16du" xmlns:wne="http://schemas.microsoft.com/office/word/2006/wordml" mc:Ignorable="w14 w15 w16se w16cid w16 w16cex w16sdtdh w16sdtfl w16du wp14">
   <w:footnote w:type="separator" w:id="-1">
     <w:p>
       <w:pPr>
@@ -21095,7 +21920,7 @@
 </file>
 
 <file path=word/header1.xml><?xml version="1.0" encoding="utf-8"?>
-<w:hdr xmlns:wpc="http://schemas.microsoft.com/office/word/2010/wordprocessingCanvas" xmlns:cx="http://schemas.microsoft.com/office/drawing/2014/chartex" xmlns:cx1="http://schemas.microsoft.com/office/drawing/2015/9/8/chartex" xmlns:cx2="http://schemas.microsoft.com/office/drawing/2015/10/21/chartex" xmlns:cx3="http://schemas.microsoft.com/office/drawing/2016/5/9/chartex" xmlns:cx4="http://schemas.microsoft.com/office/drawing/2016/5/10/chartex" xmlns:cx5="http://schemas.microsoft.com/office/drawing/2016/5/11/chartex" xmlns:cx6="http://schemas.microsoft.com/office/drawing/2016/5/12/chartex" xmlns:cx7="http://schemas.microsoft.com/office/drawing/2016/5/13/chartex" xmlns:cx8="http://schemas.microsoft.com/office/drawing/2016/5/14/chartex" xmlns:mc="http://schemas.openxmlformats.org/markup-compatibility/2006" xmlns:aink="http://schemas.microsoft.com/office/drawing/2016/ink" xmlns:am3d="http://schemas.microsoft.com/office/drawing/2017/model3d" xmlns:o="urn:schemas-microsoft-com:office:office" xmlns:oel="http://schemas.microsoft.com/office/2019/extlst" xmlns:r="http://schemas.openxmlformats.org/officeDocument/2006/relationships" xmlns:m="http://schemas.openxmlformats.org/officeDocument/2006/math" xmlns:v="urn:schemas-microsoft-com:vml" xmlns:wp14="http://schemas.microsoft.com/office/word/2010/wordprocessingDrawing" xmlns:wp="http://schemas.openxmlformats.org/drawingml/2006/wordprocessingDrawing" xmlns:w10="urn:schemas-microsoft-com:office:word" xmlns:w="http://schemas.openxmlformats.org/wordprocessingml/2006/main" xmlns:w14="http://schemas.microsoft.com/office/word/2010/wordml" xmlns:w15="http://schemas.microsoft.com/office/word/2012/wordml" xmlns:w16cex="http://schemas.microsoft.com/office/word/2018/wordml/cex" xmlns:w16cid="http://schemas.microsoft.com/office/word/2016/wordml/cid" xmlns:w16="http://schemas.microsoft.com/office/word/2018/wordml" xmlns:w16du="http://schemas.microsoft.com/office/word/2023/wordml/word16du" xmlns:w16sdtdh="http://schemas.microsoft.com/office/word/2020/wordml/sdtdatahash" xmlns:w16sdtfl="http://schemas.microsoft.com/office/word/2024/wordml/sdtformatlock" xmlns:w16se="http://schemas.microsoft.com/office/word/2015/wordml/symex" xmlns:wpg="http://schemas.microsoft.com/office/word/2010/wordprocessingGroup" xmlns:wpi="http://schemas.microsoft.com/office/word/2010/wordprocessingInk" xmlns:wne="http://schemas.microsoft.com/office/word/2006/wordml" xmlns:wps="http://schemas.microsoft.com/office/word/2010/wordprocessingShape" mc:Ignorable="w14 w15 w16se w16cid w16 w16cex w16sdtdh w16sdtfl w16du wp14">
+<w:hdr xmlns:wpc="http://schemas.microsoft.com/office/word/2010/wordprocessingCanvas" xmlns:cx="http://schemas.microsoft.com/office/drawing/2014/chartex" xmlns:cx1="http://schemas.microsoft.com/office/drawing/2015/9/8/chartex" xmlns:cx2="http://schemas.microsoft.com/office/drawing/2015/10/21/chartex" xmlns:cx3="http://schemas.microsoft.com/office/drawing/2016/5/9/chartex" xmlns:cx4="http://schemas.microsoft.com/office/drawing/2016/5/10/chartex" xmlns:cx5="http://schemas.microsoft.com/office/drawing/2016/5/11/chartex" xmlns:cx6="http://schemas.microsoft.com/office/drawing/2016/5/12/chartex" xmlns:cx7="http://schemas.microsoft.com/office/drawing/2016/5/13/chartex" xmlns:cx8="http://schemas.microsoft.com/office/drawing/2016/5/14/chartex" xmlns:mc="http://schemas.openxmlformats.org/markup-compatibility/2006" xmlns:m="http://schemas.openxmlformats.org/officeDocument/2006/math" xmlns:aink="http://schemas.microsoft.com/office/drawing/2016/ink" xmlns:am3d="http://schemas.microsoft.com/office/drawing/2017/model3d" xmlns:oel="http://schemas.microsoft.com/office/2019/extlst" xmlns:r="http://schemas.openxmlformats.org/officeDocument/2006/relationships" xmlns:wp14="http://schemas.microsoft.com/office/word/2010/wordprocessingDrawing" xmlns:wp="http://schemas.openxmlformats.org/drawingml/2006/wordprocessingDrawing" xmlns:wpg="http://schemas.microsoft.com/office/word/2010/wordprocessingGroup" xmlns:wpi="http://schemas.microsoft.com/office/word/2010/wordprocessingInk" xmlns:wps="http://schemas.microsoft.com/office/word/2010/wordprocessingShape" xmlns:o="urn:schemas-microsoft-com:office:office" xmlns:v="urn:schemas-microsoft-com:vml" xmlns:w10="urn:schemas-microsoft-com:office:word" xmlns:w="http://schemas.openxmlformats.org/wordprocessingml/2006/main" xmlns:w14="http://schemas.microsoft.com/office/word/2010/wordml" xmlns:w15="http://schemas.microsoft.com/office/word/2012/wordml" xmlns:w16cex="http://schemas.microsoft.com/office/word/2018/wordml/cex" xmlns:w16cid="http://schemas.microsoft.com/office/word/2016/wordml/cid" xmlns:w16="http://schemas.microsoft.com/office/word/2018/wordml" xmlns:w16sdtdh="http://schemas.microsoft.com/office/word/2020/wordml/sdtdatahash" xmlns:w16sdtfl="http://schemas.microsoft.com/office/word/2024/wordml/sdtformatlock" xmlns:w16se="http://schemas.microsoft.com/office/word/2015/wordml/symex" xmlns:w16du="http://schemas.microsoft.com/office/word/2023/wordml/word16du" xmlns:wne="http://schemas.microsoft.com/office/word/2006/wordml" mc:Ignorable="w14 w15 w16se w16cid w16 w16cex w16sdtdh w16sdtfl w16du wp14">
   <w:p>
     <w:pPr>
       <w:pStyle w:val="Encabezado"/>
@@ -21118,7 +21943,7 @@
 </file>
 
 <file path=word/header2.xml><?xml version="1.0" encoding="utf-8"?>
-<w:hdr xmlns:wpc="http://schemas.microsoft.com/office/word/2010/wordprocessingCanvas" xmlns:cx="http://schemas.microsoft.com/office/drawing/2014/chartex" xmlns:cx1="http://schemas.microsoft.com/office/drawing/2015/9/8/chartex" xmlns:cx2="http://schemas.microsoft.com/office/drawing/2015/10/21/chartex" xmlns:cx3="http://schemas.microsoft.com/office/drawing/2016/5/9/chartex" xmlns:cx4="http://schemas.microsoft.com/office/drawing/2016/5/10/chartex" xmlns:cx5="http://schemas.microsoft.com/office/drawing/2016/5/11/chartex" xmlns:cx6="http://schemas.microsoft.com/office/drawing/2016/5/12/chartex" xmlns:cx7="http://schemas.microsoft.com/office/drawing/2016/5/13/chartex" xmlns:cx8="http://schemas.microsoft.com/office/drawing/2016/5/14/chartex" xmlns:mc="http://schemas.openxmlformats.org/markup-compatibility/2006" xmlns:aink="http://schemas.microsoft.com/office/drawing/2016/ink" xmlns:am3d="http://schemas.microsoft.com/office/drawing/2017/model3d" xmlns:o="urn:schemas-microsoft-com:office:office" xmlns:oel="http://schemas.microsoft.com/office/2019/extlst" xmlns:r="http://schemas.openxmlformats.org/officeDocument/2006/relationships" xmlns:m="http://schemas.openxmlformats.org/officeDocument/2006/math" xmlns:v="urn:schemas-microsoft-com:vml" xmlns:wp14="http://schemas.microsoft.com/office/word/2010/wordprocessingDrawing" xmlns:wp="http://schemas.openxmlformats.org/drawingml/2006/wordprocessingDrawing" xmlns:w10="urn:schemas-microsoft-com:office:word" xmlns:w="http://schemas.openxmlformats.org/wordprocessingml/2006/main" xmlns:w14="http://schemas.microsoft.com/office/word/2010/wordml" xmlns:w15="http://schemas.microsoft.com/office/word/2012/wordml" xmlns:w16cex="http://schemas.microsoft.com/office/word/2018/wordml/cex" xmlns:w16cid="http://schemas.microsoft.com/office/word/2016/wordml/cid" xmlns:w16="http://schemas.microsoft.com/office/word/2018/wordml" xmlns:w16du="http://schemas.microsoft.com/office/word/2023/wordml/word16du" xmlns:w16sdtdh="http://schemas.microsoft.com/office/word/2020/wordml/sdtdatahash" xmlns:w16sdtfl="http://schemas.microsoft.com/office/word/2024/wordml/sdtformatlock" xmlns:w16se="http://schemas.microsoft.com/office/word/2015/wordml/symex" xmlns:wpg="http://schemas.microsoft.com/office/word/2010/wordprocessingGroup" xmlns:wpi="http://schemas.microsoft.com/office/word/2010/wordprocessingInk" xmlns:wne="http://schemas.microsoft.com/office/word/2006/wordml" xmlns:wps="http://schemas.microsoft.com/office/word/2010/wordprocessingShape" mc:Ignorable="w14 w15 w16se w16cid w16 w16cex w16sdtdh w16sdtfl w16du wp14">
+<w:hdr xmlns:wpc="http://schemas.microsoft.com/office/word/2010/wordprocessingCanvas" xmlns:cx="http://schemas.microsoft.com/office/drawing/2014/chartex" xmlns:cx1="http://schemas.microsoft.com/office/drawing/2015/9/8/chartex" xmlns:cx2="http://schemas.microsoft.com/office/drawing/2015/10/21/chartex" xmlns:cx3="http://schemas.microsoft.com/office/drawing/2016/5/9/chartex" xmlns:cx4="http://schemas.microsoft.com/office/drawing/2016/5/10/chartex" xmlns:cx5="http://schemas.microsoft.com/office/drawing/2016/5/11/chartex" xmlns:cx6="http://schemas.microsoft.com/office/drawing/2016/5/12/chartex" xmlns:cx7="http://schemas.microsoft.com/office/drawing/2016/5/13/chartex" xmlns:cx8="http://schemas.microsoft.com/office/drawing/2016/5/14/chartex" xmlns:mc="http://schemas.openxmlformats.org/markup-compatibility/2006" xmlns:m="http://schemas.openxmlformats.org/officeDocument/2006/math" xmlns:aink="http://schemas.microsoft.com/office/drawing/2016/ink" xmlns:am3d="http://schemas.microsoft.com/office/drawing/2017/model3d" xmlns:oel="http://schemas.microsoft.com/office/2019/extlst" xmlns:r="http://schemas.openxmlformats.org/officeDocument/2006/relationships" xmlns:wp14="http://schemas.microsoft.com/office/word/2010/wordprocessingDrawing" xmlns:wp="http://schemas.openxmlformats.org/drawingml/2006/wordprocessingDrawing" xmlns:wpg="http://schemas.microsoft.com/office/word/2010/wordprocessingGroup" xmlns:wpi="http://schemas.microsoft.com/office/word/2010/wordprocessingInk" xmlns:wps="http://schemas.microsoft.com/office/word/2010/wordprocessingShape" xmlns:o="urn:schemas-microsoft-com:office:office" xmlns:v="urn:schemas-microsoft-com:vml" xmlns:w10="urn:schemas-microsoft-com:office:word" xmlns:w="http://schemas.openxmlformats.org/wordprocessingml/2006/main" xmlns:w14="http://schemas.microsoft.com/office/word/2010/wordml" xmlns:w15="http://schemas.microsoft.com/office/word/2012/wordml" xmlns:w16cex="http://schemas.microsoft.com/office/word/2018/wordml/cex" xmlns:w16cid="http://schemas.microsoft.com/office/word/2016/wordml/cid" xmlns:w16="http://schemas.microsoft.com/office/word/2018/wordml" xmlns:w16sdtdh="http://schemas.microsoft.com/office/word/2020/wordml/sdtdatahash" xmlns:w16sdtfl="http://schemas.microsoft.com/office/word/2024/wordml/sdtformatlock" xmlns:w16se="http://schemas.microsoft.com/office/word/2015/wordml/symex" xmlns:w16du="http://schemas.microsoft.com/office/word/2023/wordml/word16du" xmlns:wne="http://schemas.microsoft.com/office/word/2006/wordml" mc:Ignorable="w14 w15 w16se w16cid w16 w16cex w16sdtdh w16sdtfl w16du wp14">
   <w:tbl>
     <w:tblPr>
       <w:tblW w:w="0" w:type="auto"/>
@@ -21180,7 +22005,7 @@
 </file>
 
 <file path=word/numbering.xml><?xml version="1.0" encoding="utf-8"?>
-<w:numbering xmlns:wpc="http://schemas.microsoft.com/office/word/2010/wordprocessingCanvas" xmlns:cx="http://schemas.microsoft.com/office/drawing/2014/chartex" xmlns:cx1="http://schemas.microsoft.com/office/drawing/2015/9/8/chartex" xmlns:cx2="http://schemas.microsoft.com/office/drawing/2015/10/21/chartex" xmlns:cx3="http://schemas.microsoft.com/office/drawing/2016/5/9/chartex" xmlns:cx4="http://schemas.microsoft.com/office/drawing/2016/5/10/chartex" xmlns:cx5="http://schemas.microsoft.com/office/drawing/2016/5/11/chartex" xmlns:cx6="http://schemas.microsoft.com/office/drawing/2016/5/12/chartex" xmlns:cx7="http://schemas.microsoft.com/office/drawing/2016/5/13/chartex" xmlns:cx8="http://schemas.microsoft.com/office/drawing/2016/5/14/chartex" xmlns:mc="http://schemas.openxmlformats.org/markup-compatibility/2006" xmlns:aink="http://schemas.microsoft.com/office/drawing/2016/ink" xmlns:am3d="http://schemas.microsoft.com/office/drawing/2017/model3d" xmlns:o="urn:schemas-microsoft-com:office:office" xmlns:oel="http://schemas.microsoft.com/office/2019/extlst" xmlns:r="http://schemas.openxmlformats.org/officeDocument/2006/relationships" xmlns:m="http://schemas.openxmlformats.org/officeDocument/2006/math" xmlns:v="urn:schemas-microsoft-com:vml" xmlns:wp14="http://schemas.microsoft.com/office/word/2010/wordprocessingDrawing" xmlns:wp="http://schemas.openxmlformats.org/drawingml/2006/wordprocessingDrawing" xmlns:w10="urn:schemas-microsoft-com:office:word" xmlns:w="http://schemas.openxmlformats.org/wordprocessingml/2006/main" xmlns:w14="http://schemas.microsoft.com/office/word/2010/wordml" xmlns:w15="http://schemas.microsoft.com/office/word/2012/wordml" xmlns:w16cex="http://schemas.microsoft.com/office/word/2018/wordml/cex" xmlns:w16cid="http://schemas.microsoft.com/office/word/2016/wordml/cid" xmlns:w16="http://schemas.microsoft.com/office/word/2018/wordml" xmlns:w16du="http://schemas.microsoft.com/office/word/2023/wordml/word16du" xmlns:w16sdtdh="http://schemas.microsoft.com/office/word/2020/wordml/sdtdatahash" xmlns:w16sdtfl="http://schemas.microsoft.com/office/word/2024/wordml/sdtformatlock" xmlns:w16se="http://schemas.microsoft.com/office/word/2015/wordml/symex" xmlns:wpg="http://schemas.microsoft.com/office/word/2010/wordprocessingGroup" xmlns:wpi="http://schemas.microsoft.com/office/word/2010/wordprocessingInk" xmlns:wne="http://schemas.microsoft.com/office/word/2006/wordml" xmlns:wps="http://schemas.microsoft.com/office/word/2010/wordprocessingShape" mc:Ignorable="w14 w15 w16se w16cid w16 w16cex w16sdtdh w16sdtfl w16du wp14">
+<w:numbering xmlns:wpc="http://schemas.microsoft.com/office/word/2010/wordprocessingCanvas" xmlns:cx="http://schemas.microsoft.com/office/drawing/2014/chartex" xmlns:cx1="http://schemas.microsoft.com/office/drawing/2015/9/8/chartex" xmlns:cx2="http://schemas.microsoft.com/office/drawing/2015/10/21/chartex" xmlns:cx3="http://schemas.microsoft.com/office/drawing/2016/5/9/chartex" xmlns:cx4="http://schemas.microsoft.com/office/drawing/2016/5/10/chartex" xmlns:cx5="http://schemas.microsoft.com/office/drawing/2016/5/11/chartex" xmlns:cx6="http://schemas.microsoft.com/office/drawing/2016/5/12/chartex" xmlns:cx7="http://schemas.microsoft.com/office/drawing/2016/5/13/chartex" xmlns:cx8="http://schemas.microsoft.com/office/drawing/2016/5/14/chartex" xmlns:mc="http://schemas.openxmlformats.org/markup-compatibility/2006" xmlns:m="http://schemas.openxmlformats.org/officeDocument/2006/math" xmlns:aink="http://schemas.microsoft.com/office/drawing/2016/ink" xmlns:am3d="http://schemas.microsoft.com/office/drawing/2017/model3d" xmlns:oel="http://schemas.microsoft.com/office/2019/extlst" xmlns:r="http://schemas.openxmlformats.org/officeDocument/2006/relationships" xmlns:wp14="http://schemas.microsoft.com/office/word/2010/wordprocessingDrawing" xmlns:wp="http://schemas.openxmlformats.org/drawingml/2006/wordprocessingDrawing" xmlns:wpg="http://schemas.microsoft.com/office/word/2010/wordprocessingGroup" xmlns:wpi="http://schemas.microsoft.com/office/word/2010/wordprocessingInk" xmlns:wps="http://schemas.microsoft.com/office/word/2010/wordprocessingShape" xmlns:o="urn:schemas-microsoft-com:office:office" xmlns:v="urn:schemas-microsoft-com:vml" xmlns:w10="urn:schemas-microsoft-com:office:word" xmlns:w="http://schemas.openxmlformats.org/wordprocessingml/2006/main" xmlns:w14="http://schemas.microsoft.com/office/word/2010/wordml" xmlns:w15="http://schemas.microsoft.com/office/word/2012/wordml" xmlns:w16cex="http://schemas.microsoft.com/office/word/2018/wordml/cex" xmlns:w16cid="http://schemas.microsoft.com/office/word/2016/wordml/cid" xmlns:w16="http://schemas.microsoft.com/office/word/2018/wordml" xmlns:w16sdtdh="http://schemas.microsoft.com/office/word/2020/wordml/sdtdatahash" xmlns:w16sdtfl="http://schemas.microsoft.com/office/word/2024/wordml/sdtformatlock" xmlns:w16se="http://schemas.microsoft.com/office/word/2015/wordml/symex" xmlns:w16du="http://schemas.microsoft.com/office/word/2023/wordml/word16du" xmlns:wne="http://schemas.microsoft.com/office/word/2006/wordml" mc:Ignorable="w14 w15 w16se w16cid w16 w16cex w16sdtdh w16sdtfl w16du wp14">
   <w:abstractNum w:abstractNumId="0" w15:restartNumberingAfterBreak="0">
     <w:nsid w:val="067AA7C9"/>
     <w:multiLevelType w:val="hybridMultilevel"/>
@@ -21381,6 +22206,92 @@
     </w:lvl>
   </w:abstractNum>
   <w:abstractNum w:abstractNumId="2" w15:restartNumberingAfterBreak="0">
+    <w:nsid w:val="28BE2E51"/>
+    <w:multiLevelType w:val="hybridMultilevel"/>
+    <w:tmpl w:val="729E91E2"/>
+    <w:lvl w:ilvl="0" w:tplc="34B6A6F6">
+      <w:start w:val="1"/>
+      <w:numFmt w:val="decimal"/>
+      <w:lvlText w:val="(%1)"/>
+      <w:lvlJc w:val="left"/>
+      <w:pPr>
+        <w:ind w:left="720" w:hanging="360"/>
+      </w:pPr>
+    </w:lvl>
+    <w:lvl w:ilvl="1" w:tplc="BC0A6672">
+      <w:start w:val="1"/>
+      <w:numFmt w:val="lowerLetter"/>
+      <w:lvlText w:val="%2."/>
+      <w:lvlJc w:val="left"/>
+      <w:pPr>
+        <w:ind w:left="1440" w:hanging="360"/>
+      </w:pPr>
+    </w:lvl>
+    <w:lvl w:ilvl="2" w:tplc="8A1E2A88">
+      <w:start w:val="1"/>
+      <w:numFmt w:val="lowerRoman"/>
+      <w:lvlText w:val="%3."/>
+      <w:lvlJc w:val="right"/>
+      <w:pPr>
+        <w:ind w:left="2160" w:hanging="180"/>
+      </w:pPr>
+    </w:lvl>
+    <w:lvl w:ilvl="3" w:tplc="182CD1BE">
+      <w:start w:val="1"/>
+      <w:numFmt w:val="decimal"/>
+      <w:lvlText w:val="%4."/>
+      <w:lvlJc w:val="left"/>
+      <w:pPr>
+        <w:ind w:left="2880" w:hanging="360"/>
+      </w:pPr>
+    </w:lvl>
+    <w:lvl w:ilvl="4" w:tplc="E530FCB0">
+      <w:start w:val="1"/>
+      <w:numFmt w:val="lowerLetter"/>
+      <w:lvlText w:val="%5."/>
+      <w:lvlJc w:val="left"/>
+      <w:pPr>
+        <w:ind w:left="3600" w:hanging="360"/>
+      </w:pPr>
+    </w:lvl>
+    <w:lvl w:ilvl="5" w:tplc="B016E5CE">
+      <w:start w:val="1"/>
+      <w:numFmt w:val="lowerRoman"/>
+      <w:lvlText w:val="%6."/>
+      <w:lvlJc w:val="right"/>
+      <w:pPr>
+        <w:ind w:left="4320" w:hanging="180"/>
+      </w:pPr>
+    </w:lvl>
+    <w:lvl w:ilvl="6" w:tplc="C95EAC82">
+      <w:start w:val="1"/>
+      <w:numFmt w:val="decimal"/>
+      <w:lvlText w:val="%7."/>
+      <w:lvlJc w:val="left"/>
+      <w:pPr>
+        <w:ind w:left="5040" w:hanging="360"/>
+      </w:pPr>
+    </w:lvl>
+    <w:lvl w:ilvl="7" w:tplc="7B40A35E">
+      <w:start w:val="1"/>
+      <w:numFmt w:val="lowerLetter"/>
+      <w:lvlText w:val="%8."/>
+      <w:lvlJc w:val="left"/>
+      <w:pPr>
+        <w:ind w:left="5760" w:hanging="360"/>
+      </w:pPr>
+    </w:lvl>
+    <w:lvl w:ilvl="8" w:tplc="E5A80964">
+      <w:start w:val="1"/>
+      <w:numFmt w:val="lowerRoman"/>
+      <w:lvlText w:val="%9."/>
+      <w:lvlJc w:val="right"/>
+      <w:pPr>
+        <w:ind w:left="6480" w:hanging="180"/>
+      </w:pPr>
+    </w:lvl>
+  </w:abstractNum>
+  <w:abstractNum w:abstractNumId="3" w15:restartNumberingAfterBreak="0">
     <w:nsid w:val="3A8A06AA"/>
     <w:multiLevelType w:val="hybridMultilevel"/>
     <w:tmpl w:val="950ED674"/>
@@ -21469,7 +22380,7 @@
       </w:pPr>
     </w:lvl>
   </w:abstractNum>
-  <w:abstractNum w:abstractNumId="3" w15:restartNumberingAfterBreak="0">
+  <w:abstractNum w:abstractNumId="4" w15:restartNumberingAfterBreak="0">
     <w:nsid w:val="47567EB8"/>
     <w:multiLevelType w:val="hybridMultilevel"/>
     <w:tmpl w:val="81B211E0"/>
@@ -21558,7 +22469,7 @@
       </w:pPr>
     </w:lvl>
   </w:abstractNum>
-  <w:abstractNum w:abstractNumId="4" w15:restartNumberingAfterBreak="0">
+  <w:abstractNum w:abstractNumId="5" w15:restartNumberingAfterBreak="0">
     <w:nsid w:val="4BFD5EA2"/>
     <w:multiLevelType w:val="hybridMultilevel"/>
     <w:tmpl w:val="28AC94E0"/>
@@ -21647,7 +22558,7 @@
       </w:pPr>
     </w:lvl>
   </w:abstractNum>
-  <w:abstractNum w:abstractNumId="5" w15:restartNumberingAfterBreak="0">
+  <w:abstractNum w:abstractNumId="6" w15:restartNumberingAfterBreak="0">
     <w:nsid w:val="62692469"/>
     <w:multiLevelType w:val="hybridMultilevel"/>
     <w:tmpl w:val="AE2ECEBA"/>
@@ -21736,7 +22647,93 @@
       </w:pPr>
     </w:lvl>
   </w:abstractNum>
-  <w:abstractNum w:abstractNumId="6" w15:restartNumberingAfterBreak="0">
+  <w:abstractNum w:abstractNumId="7" w15:restartNumberingAfterBreak="0">
+    <w:nsid w:val="6586888E"/>
+    <w:multiLevelType w:val="hybridMultilevel"/>
+    <w:tmpl w:val="3FC02DAE"/>
+    <w:lvl w:ilvl="0" w:tplc="BE30C442">
+      <w:start w:val="1"/>
+      <w:numFmt w:val="decimal"/>
+      <w:lvlText w:val="(%1)"/>
+      <w:lvlJc w:val="left"/>
+      <w:pPr>
+        <w:ind w:left="720" w:hanging="360"/>
+      </w:pPr>
+    </w:lvl>
+    <w:lvl w:ilvl="1" w:tplc="CA9AF504">
+      <w:start w:val="1"/>
+      <w:numFmt w:val="lowerLetter"/>
+      <w:lvlText w:val="%2."/>
+      <w:lvlJc w:val="left"/>
+      <w:pPr>
+        <w:ind w:left="1440" w:hanging="360"/>
+      </w:pPr>
+    </w:lvl>
+    <w:lvl w:ilvl="2" w:tplc="36BC5814">
+      <w:start w:val="1"/>
+      <w:numFmt w:val="lowerRoman"/>
+      <w:lvlText w:val="%3."/>
+      <w:lvlJc w:val="right"/>
+      <w:pPr>
+        <w:ind w:left="2160" w:hanging="180"/>
+      </w:pPr>
+    </w:lvl>
+    <w:lvl w:ilvl="3" w:tplc="81983072">
+      <w:start w:val="1"/>
+      <w:numFmt w:val="decimal"/>
+      <w:lvlText w:val="%4."/>
+      <w:lvlJc w:val="left"/>
+      <w:pPr>
+        <w:ind w:left="2880" w:hanging="360"/>
+      </w:pPr>
+    </w:lvl>
+    <w:lvl w:ilvl="4" w:tplc="E926EA06">
+      <w:start w:val="1"/>
+      <w:numFmt w:val="lowerLetter"/>
+      <w:lvlText w:val="%5."/>
+      <w:lvlJc w:val="left"/>
+      <w:pPr>
+        <w:ind w:left="3600" w:hanging="360"/>
+      </w:pPr>
+    </w:lvl>
+    <w:lvl w:ilvl="5" w:tplc="995C043E">
+      <w:start w:val="1"/>
+      <w:numFmt w:val="lowerRoman"/>
+      <w:lvlText w:val="%6."/>
+      <w:lvlJc w:val="right"/>
+      <w:pPr>
+        <w:ind w:left="4320" w:hanging="180"/>
+      </w:pPr>
+    </w:lvl>
+    <w:lvl w:ilvl="6" w:tplc="F62226E0">
+      <w:start w:val="1"/>
+      <w:numFmt w:val="decimal"/>
+      <w:lvlText w:val="%7."/>
+      <w:lvlJc w:val="left"/>
+      <w:pPr>
+        <w:ind w:left="5040" w:hanging="360"/>
+      </w:pPr>
+    </w:lvl>
+    <w:lvl w:ilvl="7" w:tplc="EB268E28">
+      <w:start w:val="1"/>
+      <w:numFmt w:val="lowerLetter"/>
+      <w:lvlText w:val="%8."/>
+      <w:lvlJc w:val="left"/>
+      <w:pPr>
+        <w:ind w:left="5760" w:hanging="360"/>
+      </w:pPr>
+    </w:lvl>
+    <w:lvl w:ilvl="8" w:tplc="3D5AF51A">
+      <w:start w:val="1"/>
+      <w:numFmt w:val="lowerRoman"/>
+      <w:lvlText w:val="%9."/>
+      <w:lvlJc w:val="right"/>
+      <w:pPr>
+        <w:ind w:left="6480" w:hanging="180"/>
+      </w:pPr>
+    </w:lvl>
+  </w:abstractNum>
+  <w:abstractNum w:abstractNumId="8" w15:restartNumberingAfterBreak="0">
     <w:nsid w:val="695B1B28"/>
     <w:multiLevelType w:val="hybridMultilevel"/>
     <w:tmpl w:val="12CA34E6"/>
@@ -21825,7 +22822,7 @@
       </w:pPr>
     </w:lvl>
   </w:abstractNum>
-  <w:abstractNum w:abstractNumId="7" w15:restartNumberingAfterBreak="0">
+  <w:abstractNum w:abstractNumId="9" w15:restartNumberingAfterBreak="0">
     <w:nsid w:val="7DFB5769"/>
     <w:multiLevelType w:val="hybridMultilevel"/>
     <w:tmpl w:val="1A34A41E"/>
@@ -21915,36 +22912,42 @@
       </w:pPr>
     </w:lvl>
   </w:abstractNum>
-  <w:num w:numId="1" w16cid:durableId="1452046558">
+  <w:num w:numId="1" w16cid:durableId="1683512109">
+    <w:abstractNumId w:val="7"/>
+  </w:num>
+  <w:num w:numId="2" w16cid:durableId="1401753268">
+    <w:abstractNumId w:val="2"/>
+  </w:num>
+  <w:num w:numId="3" w16cid:durableId="1452046558">
     <w:abstractNumId w:val="0"/>
   </w:num>
-  <w:num w:numId="2" w16cid:durableId="1709603898">
-    <w:abstractNumId w:val="7"/>
+  <w:num w:numId="4" w16cid:durableId="1709603898">
+    <w:abstractNumId w:val="9"/>
   </w:num>
-  <w:num w:numId="3" w16cid:durableId="1537572746">
+  <w:num w:numId="5" w16cid:durableId="1537572746">
+    <w:abstractNumId w:val="5"/>
+  </w:num>
+  <w:num w:numId="6" w16cid:durableId="1691566810">
+    <w:abstractNumId w:val="1"/>
+  </w:num>
+  <w:num w:numId="7" w16cid:durableId="945772516">
+    <w:abstractNumId w:val="3"/>
+  </w:num>
+  <w:num w:numId="8" w16cid:durableId="1983197635">
     <w:abstractNumId w:val="4"/>
   </w:num>
-  <w:num w:numId="4" w16cid:durableId="1691566810">
-    <w:abstractNumId w:val="1"/>
+  <w:num w:numId="9" w16cid:durableId="970015686">
+    <w:abstractNumId w:val="8"/>
   </w:num>
-  <w:num w:numId="5" w16cid:durableId="945772516">
-    <w:abstractNumId w:val="2"/>
-  </w:num>
-  <w:num w:numId="6" w16cid:durableId="1983197635">
-    <w:abstractNumId w:val="3"/>
-  </w:num>
-  <w:num w:numId="7" w16cid:durableId="970015686">
+  <w:num w:numId="10" w16cid:durableId="737629545">
     <w:abstractNumId w:val="6"/>
-  </w:num>
-  <w:num w:numId="8" w16cid:durableId="737629545">
-    <w:abstractNumId w:val="5"/>
   </w:num>
   <w:numIdMacAtCleanup w:val="2"/>
 </w:numbering>
 </file>
 
 <file path=word/styles.xml><?xml version="1.0" encoding="utf-8"?>
-<w:styles xmlns:mc="http://schemas.openxmlformats.org/markup-compatibility/2006" xmlns:r="http://schemas.openxmlformats.org/officeDocument/2006/relationships" xmlns:w="http://schemas.openxmlformats.org/wordprocessingml/2006/main" xmlns:w14="http://schemas.microsoft.com/office/word/2010/wordml" xmlns:w15="http://schemas.microsoft.com/office/word/2012/wordml" xmlns:w16cex="http://schemas.microsoft.com/office/word/2018/wordml/cex" xmlns:w16cid="http://schemas.microsoft.com/office/word/2016/wordml/cid" xmlns:w16="http://schemas.microsoft.com/office/word/2018/wordml" xmlns:w16du="http://schemas.microsoft.com/office/word/2023/wordml/word16du" xmlns:w16sdtdh="http://schemas.microsoft.com/office/word/2020/wordml/sdtdatahash" xmlns:w16sdtfl="http://schemas.microsoft.com/office/word/2024/wordml/sdtformatlock" xmlns:w16se="http://schemas.microsoft.com/office/word/2015/wordml/symex" mc:Ignorable="w14 w15 w16se w16cid w16 w16cex w16sdtdh w16sdtfl w16du">
+<w:styles xmlns:mc="http://schemas.openxmlformats.org/markup-compatibility/2006" xmlns:r="http://schemas.openxmlformats.org/officeDocument/2006/relationships" xmlns:w="http://schemas.openxmlformats.org/wordprocessingml/2006/main" xmlns:w14="http://schemas.microsoft.com/office/word/2010/wordml" xmlns:w15="http://schemas.microsoft.com/office/word/2012/wordml" xmlns:w16cex="http://schemas.microsoft.com/office/word/2018/wordml/cex" xmlns:w16cid="http://schemas.microsoft.com/office/word/2016/wordml/cid" xmlns:w16="http://schemas.microsoft.com/office/word/2018/wordml" xmlns:w16sdtdh="http://schemas.microsoft.com/office/word/2020/wordml/sdtdatahash" xmlns:w16sdtfl="http://schemas.microsoft.com/office/word/2024/wordml/sdtformatlock" xmlns:w16se="http://schemas.microsoft.com/office/word/2015/wordml/symex" xmlns:w16du="http://schemas.microsoft.com/office/word/2023/wordml/word16du" mc:Ignorable="w14 w15 w16se w16cid w16 w16cex w16sdtdh w16sdtfl w16du">
   <w:docDefaults>
     <w:rPrDefault>
       <w:rPr>
@@ -22385,7 +23388,7 @@
     <w:rsid w:val="006F350D"/>
     <w:pPr>
       <w:numPr>
-        <w:numId w:val="2"/>
+        <w:numId w:val="4"/>
       </w:numPr>
       <w:outlineLvl w:val="1"/>
     </w:pPr>
@@ -23619,6 +24622,30 @@
 </file>
 
 <file path=customXml/item1.xml><?xml version="1.0" encoding="utf-8"?>
+<?mso-contentType ?>
+<FormTemplates xmlns="http://schemas.microsoft.com/sharepoint/v3/contenttype/forms">
+  <Display>DocumentLibraryForm</Display>
+  <Edit>DocumentLibraryForm</Edit>
+  <New>DocumentLibraryForm</New>
+</FormTemplates>
+</file>
+
+<file path=customXml/item2.xml><?xml version="1.0" encoding="utf-8"?>
+<b:Sources xmlns:b="http://schemas.openxmlformats.org/officeDocument/2006/bibliography" xmlns="http://schemas.openxmlformats.org/officeDocument/2006/bibliography" SelectedStyle="/APASixthEditionOfficeOnline.xsl" StyleName="APA" Version="6"/>
+</file>
+
+<file path=customXml/item3.xml><?xml version="1.0" encoding="utf-8"?>
+<p:properties xmlns:p="http://schemas.microsoft.com/office/2006/metadata/properties" xmlns:xsi="http://www.w3.org/2001/XMLSchema-instance" xmlns:pc="http://schemas.microsoft.com/office/infopath/2007/PartnerControls">
+  <documentManagement>
+    <lcf76f155ced4ddcb4097134ff3c332f xmlns="6ed2871a-fb85-490f-96d6-5efc24751d30">
+      <Terms xmlns="http://schemas.microsoft.com/office/infopath/2007/PartnerControls"/>
+    </lcf76f155ced4ddcb4097134ff3c332f>
+    <TaxCatchAll xmlns="0dbddcdf-89e9-4140-9b8d-dbfabb47f1e9" xsi:nil="true"/>
+  </documentManagement>
+</p:properties>
+</file>
+
+<file path=customXml/item4.xml><?xml version="1.0" encoding="utf-8"?>
 <ct:contentTypeSchema xmlns:ct="http://schemas.microsoft.com/office/2006/metadata/contentType" xmlns:ma="http://schemas.microsoft.com/office/2006/metadata/properties/metaAttributes" ct:_="" ma:_="" ma:contentTypeName="Documento" ma:contentTypeID="0x010100EE0CF48B78E0254885E55935F2018255" ma:contentTypeVersion="12" ma:contentTypeDescription="Crear nuevo documento." ma:contentTypeScope="" ma:versionID="d4e26e7c8965213af1eb0bb4b99b56fb">
   <xsd:schema xmlns:xsd="http://www.w3.org/2001/XMLSchema" xmlns:xs="http://www.w3.org/2001/XMLSchema" xmlns:p="http://schemas.microsoft.com/office/2006/metadata/properties" xmlns:ns2="6ed2871a-fb85-490f-96d6-5efc24751d30" xmlns:ns3="0dbddcdf-89e9-4140-9b8d-dbfabb47f1e9" targetNamespace="http://schemas.microsoft.com/office/2006/metadata/properties" ma:root="true" ma:fieldsID="2deae8d961f0c34310364e0acc8e8d48" ns2:_="" ns3:_="">
     <xsd:import namespace="6ed2871a-fb85-490f-96d6-5efc24751d30"/>
@@ -23819,31 +24846,34 @@
 </ct:contentTypeSchema>
 </file>
 
-<file path=customXml/item2.xml><?xml version="1.0" encoding="utf-8"?>
-<?mso-contentType ?>
-<FormTemplates xmlns="http://schemas.microsoft.com/sharepoint/v3/contenttype/forms">
-  <Display>DocumentLibraryForm</Display>
-  <Edit>DocumentLibraryForm</Edit>
-  <New>DocumentLibraryForm</New>
-</FormTemplates>
+<file path=customXml/itemProps1.xml><?xml version="1.0" encoding="utf-8"?>
+<ds:datastoreItem xmlns:ds="http://schemas.openxmlformats.org/officeDocument/2006/customXml" ds:itemID="{2B96AB21-B603-4F01-A91B-9DE6CC710E18}">
+  <ds:schemaRefs>
+    <ds:schemaRef ds:uri="http://schemas.microsoft.com/sharepoint/v3/contenttype/forms"/>
+  </ds:schemaRefs>
+</ds:datastoreItem>
 </file>
 
-<file path=customXml/item3.xml><?xml version="1.0" encoding="utf-8"?>
-<b:Sources xmlns:b="http://schemas.openxmlformats.org/officeDocument/2006/bibliography" xmlns="http://schemas.openxmlformats.org/officeDocument/2006/bibliography" SelectedStyle="/APASixthEditionOfficeOnline.xsl" StyleName="APA" Version="6"/>
+<file path=customXml/itemProps2.xml><?xml version="1.0" encoding="utf-8"?>
+<ds:datastoreItem xmlns:ds="http://schemas.openxmlformats.org/officeDocument/2006/customXml" ds:itemID="{DA285533-3A1A-2446-8130-75FABB62DCC8}">
+  <ds:schemaRefs>
+    <ds:schemaRef ds:uri="http://schemas.openxmlformats.org/officeDocument/2006/bibliography"/>
+  </ds:schemaRefs>
+</ds:datastoreItem>
 </file>
 
-<file path=customXml/item4.xml><?xml version="1.0" encoding="utf-8"?>
-<p:properties xmlns:p="http://schemas.microsoft.com/office/2006/metadata/properties" xmlns:xsi="http://www.w3.org/2001/XMLSchema-instance" xmlns:pc="http://schemas.microsoft.com/office/infopath/2007/PartnerControls">
-  <documentManagement>
-    <lcf76f155ced4ddcb4097134ff3c332f xmlns="6ed2871a-fb85-490f-96d6-5efc24751d30">
-      <Terms xmlns="http://schemas.microsoft.com/office/infopath/2007/PartnerControls"/>
-    </lcf76f155ced4ddcb4097134ff3c332f>
-    <TaxCatchAll xmlns="0dbddcdf-89e9-4140-9b8d-dbfabb47f1e9" xsi:nil="true"/>
-  </documentManagement>
-</p:properties>
+<file path=customXml/itemProps3.xml><?xml version="1.0" encoding="utf-8"?>
+<ds:datastoreItem xmlns:ds="http://schemas.openxmlformats.org/officeDocument/2006/customXml" ds:itemID="{5D1E2FE9-7812-437C-A9F1-244BC5FCCC33}">
+  <ds:schemaRefs>
+    <ds:schemaRef ds:uri="http://schemas.microsoft.com/office/2006/metadata/properties"/>
+    <ds:schemaRef ds:uri="http://schemas.microsoft.com/office/infopath/2007/PartnerControls"/>
+    <ds:schemaRef ds:uri="6ed2871a-fb85-490f-96d6-5efc24751d30"/>
+    <ds:schemaRef ds:uri="0dbddcdf-89e9-4140-9b8d-dbfabb47f1e9"/>
+  </ds:schemaRefs>
+</ds:datastoreItem>
 </file>
 
-<file path=customXml/itemProps1.xml><?xml version="1.0" encoding="utf-8"?>
+<file path=customXml/itemProps4.xml><?xml version="1.0" encoding="utf-8"?>
 <ds:datastoreItem xmlns:ds="http://schemas.openxmlformats.org/officeDocument/2006/customXml" ds:itemID="{696BD704-88A4-469C-8D1C-1FC2119F6682}">
   <ds:schemaRefs>
     <ds:schemaRef ds:uri="http://schemas.microsoft.com/office/2006/metadata/contentType"/>
@@ -23860,31 +24890,4 @@
     <ds:schemaRef ds:uri="http://schemas.microsoft.com/internal/obd"/>
   </ds:schemaRefs>
 </ds:datastoreItem>
-</file>
-
-<file path=customXml/itemProps2.xml><?xml version="1.0" encoding="utf-8"?>
-<ds:datastoreItem xmlns:ds="http://schemas.openxmlformats.org/officeDocument/2006/customXml" ds:itemID="{2B96AB21-B603-4F01-A91B-9DE6CC710E18}">
-  <ds:schemaRefs>
-    <ds:schemaRef ds:uri="http://schemas.microsoft.com/sharepoint/v3/contenttype/forms"/>
-  </ds:schemaRefs>
-</ds:datastoreItem>
-</file>
-
-<file path=customXml/itemProps3.xml><?xml version="1.0" encoding="utf-8"?>
-<ds:datastoreItem xmlns:ds="http://schemas.openxmlformats.org/officeDocument/2006/customXml" ds:itemID="{DA285533-3A1A-2446-8130-75FABB62DCC8}">
-  <ds:schemaRefs>
-    <ds:schemaRef ds:uri="http://schemas.openxmlformats.org/officeDocument/2006/bibliography"/>
-  </ds:schemaRefs>
-</ds:datastoreItem>
-</file>
-
-<file path=customXml/itemProps4.xml><?xml version="1.0" encoding="utf-8"?>
-<ds:datastoreItem xmlns:ds="http://schemas.openxmlformats.org/officeDocument/2006/customXml" ds:itemID="{5D1E2FE9-7812-437C-A9F1-244BC5FCCC33}">
-  <ds:schemaRefs>
-    <ds:schemaRef ds:uri="http://schemas.microsoft.com/office/2006/metadata/properties"/>
-    <ds:schemaRef ds:uri="http://schemas.microsoft.com/office/infopath/2007/PartnerControls"/>
-    <ds:schemaRef ds:uri="6ed2871a-fb85-490f-96d6-5efc24751d30"/>
-    <ds:schemaRef ds:uri="0dbddcdf-89e9-4140-9b8d-dbfabb47f1e9"/>
-  </ds:schemaRefs>
-</ds:datastoreItem>
 </file>
</xml_diff>

<commit_message>
Revert "[codex] Add Grunenthal third-party contract previews"
</commit_message>
<xml_diff>
--- a/app/public/client/grunenthal/third-party-contracts/analisisderelacionesgrunenthal.docx
+++ b/app/public/client/grunenthal/third-party-contracts/analisisderelacionesgrunenthal.docx
@@ -1,6 +1,6 @@
 
 <file path=word/document.xml><?xml version="1.0" encoding="utf-8"?>
-<w:document xmlns:wpc="http://schemas.microsoft.com/office/word/2010/wordprocessingCanvas" xmlns:cx="http://schemas.microsoft.com/office/drawing/2014/chartex" xmlns:cx1="http://schemas.microsoft.com/office/drawing/2015/9/8/chartex" xmlns:cx2="http://schemas.microsoft.com/office/drawing/2015/10/21/chartex" xmlns:cx3="http://schemas.microsoft.com/office/drawing/2016/5/9/chartex" xmlns:cx4="http://schemas.microsoft.com/office/drawing/2016/5/10/chartex" xmlns:cx5="http://schemas.microsoft.com/office/drawing/2016/5/11/chartex" xmlns:cx6="http://schemas.microsoft.com/office/drawing/2016/5/12/chartex" xmlns:cx7="http://schemas.microsoft.com/office/drawing/2016/5/13/chartex" xmlns:cx8="http://schemas.microsoft.com/office/drawing/2016/5/14/chartex" xmlns:mc="http://schemas.openxmlformats.org/markup-compatibility/2006" xmlns:m="http://schemas.openxmlformats.org/officeDocument/2006/math" xmlns:aink="http://schemas.microsoft.com/office/drawing/2016/ink" xmlns:am3d="http://schemas.microsoft.com/office/drawing/2017/model3d" xmlns:oel="http://schemas.microsoft.com/office/2019/extlst" xmlns:r="http://schemas.openxmlformats.org/officeDocument/2006/relationships" xmlns:wp14="http://schemas.microsoft.com/office/word/2010/wordprocessingDrawing" xmlns:wp="http://schemas.openxmlformats.org/drawingml/2006/wordprocessingDrawing" xmlns:wpg="http://schemas.microsoft.com/office/word/2010/wordprocessingGroup" xmlns:wpi="http://schemas.microsoft.com/office/word/2010/wordprocessingInk" xmlns:wps="http://schemas.microsoft.com/office/word/2010/wordprocessingShape" xmlns:o="urn:schemas-microsoft-com:office:office" xmlns:v="urn:schemas-microsoft-com:vml" xmlns:w10="urn:schemas-microsoft-com:office:word" xmlns:w="http://schemas.openxmlformats.org/wordprocessingml/2006/main" xmlns:w14="http://schemas.microsoft.com/office/word/2010/wordml" xmlns:w15="http://schemas.microsoft.com/office/word/2012/wordml" xmlns:w16cex="http://schemas.microsoft.com/office/word/2018/wordml/cex" xmlns:w16cid="http://schemas.microsoft.com/office/word/2016/wordml/cid" xmlns:w16="http://schemas.microsoft.com/office/word/2018/wordml" xmlns:w16sdtdh="http://schemas.microsoft.com/office/word/2020/wordml/sdtdatahash" xmlns:w16sdtfl="http://schemas.microsoft.com/office/word/2024/wordml/sdtformatlock" xmlns:w16se="http://schemas.microsoft.com/office/word/2015/wordml/symex" xmlns:w16du="http://schemas.microsoft.com/office/word/2023/wordml/word16du" xmlns:wne="http://schemas.microsoft.com/office/word/2006/wordml" mc:Ignorable="w14 w15 w16se w16cid w16 w16cex w16sdtdh w16sdtfl w16du wp14">
+<w:document xmlns:wpc="http://schemas.microsoft.com/office/word/2010/wordprocessingCanvas" xmlns:cx="http://schemas.microsoft.com/office/drawing/2014/chartex" xmlns:cx1="http://schemas.microsoft.com/office/drawing/2015/9/8/chartex" xmlns:cx2="http://schemas.microsoft.com/office/drawing/2015/10/21/chartex" xmlns:cx3="http://schemas.microsoft.com/office/drawing/2016/5/9/chartex" xmlns:cx4="http://schemas.microsoft.com/office/drawing/2016/5/10/chartex" xmlns:cx5="http://schemas.microsoft.com/office/drawing/2016/5/11/chartex" xmlns:cx6="http://schemas.microsoft.com/office/drawing/2016/5/12/chartex" xmlns:cx7="http://schemas.microsoft.com/office/drawing/2016/5/13/chartex" xmlns:cx8="http://schemas.microsoft.com/office/drawing/2016/5/14/chartex" xmlns:mc="http://schemas.openxmlformats.org/markup-compatibility/2006" xmlns:aink="http://schemas.microsoft.com/office/drawing/2016/ink" xmlns:am3d="http://schemas.microsoft.com/office/drawing/2017/model3d" xmlns:o="urn:schemas-microsoft-com:office:office" xmlns:oel="http://schemas.microsoft.com/office/2019/extlst" xmlns:r="http://schemas.openxmlformats.org/officeDocument/2006/relationships" xmlns:m="http://schemas.openxmlformats.org/officeDocument/2006/math" xmlns:v="urn:schemas-microsoft-com:vml" xmlns:wp14="http://schemas.microsoft.com/office/word/2010/wordprocessingDrawing" xmlns:wp="http://schemas.openxmlformats.org/drawingml/2006/wordprocessingDrawing" xmlns:w10="urn:schemas-microsoft-com:office:word" xmlns:w="http://schemas.openxmlformats.org/wordprocessingml/2006/main" xmlns:w14="http://schemas.microsoft.com/office/word/2010/wordml" xmlns:w15="http://schemas.microsoft.com/office/word/2012/wordml" xmlns:w16cex="http://schemas.microsoft.com/office/word/2018/wordml/cex" xmlns:w16cid="http://schemas.microsoft.com/office/word/2016/wordml/cid" xmlns:w16="http://schemas.microsoft.com/office/word/2018/wordml" xmlns:w16du="http://schemas.microsoft.com/office/word/2023/wordml/word16du" xmlns:w16sdtdh="http://schemas.microsoft.com/office/word/2020/wordml/sdtdatahash" xmlns:w16sdtfl="http://schemas.microsoft.com/office/word/2024/wordml/sdtformatlock" xmlns:w16se="http://schemas.microsoft.com/office/word/2015/wordml/symex" xmlns:wpg="http://schemas.microsoft.com/office/word/2010/wordprocessingGroup" xmlns:wpi="http://schemas.microsoft.com/office/word/2010/wordprocessingInk" xmlns:wne="http://schemas.microsoft.com/office/word/2006/wordml" xmlns:wps="http://schemas.microsoft.com/office/word/2010/wordprocessingShape" mc:Ignorable="w14 w15 w16se w16cid w16 w16cex w16sdtdh w16sdtfl w16du wp14">
   <w:body>
     <w:p>
       <w:pPr>
@@ -690,7 +690,7 @@
           <w:noProof/>
         </w:rPr>
         <w:drawing>
-          <wp:anchor distT="0" distB="0" distL="114300" distR="114300" simplePos="0" relativeHeight="251659264" behindDoc="0" locked="0" layoutInCell="1" allowOverlap="1" wp14:anchorId="2F849ABF" wp14:editId="715CC156">
+          <wp:anchor distT="0" distB="0" distL="114300" distR="114300" simplePos="0" relativeHeight="251659264" behindDoc="0" locked="0" layoutInCell="1" allowOverlap="1" wp14:anchorId="2F849ABF" wp14:editId="2D6EB215">
             <wp:simplePos x="0" y="0"/>
             <wp:positionH relativeFrom="column">
               <wp:posOffset>3299791</wp:posOffset>
@@ -7518,298 +7518,6 @@
           </w:p>
         </w:tc>
       </w:tr>
-      <w:tr>
-        <w:tc>
-          <w:tcPr>
-            <w:tcW w:w="2987" w:type="dxa"/>
-            <w:shd w:val="clear" w:color="auto" w:fill="FFFFFF" w:themeFill="background1"/>
-            <w:vAlign w:val="center"/>
-          </w:tcPr>
-          <w:p>
-            <w:pPr>
-              <w:jc w:val="center"/>
-              <w:rPr>
-                <w:rFonts w:ascii="Calibri" w:hAnsi="Calibri" w:cs="Calibri"/>
-                <w:color w:val="000000" w:themeColor="text1"/>
-                <w:sz w:val="20"/>
-                <w:szCs w:val="20"/>
-                <w:lang w:val="en-US"/>
-              </w:rPr>
-            </w:pPr>
-            <w:r>
-              <w:rPr>
-                <w:rFonts w:ascii="Calibri" w:hAnsi="Calibri" w:cs="Calibri"/>
-                <w:color w:val="000000" w:themeColor="text1"/>
-                <w:sz w:val="20"/>
-                <w:szCs w:val="20"/>
-                <w:lang w:val="en-US"/>
-              </w:rPr>
-              <w:t>VIMEO</w:t>
-            </w:r>
-          </w:p>
-        </w:tc>
-        <w:tc>
-          <w:tcPr>
-            <w:tcW w:w="3344" w:type="dxa"/>
-            <w:shd w:val="clear" w:color="auto" w:fill="FFFFFF" w:themeFill="background1"/>
-            <w:vAlign w:val="center"/>
-          </w:tcPr>
-          <w:p>
-            <w:pPr>
-              <w:jc w:val="center"/>
-              <w:rPr>
-                <w:rFonts w:ascii="Calibri" w:hAnsi="Calibri" w:cs="Calibri"/>
-                <w:color w:val="000000" w:themeColor="text1"/>
-                <w:sz w:val="20"/>
-                <w:szCs w:val="20"/>
-                <w:lang w:val="es-ES_tradnl"/>
-              </w:rPr>
-            </w:pPr>
-            <w:r>
-              <w:rPr>
-                <w:rFonts w:ascii="Calibri" w:hAnsi="Calibri" w:cs="Calibri"/>
-                <w:color w:val="000000" w:themeColor="text1"/>
-                <w:sz w:val="20"/>
-                <w:szCs w:val="20"/>
-                <w:lang w:val="es-ES"/>
-              </w:rPr>
-              <w:t>Términos de Uso de plataforma para la creación y divulgación de videos</w:t>
-            </w:r>
-          </w:p>
-        </w:tc>
-        <w:tc>
-          <w:tcPr>
-            <w:tcW w:w="3144" w:type="dxa"/>
-            <w:shd w:val="clear" w:color="auto" w:fill="FFFFFF" w:themeFill="background1"/>
-            <w:vAlign w:val="center"/>
-          </w:tcPr>
-          <w:p>
-            <w:pPr>
-              <w:jc w:val="center"/>
-              <w:rPr>
-                <w:rFonts w:ascii="Calibri" w:hAnsi="Calibri" w:cs="Calibri"/>
-                <w:bCs/>
-                <w:color w:val="000000" w:themeColor="text1"/>
-                <w:sz w:val="20"/>
-                <w:szCs w:val="20"/>
-                <w:lang w:val="es-ES_tradnl"/>
-              </w:rPr>
-            </w:pPr>
-            <w:r>
-              <w:rPr>
-                <w:rFonts w:ascii="Calibri" w:hAnsi="Calibri" w:cs="Calibri"/>
-                <w:color w:val="000000" w:themeColor="text1"/>
-                <w:sz w:val="20"/>
-                <w:szCs w:val="20"/>
-                <w:lang w:val="es-ES"/>
-              </w:rPr>
-              <w:t>Transferencia</w:t>
-            </w:r>
-          </w:p>
-        </w:tc>
-      </w:tr>
-      <w:tr>
-        <w:tc>
-          <w:tcPr>
-            <w:tcW w:w="2987" w:type="dxa"/>
-            <w:shd w:val="clear" w:color="auto" w:fill="FFFFFF" w:themeFill="background1"/>
-            <w:vAlign w:val="center"/>
-          </w:tcPr>
-          <w:p>
-            <w:pPr>
-              <w:jc w:val="center"/>
-              <w:rPr>
-                <w:rFonts w:ascii="Calibri" w:hAnsi="Calibri" w:cs="Calibri"/>
-                <w:color w:val="000000" w:themeColor="text1"/>
-                <w:sz w:val="20"/>
-                <w:szCs w:val="20"/>
-                <w:lang w:val="en-US"/>
-              </w:rPr>
-            </w:pPr>
-            <w:r>
-              <w:rPr>
-                <w:rFonts w:ascii="Calibri" w:hAnsi="Calibri" w:cs="Calibri"/>
-                <w:color w:val="000000" w:themeColor="text1"/>
-                <w:sz w:val="20"/>
-                <w:szCs w:val="20"/>
-                <w:lang w:val="en-US"/>
-              </w:rPr>
-              <w:t>GPTW Deutschland GmbH</w:t>
-            </w:r>
-          </w:p>
-        </w:tc>
-        <w:tc>
-          <w:tcPr>
-            <w:tcW w:w="3344" w:type="dxa"/>
-            <w:shd w:val="clear" w:color="auto" w:fill="FFFFFF" w:themeFill="background1"/>
-            <w:vAlign w:val="center"/>
-          </w:tcPr>
-          <w:p>
-            <w:pPr>
-              <w:jc w:val="center"/>
-              <w:rPr>
-                <w:rFonts w:ascii="Calibri" w:hAnsi="Calibri" w:cs="Calibri"/>
-                <w:color w:val="000000" w:themeColor="text1"/>
-                <w:sz w:val="20"/>
-                <w:szCs w:val="20"/>
-                <w:lang w:val="es-ES_tradnl"/>
-              </w:rPr>
-            </w:pPr>
-            <w:r>
-              <w:rPr>
-                <w:rFonts w:ascii="Calibri" w:hAnsi="Calibri" w:cs="Calibri"/>
-                <w:color w:val="000000" w:themeColor="text1"/>
-                <w:sz w:val="20"/>
-                <w:szCs w:val="20"/>
-                <w:lang w:val="es-ES"/>
-              </w:rPr>
-              <w:t xml:space="preserve">Contrato de servicios para la certificación como Great Place </w:t>
-            </w:r>
-            <w:proofErr w:type="spellStart"/>
-            <w:r>
-              <w:rPr>
-                <w:rFonts w:ascii="Calibri" w:hAnsi="Calibri" w:cs="Calibri"/>
-                <w:color w:val="000000" w:themeColor="text1"/>
-                <w:sz w:val="20"/>
-                <w:szCs w:val="20"/>
-                <w:lang w:val="es-ES"/>
-              </w:rPr>
-              <w:t>To</w:t>
-            </w:r>
-            <w:proofErr w:type="spellEnd"/>
-            <w:r>
-              <w:rPr>
-                <w:rFonts w:ascii="Calibri" w:hAnsi="Calibri" w:cs="Calibri"/>
-                <w:color w:val="000000" w:themeColor="text1"/>
-                <w:sz w:val="20"/>
-                <w:szCs w:val="20"/>
-                <w:lang w:val="es-ES"/>
-              </w:rPr>
-              <w:t xml:space="preserve"> Work </w:t>
-            </w:r>
-          </w:p>
-        </w:tc>
-        <w:tc>
-          <w:tcPr>
-            <w:tcW w:w="3144" w:type="dxa"/>
-            <w:shd w:val="clear" w:color="auto" w:fill="FFFFFF" w:themeFill="background1"/>
-            <w:vAlign w:val="center"/>
-          </w:tcPr>
-          <w:p>
-            <w:pPr>
-              <w:jc w:val="center"/>
-              <w:rPr>
-                <w:rFonts w:ascii="Calibri" w:hAnsi="Calibri" w:cs="Calibri"/>
-                <w:bCs/>
-                <w:color w:val="000000" w:themeColor="text1"/>
-                <w:sz w:val="20"/>
-                <w:szCs w:val="20"/>
-                <w:lang w:val="es-ES_tradnl"/>
-              </w:rPr>
-            </w:pPr>
-            <w:r>
-              <w:rPr>
-                <w:rFonts w:ascii="Calibri" w:hAnsi="Calibri" w:cs="Calibri"/>
-                <w:color w:val="000000" w:themeColor="text1"/>
-                <w:sz w:val="20"/>
-                <w:szCs w:val="20"/>
-                <w:lang w:val="es-ES"/>
-              </w:rPr>
-              <w:t>Transferencias</w:t>
-            </w:r>
-          </w:p>
-        </w:tc>
-      </w:tr>
-      <w:tr>
-        <w:tc>
-          <w:tcPr>
-            <w:tcW w:w="2987" w:type="dxa"/>
-            <w:shd w:val="clear" w:color="auto" w:fill="FFFFFF" w:themeFill="background1"/>
-            <w:vAlign w:val="center"/>
-          </w:tcPr>
-          <w:p>
-            <w:pPr>
-              <w:jc w:val="center"/>
-              <w:rPr>
-                <w:rFonts w:ascii="Calibri" w:hAnsi="Calibri" w:cs="Calibri"/>
-                <w:color w:val="000000" w:themeColor="text1"/>
-                <w:sz w:val="20"/>
-                <w:szCs w:val="20"/>
-                <w:lang w:val="en-US"/>
-              </w:rPr>
-            </w:pPr>
-            <w:r>
-              <w:rPr>
-                <w:rFonts w:ascii="Calibri" w:hAnsi="Calibri" w:cs="Calibri"/>
-                <w:color w:val="000000" w:themeColor="text1"/>
-                <w:sz w:val="20"/>
-                <w:szCs w:val="20"/>
-                <w:lang w:val="en-US"/>
-              </w:rPr>
-              <w:t xml:space="preserve">MASTER CONTROL INC. </w:t>
-            </w:r>
-          </w:p>
-        </w:tc>
-        <w:tc>
-          <w:tcPr>
-            <w:tcW w:w="3344" w:type="dxa"/>
-            <w:shd w:val="clear" w:color="auto" w:fill="FFFFFF" w:themeFill="background1"/>
-            <w:vAlign w:val="center"/>
-          </w:tcPr>
-          <w:p>
-            <w:pPr>
-              <w:jc w:val="center"/>
-              <w:rPr>
-                <w:rFonts w:ascii="Calibri" w:hAnsi="Calibri" w:cs="Calibri"/>
-                <w:color w:val="000000" w:themeColor="text1"/>
-                <w:sz w:val="20"/>
-                <w:szCs w:val="20"/>
-                <w:lang w:val="es-ES_tradnl"/>
-              </w:rPr>
-            </w:pPr>
-            <w:r>
-              <w:rPr>
-                <w:rFonts w:ascii="Calibri" w:hAnsi="Calibri" w:cs="Calibri"/>
-                <w:color w:val="000000" w:themeColor="text1"/>
-                <w:sz w:val="20"/>
-                <w:szCs w:val="20"/>
-                <w:lang w:val="es-ES"/>
-              </w:rPr>
-              <w:t xml:space="preserve">Contrato de licencia de uso de software y prestación de servicios de capacitación. </w:t>
-            </w:r>
-          </w:p>
-        </w:tc>
-        <w:tc>
-          <w:tcPr>
-            <w:tcW w:w="3144" w:type="dxa"/>
-            <w:shd w:val="clear" w:color="auto" w:fill="FFFFFF" w:themeFill="background1"/>
-            <w:vAlign w:val="center"/>
-          </w:tcPr>
-          <w:p>
-            <w:pPr>
-              <w:jc w:val="center"/>
-              <w:rPr>
-                <w:rFonts w:ascii="Calibri" w:hAnsi="Calibri" w:cs="Calibri"/>
-                <w:bCs/>
-                <w:color w:val="000000" w:themeColor="text1"/>
-                <w:sz w:val="20"/>
-                <w:szCs w:val="20"/>
-                <w:lang w:val="es-ES_tradnl"/>
-              </w:rPr>
-            </w:pPr>
-            <w:r>
-              <w:rPr>
-                <w:rFonts w:ascii="Calibri" w:hAnsi="Calibri" w:cs="Calibri"/>
-                <w:color w:val="000000" w:themeColor="text1"/>
-                <w:sz w:val="20"/>
-                <w:szCs w:val="20"/>
-                <w:lang w:val="es-ES"/>
-              </w:rPr>
-              <w:t>Remisión</w:t>
-            </w:r>
-          </w:p>
-        </w:tc>
-      </w:tr>
     </w:tbl>
     <w:p>
       <w:pPr>
@@ -15685,18 +15393,18 @@
                 <w:color w:val="000000" w:themeColor="text1"/>
                 <w:sz w:val="20"/>
                 <w:szCs w:val="20"/>
-                <w:lang w:val="es-ES"/>
-              </w:rPr>
-            </w:pPr>
-            <w:r>
-              <w:rPr>
-                <w:rFonts w:ascii="Calibri" w:hAnsi="Calibri" w:cs="Calibri"/>
-                <w:color w:val="000000" w:themeColor="text1"/>
-                <w:sz w:val="20"/>
-                <w:szCs w:val="20"/>
-                <w:lang w:val="es-ES"/>
-              </w:rPr>
-              <w:t xml:space="preserve">La cláusula si cumplen con los requisitos de la LFPDPPP. </w:t>
+                <w:lang w:val="es-ES_tradnl"/>
+              </w:rPr>
+            </w:pPr>
+            <w:r>
+              <w:rPr>
+                <w:rFonts w:ascii="Calibri" w:hAnsi="Calibri" w:cs="Calibri"/>
+                <w:color w:val="000000" w:themeColor="text1"/>
+                <w:sz w:val="20"/>
+                <w:szCs w:val="20"/>
+                <w:lang w:val="es-ES"/>
+              </w:rPr>
+              <w:t>La cláusula si cumplen con los requisitos de la LFPDPPP y su Reglamento.</w:t>
             </w:r>
           </w:p>
         </w:tc>
@@ -16394,7 +16102,7 @@
               <w:pStyle w:val="Prrafodelista"/>
               <w:numPr>
                 <w:ilvl w:val="0"/>
-                <w:numId w:val="10"/>
+                <w:numId w:val="8"/>
               </w:numPr>
               <w:rPr>
                 <w:rFonts w:ascii="Calibri" w:hAnsi="Calibri" w:cs="Calibri"/>
@@ -19743,7 +19451,47 @@
                 <w:szCs w:val="20"/>
                 <w:lang w:val="es-ES"/>
               </w:rPr>
-              <w:t xml:space="preserve">La cláusula no cumple con los requisitos de la LFPDPPP. </w:t>
+              <w:t xml:space="preserve">La cláusula </w:t>
+            </w:r>
+            <w:r>
+              <w:rPr>
+                <w:rFonts w:ascii="Calibri" w:hAnsi="Calibri" w:cs="Calibri"/>
+                <w:color w:val="000000" w:themeColor="text1"/>
+                <w:sz w:val="20"/>
+                <w:szCs w:val="20"/>
+                <w:lang w:val="es-ES"/>
+              </w:rPr>
+              <w:t xml:space="preserve">no </w:t>
+            </w:r>
+            <w:r>
+              <w:rPr>
+                <w:rFonts w:ascii="Calibri" w:hAnsi="Calibri" w:cs="Calibri"/>
+                <w:color w:val="000000" w:themeColor="text1"/>
+                <w:sz w:val="20"/>
+                <w:szCs w:val="20"/>
+                <w:lang w:val="es-ES"/>
+              </w:rPr>
+              <w:t>cumple</w:t>
+            </w:r>
+            <w:r>
+              <w:rPr>
+                <w:rFonts w:ascii="Calibri" w:hAnsi="Calibri" w:cs="Calibri"/>
+                <w:color w:val="000000" w:themeColor="text1"/>
+                <w:sz w:val="20"/>
+                <w:szCs w:val="20"/>
+                <w:lang w:val="es-ES"/>
+              </w:rPr>
+              <w:t xml:space="preserve"> </w:t>
+            </w:r>
+            <w:r>
+              <w:rPr>
+                <w:rFonts w:ascii="Calibri" w:hAnsi="Calibri" w:cs="Calibri"/>
+                <w:color w:val="000000" w:themeColor="text1"/>
+                <w:sz w:val="20"/>
+                <w:szCs w:val="20"/>
+                <w:lang w:val="es-ES"/>
+              </w:rPr>
+              <w:t xml:space="preserve"> con los requisitos de la LFPDPPP. </w:t>
             </w:r>
           </w:p>
           <w:p>
@@ -19857,12 +19605,12 @@
         <w:tblLook w:val="04A0" w:firstRow="1" w:lastRow="0" w:firstColumn="1" w:lastColumn="0" w:noHBand="0" w:noVBand="1"/>
       </w:tblPr>
       <w:tblGrid>
-        <w:gridCol w:w="1796"/>
-        <w:gridCol w:w="1496"/>
-        <w:gridCol w:w="1429"/>
-        <w:gridCol w:w="2587"/>
-        <w:gridCol w:w="1294"/>
-        <w:gridCol w:w="1741"/>
+        <w:gridCol w:w="1909"/>
+        <w:gridCol w:w="1595"/>
+        <w:gridCol w:w="1453"/>
+        <w:gridCol w:w="2095"/>
+        <w:gridCol w:w="1418"/>
+        <w:gridCol w:w="1873"/>
       </w:tblGrid>
       <w:tr>
         <w:trPr>
@@ -19909,7 +19657,7 @@
         </w:trPr>
         <w:tc>
           <w:tcPr>
-            <w:tcW w:w="1796" w:type="dxa"/>
+            <w:tcW w:w="1909" w:type="dxa"/>
             <w:shd w:val="clear" w:color="auto" w:fill="00A159"/>
             <w:vAlign w:val="center"/>
           </w:tcPr>
@@ -19938,7 +19686,7 @@
         </w:tc>
         <w:tc>
           <w:tcPr>
-            <w:tcW w:w="1496" w:type="dxa"/>
+            <w:tcW w:w="1595" w:type="dxa"/>
             <w:shd w:val="clear" w:color="auto" w:fill="00A159"/>
             <w:vAlign w:val="center"/>
           </w:tcPr>
@@ -19967,7 +19715,7 @@
         </w:tc>
         <w:tc>
           <w:tcPr>
-            <w:tcW w:w="1429" w:type="dxa"/>
+            <w:tcW w:w="1453" w:type="dxa"/>
             <w:shd w:val="clear" w:color="auto" w:fill="00A159"/>
             <w:vAlign w:val="center"/>
           </w:tcPr>
@@ -19996,7 +19744,7 @@
         </w:tc>
         <w:tc>
           <w:tcPr>
-            <w:tcW w:w="2587" w:type="dxa"/>
+            <w:tcW w:w="2095" w:type="dxa"/>
             <w:shd w:val="clear" w:color="auto" w:fill="00A159"/>
             <w:vAlign w:val="center"/>
           </w:tcPr>
@@ -20025,7 +19773,7 @@
         </w:tc>
         <w:tc>
           <w:tcPr>
-            <w:tcW w:w="1294" w:type="dxa"/>
+            <w:tcW w:w="1418" w:type="dxa"/>
             <w:shd w:val="clear" w:color="auto" w:fill="00A159"/>
             <w:vAlign w:val="center"/>
           </w:tcPr>
@@ -20054,7 +19802,7 @@
         </w:tc>
         <w:tc>
           <w:tcPr>
-            <w:tcW w:w="1741" w:type="dxa"/>
+            <w:tcW w:w="1873" w:type="dxa"/>
             <w:shd w:val="clear" w:color="auto" w:fill="00A159"/>
             <w:vAlign w:val="center"/>
           </w:tcPr>
@@ -20129,7 +19877,7 @@
         </w:trPr>
         <w:tc>
           <w:tcPr>
-            <w:tcW w:w="1796" w:type="dxa"/>
+            <w:tcW w:w="1909" w:type="dxa"/>
             <w:shd w:val="clear" w:color="auto" w:fill="A6A6A6" w:themeFill="background1" w:themeFillShade="A6"/>
             <w:vAlign w:val="center"/>
           </w:tcPr>
@@ -20162,7 +19910,7 @@
         </w:tc>
         <w:tc>
           <w:tcPr>
-            <w:tcW w:w="1496" w:type="dxa"/>
+            <w:tcW w:w="1595" w:type="dxa"/>
             <w:vAlign w:val="center"/>
           </w:tcPr>
           <w:p>
@@ -20190,7 +19938,7 @@
         </w:tc>
         <w:tc>
           <w:tcPr>
-            <w:tcW w:w="1429" w:type="dxa"/>
+            <w:tcW w:w="1453" w:type="dxa"/>
             <w:vAlign w:val="center"/>
           </w:tcPr>
           <w:p>
@@ -20220,7 +19968,7 @@
         </w:tc>
         <w:tc>
           <w:tcPr>
-            <w:tcW w:w="2587" w:type="dxa"/>
+            <w:tcW w:w="2095" w:type="dxa"/>
             <w:vAlign w:val="center"/>
           </w:tcPr>
           <w:p>
@@ -20248,7 +19996,7 @@
         </w:tc>
         <w:tc>
           <w:tcPr>
-            <w:tcW w:w="1294" w:type="dxa"/>
+            <w:tcW w:w="1418" w:type="dxa"/>
             <w:vAlign w:val="center"/>
           </w:tcPr>
           <w:p>
@@ -20276,29 +20024,29 @@
         </w:tc>
         <w:tc>
           <w:tcPr>
-            <w:tcW w:w="1741" w:type="dxa"/>
-            <w:vAlign w:val="center"/>
-          </w:tcPr>
-          <w:p>
-            <w:pPr>
-              <w:jc w:val="center"/>
-              <w:rPr>
-                <w:rFonts w:ascii="Calibri" w:hAnsi="Calibri" w:cs="Calibri"/>
-                <w:color w:val="000000" w:themeColor="text1"/>
-                <w:sz w:val="20"/>
-                <w:szCs w:val="20"/>
-                <w:lang w:val="es-ES"/>
-              </w:rPr>
-            </w:pPr>
-            <w:r>
-              <w:rPr>
-                <w:rFonts w:ascii="Calibri" w:hAnsi="Calibri" w:cs="Calibri"/>
-                <w:color w:val="000000" w:themeColor="text1"/>
-                <w:sz w:val="20"/>
-                <w:szCs w:val="20"/>
-                <w:lang w:val="es-ES"/>
-              </w:rPr>
-              <w:t>La cláusula si cumplen con los requisitos de la LFPDPPP</w:t>
+            <w:tcW w:w="1873" w:type="dxa"/>
+            <w:vAlign w:val="center"/>
+          </w:tcPr>
+          <w:p>
+            <w:pPr>
+              <w:jc w:val="center"/>
+              <w:rPr>
+                <w:rFonts w:ascii="Calibri" w:hAnsi="Calibri" w:cs="Calibri"/>
+                <w:color w:val="000000" w:themeColor="text1"/>
+                <w:sz w:val="20"/>
+                <w:szCs w:val="20"/>
+                <w:lang w:val="es-ES_tradnl"/>
+              </w:rPr>
+            </w:pPr>
+            <w:r>
+              <w:rPr>
+                <w:rFonts w:ascii="Calibri" w:hAnsi="Calibri" w:cs="Calibri"/>
+                <w:color w:val="000000" w:themeColor="text1"/>
+                <w:sz w:val="20"/>
+                <w:szCs w:val="20"/>
+                <w:lang w:val="es-ES_tradnl"/>
+              </w:rPr>
+              <w:t>La cláusula si cumplen con los requisitos de la LFPDPPP y su Reglamento.</w:t>
             </w:r>
           </w:p>
         </w:tc>
@@ -20310,7 +20058,7 @@
         </w:trPr>
         <w:tc>
           <w:tcPr>
-            <w:tcW w:w="1796" w:type="dxa"/>
+            <w:tcW w:w="1909" w:type="dxa"/>
             <w:shd w:val="clear" w:color="auto" w:fill="A6A6A6" w:themeFill="background1" w:themeFillShade="A6"/>
             <w:vAlign w:val="center"/>
           </w:tcPr>
@@ -20343,7 +20091,7 @@
         </w:tc>
         <w:tc>
           <w:tcPr>
-            <w:tcW w:w="1496" w:type="dxa"/>
+            <w:tcW w:w="1595" w:type="dxa"/>
             <w:vAlign w:val="center"/>
           </w:tcPr>
           <w:p>
@@ -20381,7 +20129,7 @@
         </w:tc>
         <w:tc>
           <w:tcPr>
-            <w:tcW w:w="1429" w:type="dxa"/>
+            <w:tcW w:w="1453" w:type="dxa"/>
             <w:vAlign w:val="center"/>
           </w:tcPr>
           <w:p>
@@ -20411,7 +20159,7 @@
         </w:tc>
         <w:tc>
           <w:tcPr>
-            <w:tcW w:w="2587" w:type="dxa"/>
+            <w:tcW w:w="2095" w:type="dxa"/>
             <w:vAlign w:val="center"/>
           </w:tcPr>
           <w:p>
@@ -20457,7 +20205,7 @@
         </w:tc>
         <w:tc>
           <w:tcPr>
-            <w:tcW w:w="1294" w:type="dxa"/>
+            <w:tcW w:w="1418" w:type="dxa"/>
             <w:vAlign w:val="center"/>
           </w:tcPr>
           <w:p>
@@ -20485,29 +20233,29 @@
         </w:tc>
         <w:tc>
           <w:tcPr>
-            <w:tcW w:w="1741" w:type="dxa"/>
-            <w:vAlign w:val="center"/>
-          </w:tcPr>
-          <w:p>
-            <w:pPr>
-              <w:jc w:val="center"/>
-              <w:rPr>
-                <w:rFonts w:ascii="Calibri" w:hAnsi="Calibri" w:cs="Calibri"/>
-                <w:color w:val="000000" w:themeColor="text1"/>
-                <w:sz w:val="20"/>
-                <w:szCs w:val="20"/>
-                <w:lang w:val="es-ES"/>
-              </w:rPr>
-            </w:pPr>
-            <w:r>
-              <w:rPr>
-                <w:rFonts w:ascii="Calibri" w:hAnsi="Calibri" w:cs="Calibri"/>
-                <w:color w:val="000000" w:themeColor="text1"/>
-                <w:sz w:val="20"/>
-                <w:szCs w:val="20"/>
-                <w:lang w:val="es-ES"/>
-              </w:rPr>
-              <w:t xml:space="preserve">La cláusula si cumplen con los requisitos de la LFPDPPP. </w:t>
+            <w:tcW w:w="1873" w:type="dxa"/>
+            <w:vAlign w:val="center"/>
+          </w:tcPr>
+          <w:p>
+            <w:pPr>
+              <w:jc w:val="center"/>
+              <w:rPr>
+                <w:rFonts w:ascii="Calibri" w:hAnsi="Calibri" w:cs="Calibri"/>
+                <w:color w:val="000000" w:themeColor="text1"/>
+                <w:sz w:val="20"/>
+                <w:szCs w:val="20"/>
+                <w:lang w:val="es-ES_tradnl"/>
+              </w:rPr>
+            </w:pPr>
+            <w:r>
+              <w:rPr>
+                <w:rFonts w:ascii="Calibri" w:hAnsi="Calibri" w:cs="Calibri"/>
+                <w:color w:val="000000" w:themeColor="text1"/>
+                <w:sz w:val="20"/>
+                <w:szCs w:val="20"/>
+                <w:lang w:val="es-ES_tradnl"/>
+              </w:rPr>
+              <w:t>La cláusula si cumplen con los requisitos de la LFPDPPP y su Reglamento</w:t>
             </w:r>
           </w:p>
         </w:tc>
@@ -20519,7 +20267,7 @@
         </w:trPr>
         <w:tc>
           <w:tcPr>
-            <w:tcW w:w="1796" w:type="dxa"/>
+            <w:tcW w:w="1909" w:type="dxa"/>
             <w:shd w:val="clear" w:color="auto" w:fill="A6A6A6" w:themeFill="background1" w:themeFillShade="A6"/>
             <w:vAlign w:val="center"/>
           </w:tcPr>
@@ -20552,7 +20300,7 @@
         </w:tc>
         <w:tc>
           <w:tcPr>
-            <w:tcW w:w="1496" w:type="dxa"/>
+            <w:tcW w:w="1595" w:type="dxa"/>
             <w:vAlign w:val="center"/>
           </w:tcPr>
           <w:p>
@@ -20580,7 +20328,7 @@
         </w:tc>
         <w:tc>
           <w:tcPr>
-            <w:tcW w:w="1429" w:type="dxa"/>
+            <w:tcW w:w="1453" w:type="dxa"/>
             <w:vAlign w:val="center"/>
           </w:tcPr>
           <w:p>
@@ -20610,7 +20358,7 @@
         </w:tc>
         <w:tc>
           <w:tcPr>
-            <w:tcW w:w="2587" w:type="dxa"/>
+            <w:tcW w:w="2095" w:type="dxa"/>
             <w:vAlign w:val="center"/>
           </w:tcPr>
           <w:p>
@@ -20638,7 +20386,7 @@
         </w:tc>
         <w:tc>
           <w:tcPr>
-            <w:tcW w:w="1294" w:type="dxa"/>
+            <w:tcW w:w="1418" w:type="dxa"/>
             <w:vAlign w:val="center"/>
           </w:tcPr>
           <w:p>
@@ -20666,29 +20414,29 @@
         </w:tc>
         <w:tc>
           <w:tcPr>
-            <w:tcW w:w="1741" w:type="dxa"/>
-            <w:vAlign w:val="center"/>
-          </w:tcPr>
-          <w:p>
-            <w:pPr>
-              <w:jc w:val="center"/>
-              <w:rPr>
-                <w:rFonts w:ascii="Calibri" w:hAnsi="Calibri" w:cs="Calibri"/>
-                <w:color w:val="000000" w:themeColor="text1"/>
-                <w:sz w:val="20"/>
-                <w:szCs w:val="20"/>
-                <w:lang w:val="es-ES"/>
-              </w:rPr>
-            </w:pPr>
-            <w:r>
-              <w:rPr>
-                <w:rFonts w:ascii="Calibri" w:hAnsi="Calibri" w:cs="Calibri"/>
-                <w:color w:val="000000" w:themeColor="text1"/>
-                <w:sz w:val="20"/>
-                <w:szCs w:val="20"/>
-                <w:lang w:val="es-ES"/>
-              </w:rPr>
-              <w:t>La cláusula si cumplen con los requisitos de la LFPDPPP.</w:t>
+            <w:tcW w:w="1873" w:type="dxa"/>
+            <w:vAlign w:val="center"/>
+          </w:tcPr>
+          <w:p>
+            <w:pPr>
+              <w:jc w:val="center"/>
+              <w:rPr>
+                <w:rFonts w:ascii="Calibri" w:hAnsi="Calibri" w:cs="Calibri"/>
+                <w:color w:val="000000" w:themeColor="text1"/>
+                <w:sz w:val="20"/>
+                <w:szCs w:val="20"/>
+                <w:lang w:val="es-ES_tradnl"/>
+              </w:rPr>
+            </w:pPr>
+            <w:r>
+              <w:rPr>
+                <w:rFonts w:ascii="Calibri" w:hAnsi="Calibri" w:cs="Calibri"/>
+                <w:color w:val="000000" w:themeColor="text1"/>
+                <w:sz w:val="20"/>
+                <w:szCs w:val="20"/>
+                <w:lang w:val="es-ES_tradnl"/>
+              </w:rPr>
+              <w:t>La cláusula si cumplen con los requisitos de la LFPDPPP y su Reglamento</w:t>
             </w:r>
           </w:p>
         </w:tc>
@@ -20700,7 +20448,7 @@
         </w:trPr>
         <w:tc>
           <w:tcPr>
-            <w:tcW w:w="1796" w:type="dxa"/>
+            <w:tcW w:w="1909" w:type="dxa"/>
             <w:shd w:val="clear" w:color="auto" w:fill="A6A6A6" w:themeFill="background1" w:themeFillShade="A6"/>
             <w:vAlign w:val="center"/>
           </w:tcPr>
@@ -20733,7 +20481,7 @@
         </w:tc>
         <w:tc>
           <w:tcPr>
-            <w:tcW w:w="1496" w:type="dxa"/>
+            <w:tcW w:w="1595" w:type="dxa"/>
             <w:vAlign w:val="center"/>
           </w:tcPr>
           <w:p>
@@ -20781,7 +20529,7 @@
         </w:tc>
         <w:tc>
           <w:tcPr>
-            <w:tcW w:w="1429" w:type="dxa"/>
+            <w:tcW w:w="1453" w:type="dxa"/>
             <w:vAlign w:val="center"/>
           </w:tcPr>
           <w:p>
@@ -20811,7 +20559,7 @@
         </w:tc>
         <w:tc>
           <w:tcPr>
-            <w:tcW w:w="2587" w:type="dxa"/>
+            <w:tcW w:w="2095" w:type="dxa"/>
             <w:vAlign w:val="center"/>
           </w:tcPr>
           <w:p>
@@ -20839,7 +20587,7 @@
         </w:tc>
         <w:tc>
           <w:tcPr>
-            <w:tcW w:w="1294" w:type="dxa"/>
+            <w:tcW w:w="1418" w:type="dxa"/>
             <w:vAlign w:val="center"/>
           </w:tcPr>
           <w:p>
@@ -20867,29 +20615,29 @@
         </w:tc>
         <w:tc>
           <w:tcPr>
-            <w:tcW w:w="1741" w:type="dxa"/>
-            <w:vAlign w:val="center"/>
-          </w:tcPr>
-          <w:p>
-            <w:pPr>
-              <w:jc w:val="center"/>
-              <w:rPr>
-                <w:rFonts w:ascii="Calibri" w:hAnsi="Calibri" w:cs="Calibri"/>
-                <w:color w:val="000000" w:themeColor="text1"/>
-                <w:sz w:val="20"/>
-                <w:szCs w:val="20"/>
-                <w:lang w:val="es-ES"/>
-              </w:rPr>
-            </w:pPr>
-            <w:r>
-              <w:rPr>
-                <w:rFonts w:ascii="Calibri" w:hAnsi="Calibri" w:cs="Calibri"/>
-                <w:color w:val="000000" w:themeColor="text1"/>
-                <w:sz w:val="20"/>
-                <w:szCs w:val="20"/>
-                <w:lang w:val="es-ES"/>
-              </w:rPr>
-              <w:t>La cláusula si cumplen con los requisitos de la LFPDPPP.</w:t>
+            <w:tcW w:w="1873" w:type="dxa"/>
+            <w:vAlign w:val="center"/>
+          </w:tcPr>
+          <w:p>
+            <w:pPr>
+              <w:jc w:val="center"/>
+              <w:rPr>
+                <w:rFonts w:ascii="Calibri" w:hAnsi="Calibri" w:cs="Calibri"/>
+                <w:color w:val="000000" w:themeColor="text1"/>
+                <w:sz w:val="20"/>
+                <w:szCs w:val="20"/>
+                <w:lang w:val="es-ES_tradnl"/>
+              </w:rPr>
+            </w:pPr>
+            <w:r>
+              <w:rPr>
+                <w:rFonts w:ascii="Calibri" w:hAnsi="Calibri" w:cs="Calibri"/>
+                <w:color w:val="000000" w:themeColor="text1"/>
+                <w:sz w:val="20"/>
+                <w:szCs w:val="20"/>
+                <w:lang w:val="es-ES_tradnl"/>
+              </w:rPr>
+              <w:t>La cláusula si cumplen con los requisitos de la LFPDPPP y su Reglamento</w:t>
             </w:r>
           </w:p>
         </w:tc>
@@ -20901,7 +20649,7 @@
         </w:trPr>
         <w:tc>
           <w:tcPr>
-            <w:tcW w:w="1796" w:type="dxa"/>
+            <w:tcW w:w="1909" w:type="dxa"/>
             <w:shd w:val="clear" w:color="auto" w:fill="A6A6A6" w:themeFill="background1" w:themeFillShade="A6"/>
             <w:vAlign w:val="center"/>
           </w:tcPr>
@@ -20934,35 +20682,35 @@
         </w:tc>
         <w:tc>
           <w:tcPr>
-            <w:tcW w:w="1496" w:type="dxa"/>
-            <w:vAlign w:val="center"/>
-          </w:tcPr>
-          <w:p>
-            <w:pPr>
-              <w:jc w:val="center"/>
-              <w:rPr>
-                <w:rFonts w:ascii="Calibri" w:hAnsi="Calibri" w:cs="Calibri"/>
-                <w:color w:val="000000" w:themeColor="text1"/>
-                <w:sz w:val="20"/>
-                <w:szCs w:val="20"/>
-                <w:lang w:val="es-ES"/>
-              </w:rPr>
-            </w:pPr>
-            <w:r>
-              <w:rPr>
-                <w:rFonts w:ascii="Calibri" w:hAnsi="Calibri" w:cs="Calibri"/>
-                <w:color w:val="000000" w:themeColor="text1"/>
-                <w:sz w:val="20"/>
-                <w:szCs w:val="20"/>
-                <w:lang w:val="es-ES"/>
-              </w:rPr>
-              <w:t xml:space="preserve">Contrato de prestación de servicios de software. </w:t>
-            </w:r>
-          </w:p>
-        </w:tc>
-        <w:tc>
-          <w:tcPr>
-            <w:tcW w:w="1429" w:type="dxa"/>
+            <w:tcW w:w="1595" w:type="dxa"/>
+            <w:vAlign w:val="center"/>
+          </w:tcPr>
+          <w:p>
+            <w:pPr>
+              <w:jc w:val="center"/>
+              <w:rPr>
+                <w:rFonts w:ascii="Calibri" w:hAnsi="Calibri" w:cs="Calibri"/>
+                <w:color w:val="000000" w:themeColor="text1"/>
+                <w:sz w:val="20"/>
+                <w:szCs w:val="20"/>
+                <w:lang w:val="es-ES_tradnl"/>
+              </w:rPr>
+            </w:pPr>
+            <w:r>
+              <w:rPr>
+                <w:rFonts w:ascii="Calibri" w:hAnsi="Calibri" w:cs="Calibri"/>
+                <w:color w:val="000000" w:themeColor="text1"/>
+                <w:sz w:val="20"/>
+                <w:szCs w:val="20"/>
+                <w:lang w:val="es-ES_tradnl"/>
+              </w:rPr>
+              <w:t xml:space="preserve">Contrato de prestación de servicios de </w:t>
+            </w:r>
+          </w:p>
+        </w:tc>
+        <w:tc>
+          <w:tcPr>
+            <w:tcW w:w="1453" w:type="dxa"/>
             <w:vAlign w:val="center"/>
           </w:tcPr>
           <w:p>
@@ -20992,7 +20740,7 @@
         </w:tc>
         <w:tc>
           <w:tcPr>
-            <w:tcW w:w="2587" w:type="dxa"/>
+            <w:tcW w:w="2095" w:type="dxa"/>
             <w:vAlign w:val="center"/>
           </w:tcPr>
           <w:p>
@@ -21020,7 +20768,7 @@
         </w:tc>
         <w:tc>
           <w:tcPr>
-            <w:tcW w:w="1294" w:type="dxa"/>
+            <w:tcW w:w="1418" w:type="dxa"/>
             <w:vAlign w:val="center"/>
           </w:tcPr>
           <w:p>
@@ -21048,602 +20796,29 @@
         </w:tc>
         <w:tc>
           <w:tcPr>
-            <w:tcW w:w="1741" w:type="dxa"/>
-            <w:vAlign w:val="center"/>
-          </w:tcPr>
-          <w:p>
-            <w:pPr>
-              <w:jc w:val="center"/>
-              <w:rPr>
-                <w:rFonts w:ascii="Calibri" w:hAnsi="Calibri" w:cs="Calibri"/>
-                <w:color w:val="000000" w:themeColor="text1"/>
-                <w:sz w:val="20"/>
-                <w:szCs w:val="20"/>
-                <w:lang w:val="es-ES"/>
-              </w:rPr>
-            </w:pPr>
-            <w:r>
-              <w:rPr>
-                <w:rFonts w:ascii="Calibri" w:hAnsi="Calibri" w:cs="Calibri"/>
-                <w:color w:val="000000" w:themeColor="text1"/>
-                <w:sz w:val="20"/>
-                <w:szCs w:val="20"/>
-                <w:lang w:val="es-ES"/>
-              </w:rPr>
-              <w:t xml:space="preserve">La cláusula si cumplen con los requisitos de la LFPDPPP. </w:t>
-            </w:r>
-          </w:p>
-        </w:tc>
-      </w:tr>
-      <w:tr>
-        <w:trPr>
-          <w:trHeight w:val="716"/>
-          <w:jc w:val="center"/>
-        </w:trPr>
-        <w:tc>
-          <w:tcPr>
-            <w:tcW w:w="1796" w:type="dxa"/>
-            <w:shd w:val="clear" w:color="auto" w:fill="A6A6A6" w:themeFill="background1" w:themeFillShade="A6"/>
-            <w:vAlign w:val="center"/>
-          </w:tcPr>
-          <w:p>
-            <w:pPr>
-              <w:jc w:val="center"/>
-            </w:pPr>
-            <w:r>
-              <w:rPr>
-                <w:rFonts w:ascii="Calibri" w:hAnsi="Calibri" w:cs="Calibri"/>
-                <w:b/>
-                <w:bCs/>
-                <w:color w:val="FFFFFF" w:themeColor="background1"/>
-                <w:sz w:val="20"/>
-                <w:szCs w:val="20"/>
-                <w:lang w:val="en-US"/>
-              </w:rPr>
-              <w:t>VIMEO</w:t>
-            </w:r>
-          </w:p>
-        </w:tc>
-        <w:tc>
-          <w:tcPr>
-            <w:tcW w:w="1496" w:type="dxa"/>
-            <w:vAlign w:val="center"/>
-          </w:tcPr>
-          <w:p>
-            <w:pPr>
-              <w:jc w:val="center"/>
-              <w:rPr>
-                <w:rFonts w:ascii="Calibri" w:hAnsi="Calibri" w:cs="Calibri"/>
-                <w:color w:val="000000" w:themeColor="text1"/>
-                <w:sz w:val="20"/>
-                <w:szCs w:val="20"/>
-                <w:lang w:val="es-ES"/>
-              </w:rPr>
-            </w:pPr>
-            <w:r>
-              <w:rPr>
-                <w:rFonts w:ascii="Calibri" w:hAnsi="Calibri" w:cs="Calibri"/>
-                <w:color w:val="000000" w:themeColor="text1"/>
-                <w:sz w:val="20"/>
-                <w:szCs w:val="20"/>
-                <w:lang w:val="es-ES"/>
-              </w:rPr>
-              <w:t>Términos de Uso de plataforma para la creación y divulgación de videos</w:t>
-            </w:r>
-          </w:p>
-        </w:tc>
-        <w:tc>
-          <w:tcPr>
-            <w:tcW w:w="1429" w:type="dxa"/>
-            <w:vAlign w:val="center"/>
-          </w:tcPr>
-          <w:p>
-            <w:pPr>
-              <w:jc w:val="center"/>
-              <w:rPr>
-                <w:rFonts w:ascii="Calibri" w:hAnsi="Calibri" w:cs="Calibri"/>
-                <w:color w:val="000000" w:themeColor="text1"/>
-                <w:sz w:val="20"/>
-                <w:szCs w:val="20"/>
-                <w:lang w:val="es-ES"/>
-              </w:rPr>
-            </w:pPr>
-            <w:r>
-              <w:rPr>
-                <w:rFonts w:ascii="Calibri" w:hAnsi="Calibri" w:cs="Calibri"/>
-                <w:color w:val="000000" w:themeColor="text1"/>
-                <w:sz w:val="20"/>
-                <w:szCs w:val="20"/>
-                <w:lang w:val="es-ES"/>
-              </w:rPr>
-              <w:t>Transferencia</w:t>
-            </w:r>
-          </w:p>
-        </w:tc>
-        <w:tc>
-          <w:tcPr>
-            <w:tcW w:w="2587" w:type="dxa"/>
-            <w:vAlign w:val="center"/>
-          </w:tcPr>
-          <w:p>
-            <w:pPr>
-              <w:jc w:val="center"/>
-              <w:rPr>
-                <w:rFonts w:ascii="Calibri" w:hAnsi="Calibri" w:cs="Calibri"/>
-                <w:color w:val="000000" w:themeColor="text1"/>
-                <w:sz w:val="20"/>
-                <w:szCs w:val="20"/>
-                <w:lang w:val="es-ES"/>
-              </w:rPr>
-            </w:pPr>
-            <w:r>
-              <w:rPr>
-                <w:rFonts w:ascii="Calibri" w:hAnsi="Calibri" w:cs="Calibri"/>
-                <w:color w:val="000000" w:themeColor="text1"/>
-                <w:sz w:val="20"/>
-                <w:szCs w:val="20"/>
-                <w:lang w:val="es-ES"/>
-              </w:rPr>
-              <w:t>(1) Privacy policy</w:t>
-            </w:r>
-          </w:p>
-        </w:tc>
-        <w:tc>
-          <w:tcPr>
-            <w:tcW w:w="1294" w:type="dxa"/>
-            <w:vAlign w:val="center"/>
-          </w:tcPr>
-          <w:p>
-            <w:pPr>
-              <w:jc w:val="center"/>
-              <w:rPr>
-                <w:rFonts w:ascii="Calibri" w:hAnsi="Calibri" w:cs="Calibri"/>
-                <w:color w:val="000000" w:themeColor="text1"/>
-                <w:sz w:val="20"/>
-                <w:szCs w:val="20"/>
-                <w:lang w:val="es-ES"/>
-              </w:rPr>
-            </w:pPr>
-            <w:r>
-              <w:rPr>
-                <w:rFonts w:ascii="Calibri" w:hAnsi="Calibri" w:cs="Calibri"/>
-                <w:color w:val="000000" w:themeColor="text1"/>
-                <w:sz w:val="20"/>
-                <w:szCs w:val="20"/>
-                <w:lang w:val="es-ES"/>
-              </w:rPr>
-              <w:t>Sí cumple</w:t>
-            </w:r>
-          </w:p>
-        </w:tc>
-        <w:tc>
-          <w:tcPr>
-            <w:tcW w:w="1741" w:type="dxa"/>
-            <w:vAlign w:val="center"/>
-          </w:tcPr>
-          <w:p>
-            <w:pPr>
-              <w:jc w:val="center"/>
-              <w:rPr>
-                <w:rFonts w:ascii="Calibri" w:hAnsi="Calibri" w:cs="Calibri"/>
-                <w:color w:val="000000" w:themeColor="text1"/>
-                <w:sz w:val="20"/>
-                <w:szCs w:val="20"/>
-                <w:lang w:val="es-ES"/>
-              </w:rPr>
-            </w:pPr>
-            <w:r>
-              <w:rPr>
-                <w:rFonts w:ascii="Calibri" w:hAnsi="Calibri" w:cs="Calibri"/>
-                <w:color w:val="000000" w:themeColor="text1"/>
-                <w:sz w:val="20"/>
-                <w:szCs w:val="20"/>
-                <w:lang w:val="es-ES"/>
-              </w:rPr>
-              <w:t>La cláusula si cumplen con los requisitos de la LFPDPPP.</w:t>
-            </w:r>
-          </w:p>
-        </w:tc>
-      </w:tr>
-      <w:tr>
-        <w:trPr>
-          <w:trHeight w:val="716"/>
-          <w:jc w:val="center"/>
-        </w:trPr>
-        <w:tc>
-          <w:tcPr>
-            <w:tcW w:w="1796" w:type="dxa"/>
-            <w:shd w:val="clear" w:color="auto" w:fill="A6A6A6" w:themeFill="background1" w:themeFillShade="A6"/>
-            <w:vAlign w:val="center"/>
-          </w:tcPr>
-          <w:p>
-            <w:pPr>
-              <w:jc w:val="center"/>
-              <w:rPr>
-                <w:rFonts w:ascii="Calibri" w:hAnsi="Calibri" w:cs="Calibri"/>
-                <w:b/>
-                <w:bCs/>
-                <w:color w:val="FFFFFF" w:themeColor="background1"/>
-                <w:sz w:val="20"/>
-                <w:szCs w:val="20"/>
-                <w:lang w:val="en-US"/>
-              </w:rPr>
-            </w:pPr>
-            <w:r>
-              <w:rPr>
-                <w:rFonts w:asciiTheme="minorHAnsi" w:eastAsiaTheme="minorEastAsia" w:hAnsiTheme="minorHAnsi"/>
-                <w:b/>
-                <w:bCs/>
-                <w:color w:val="FFFFFF" w:themeColor="background1"/>
-                <w:sz w:val="20"/>
-                <w:szCs w:val="20"/>
-                <w:lang w:val="en-US"/>
-              </w:rPr>
-              <w:t>GPTW Deutschland GmbH</w:t>
-            </w:r>
-          </w:p>
-        </w:tc>
-        <w:tc>
-          <w:tcPr>
-            <w:tcW w:w="1496" w:type="dxa"/>
-            <w:vAlign w:val="center"/>
-          </w:tcPr>
-          <w:p>
-            <w:pPr>
-              <w:jc w:val="center"/>
-              <w:rPr>
-                <w:rFonts w:ascii="Calibri" w:hAnsi="Calibri" w:cs="Calibri"/>
-                <w:color w:val="000000" w:themeColor="text1"/>
-                <w:sz w:val="20"/>
-                <w:szCs w:val="20"/>
-                <w:lang w:val="es-ES"/>
-              </w:rPr>
-            </w:pPr>
-            <w:r>
-              <w:rPr>
-                <w:rFonts w:ascii="Calibri" w:hAnsi="Calibri" w:cs="Calibri"/>
-                <w:color w:val="000000" w:themeColor="text1"/>
-                <w:sz w:val="20"/>
-                <w:szCs w:val="20"/>
-                <w:lang w:val="es-ES"/>
-              </w:rPr>
-              <w:t xml:space="preserve">Contrato de servicios para la certificación como Great Place To Work </w:t>
-            </w:r>
-          </w:p>
-        </w:tc>
-        <w:tc>
-          <w:tcPr>
-            <w:tcW w:w="1429" w:type="dxa"/>
-            <w:vAlign w:val="center"/>
-          </w:tcPr>
-          <w:p>
-            <w:pPr>
-              <w:jc w:val="center"/>
-              <w:rPr>
-                <w:rFonts w:ascii="Calibri" w:hAnsi="Calibri" w:cs="Calibri"/>
-                <w:color w:val="000000" w:themeColor="text1"/>
-                <w:sz w:val="20"/>
-                <w:szCs w:val="20"/>
-                <w:lang w:val="es-ES"/>
-              </w:rPr>
-            </w:pPr>
-            <w:r>
-              <w:rPr>
-                <w:rFonts w:ascii="Calibri" w:hAnsi="Calibri" w:cs="Calibri"/>
-                <w:color w:val="000000" w:themeColor="text1"/>
-                <w:sz w:val="20"/>
-                <w:szCs w:val="20"/>
-                <w:lang w:val="es-ES"/>
-              </w:rPr>
-              <w:t>Transferencias</w:t>
-            </w:r>
-          </w:p>
-        </w:tc>
-        <w:tc>
-          <w:tcPr>
-            <w:tcW w:w="2587" w:type="dxa"/>
-            <w:vAlign w:val="center"/>
-          </w:tcPr>
-          <w:p>
-            <w:pPr>
-              <w:jc w:val="center"/>
-              <w:rPr>
-                <w:rFonts w:ascii="Calibri" w:hAnsi="Calibri" w:cs="Calibri"/>
-                <w:color w:val="000000" w:themeColor="text1"/>
-                <w:sz w:val="20"/>
-                <w:szCs w:val="20"/>
-                <w:lang w:val="es-ES"/>
-              </w:rPr>
-            </w:pPr>
-            <w:r>
-              <w:rPr>
-                <w:rFonts w:ascii="Calibri" w:hAnsi="Calibri" w:cs="Calibri"/>
-                <w:color w:val="000000" w:themeColor="text1"/>
-                <w:sz w:val="20"/>
-                <w:szCs w:val="20"/>
-                <w:lang w:val="es-ES"/>
-              </w:rPr>
-              <w:t xml:space="preserve">(1) </w:t>
-            </w:r>
-            <w:r>
-              <w:rPr>
-                <w:rFonts w:ascii="Calibri" w:eastAsia="Calibri" w:hAnsi="Calibri" w:cs="Calibri"/>
-                <w:sz w:val="20"/>
-                <w:szCs w:val="20"/>
-                <w:lang w:val="es-ES"/>
-              </w:rPr>
-              <w:t>Auftragsverarbeitungsvertrag</w:t>
-            </w:r>
-          </w:p>
-        </w:tc>
-        <w:tc>
-          <w:tcPr>
-            <w:tcW w:w="1294" w:type="dxa"/>
-            <w:vAlign w:val="center"/>
-          </w:tcPr>
-          <w:p>
-            <w:pPr>
-              <w:jc w:val="center"/>
-              <w:rPr>
-                <w:rFonts w:ascii="Calibri" w:hAnsi="Calibri" w:cs="Calibri"/>
-                <w:color w:val="000000" w:themeColor="text1"/>
-                <w:sz w:val="20"/>
-                <w:szCs w:val="20"/>
-                <w:lang w:val="es-ES"/>
-              </w:rPr>
-            </w:pPr>
-            <w:r>
-              <w:rPr>
-                <w:rFonts w:ascii="Calibri" w:hAnsi="Calibri" w:cs="Calibri"/>
-                <w:color w:val="000000" w:themeColor="text1"/>
-                <w:sz w:val="20"/>
-                <w:szCs w:val="20"/>
-                <w:lang w:val="es-ES"/>
-              </w:rPr>
-              <w:t>No cumple</w:t>
-            </w:r>
-          </w:p>
-        </w:tc>
-        <w:tc>
-          <w:tcPr>
-            <w:tcW w:w="1741" w:type="dxa"/>
-            <w:vAlign w:val="center"/>
-          </w:tcPr>
-          <w:p>
-            <w:pPr>
-              <w:jc w:val="center"/>
-              <w:rPr>
-                <w:rFonts w:ascii="Calibri" w:hAnsi="Calibri" w:cs="Calibri"/>
-                <w:color w:val="000000" w:themeColor="text1"/>
-                <w:sz w:val="20"/>
-                <w:szCs w:val="20"/>
-                <w:lang w:val="es-ES"/>
-              </w:rPr>
-            </w:pPr>
-            <w:r>
-              <w:rPr>
-                <w:rFonts w:ascii="Calibri" w:hAnsi="Calibri" w:cs="Calibri"/>
-                <w:color w:val="000000" w:themeColor="text1"/>
-                <w:sz w:val="20"/>
-                <w:szCs w:val="20"/>
-                <w:lang w:val="es-ES"/>
-              </w:rPr>
-              <w:t xml:space="preserve">El contrato regula una remisión de datos personales, como el responsable trata los datos personales de manera independiente de Grünenthal, con el objetivo de funcionar como un certificador independiente, se </w:t>
-            </w:r>
-            <w:r>
-              <w:rPr>
-                <w:rFonts w:ascii="Calibri" w:hAnsi="Calibri" w:cs="Calibri"/>
-                <w:color w:val="000000" w:themeColor="text1"/>
-                <w:sz w:val="20"/>
-                <w:szCs w:val="20"/>
-                <w:lang w:val="es-ES"/>
-              </w:rPr>
-              <w:lastRenderedPageBreak/>
-              <w:t xml:space="preserve">debe de considerar una transferencia. </w:t>
-            </w:r>
-          </w:p>
-          <w:p>
-            <w:pPr>
-              <w:jc w:val="center"/>
-              <w:rPr>
-                <w:rFonts w:ascii="Calibri" w:hAnsi="Calibri" w:cs="Calibri"/>
-                <w:color w:val="000000" w:themeColor="text1"/>
-                <w:sz w:val="20"/>
-                <w:szCs w:val="20"/>
-                <w:lang w:val="es-ES"/>
-              </w:rPr>
-            </w:pPr>
-          </w:p>
-          <w:p>
-            <w:pPr>
-              <w:jc w:val="center"/>
-              <w:rPr>
-                <w:rFonts w:ascii="Calibri" w:hAnsi="Calibri" w:cs="Calibri"/>
-                <w:color w:val="000000" w:themeColor="text1"/>
-                <w:sz w:val="20"/>
-                <w:szCs w:val="20"/>
-                <w:lang w:val="es-ES"/>
-              </w:rPr>
-            </w:pPr>
-          </w:p>
-        </w:tc>
-      </w:tr>
-      <w:tr>
-        <w:trPr>
-          <w:trHeight w:val="716"/>
-          <w:jc w:val="center"/>
-        </w:trPr>
-        <w:tc>
-          <w:tcPr>
-            <w:tcW w:w="1796" w:type="dxa"/>
-            <w:shd w:val="clear" w:color="auto" w:fill="A6A6A6" w:themeFill="background1" w:themeFillShade="A6"/>
-            <w:vAlign w:val="center"/>
-          </w:tcPr>
-          <w:p>
-            <w:pPr>
-              <w:jc w:val="center"/>
-              <w:rPr>
-                <w:rFonts w:ascii="Calibri" w:hAnsi="Calibri" w:cs="Calibri"/>
-                <w:b/>
-                <w:bCs/>
-                <w:color w:val="FFFFFF" w:themeColor="background1"/>
-                <w:sz w:val="20"/>
-                <w:szCs w:val="20"/>
-                <w:lang w:val="en-US"/>
-              </w:rPr>
-            </w:pPr>
-            <w:r>
-              <w:rPr>
-                <w:rFonts w:asciiTheme="minorHAnsi" w:eastAsiaTheme="minorEastAsia" w:hAnsiTheme="minorHAnsi"/>
-                <w:b/>
-                <w:bCs/>
-                <w:color w:val="FFFFFF" w:themeColor="background1"/>
-                <w:sz w:val="20"/>
-                <w:szCs w:val="20"/>
-                <w:lang w:val="en-US"/>
-              </w:rPr>
-              <w:lastRenderedPageBreak/>
-              <w:t xml:space="preserve">MASTER CONTROL INC. </w:t>
-            </w:r>
-          </w:p>
-        </w:tc>
-        <w:tc>
-          <w:tcPr>
-            <w:tcW w:w="1496" w:type="dxa"/>
-            <w:vAlign w:val="center"/>
-          </w:tcPr>
-          <w:p>
-            <w:pPr>
-              <w:jc w:val="center"/>
-              <w:rPr>
-                <w:rFonts w:ascii="Calibri" w:hAnsi="Calibri" w:cs="Calibri"/>
-                <w:color w:val="000000" w:themeColor="text1"/>
-                <w:sz w:val="20"/>
-                <w:szCs w:val="20"/>
-                <w:lang w:val="es-ES"/>
-              </w:rPr>
-            </w:pPr>
-            <w:r>
-              <w:rPr>
-                <w:rFonts w:ascii="Calibri" w:hAnsi="Calibri" w:cs="Calibri"/>
-                <w:color w:val="000000" w:themeColor="text1"/>
-                <w:sz w:val="20"/>
-                <w:szCs w:val="20"/>
-                <w:lang w:val="es-ES"/>
-              </w:rPr>
-              <w:t xml:space="preserve">Contrato de licencia de uso de software y prestación de servicios de capacitación. </w:t>
-            </w:r>
-          </w:p>
-        </w:tc>
-        <w:tc>
-          <w:tcPr>
-            <w:tcW w:w="1429" w:type="dxa"/>
-            <w:vAlign w:val="center"/>
-          </w:tcPr>
-          <w:p>
-            <w:pPr>
-              <w:jc w:val="center"/>
-              <w:rPr>
-                <w:rFonts w:ascii="Calibri" w:hAnsi="Calibri" w:cs="Calibri"/>
-                <w:color w:val="000000" w:themeColor="text1"/>
-                <w:sz w:val="20"/>
-                <w:szCs w:val="20"/>
-                <w:lang w:val="es-ES"/>
-              </w:rPr>
-            </w:pPr>
-            <w:r>
-              <w:rPr>
-                <w:rFonts w:ascii="Calibri" w:hAnsi="Calibri" w:cs="Calibri"/>
-                <w:color w:val="000000" w:themeColor="text1"/>
-                <w:sz w:val="20"/>
-                <w:szCs w:val="20"/>
-                <w:lang w:val="es-ES"/>
-              </w:rPr>
-              <w:t>Remisión</w:t>
-            </w:r>
-          </w:p>
-        </w:tc>
-        <w:tc>
-          <w:tcPr>
-            <w:tcW w:w="2587" w:type="dxa"/>
-            <w:vAlign w:val="center"/>
-          </w:tcPr>
-          <w:p>
-            <w:pPr>
-              <w:jc w:val="center"/>
-              <w:rPr>
-                <w:rFonts w:ascii="Calibri" w:hAnsi="Calibri" w:cs="Calibri"/>
-                <w:color w:val="000000" w:themeColor="text1"/>
-                <w:sz w:val="20"/>
-                <w:szCs w:val="20"/>
-                <w:lang w:val="es-ES"/>
-              </w:rPr>
-            </w:pPr>
-            <w:r>
-              <w:rPr>
-                <w:rFonts w:ascii="Calibri" w:hAnsi="Calibri" w:cs="Calibri"/>
-                <w:color w:val="000000" w:themeColor="text1"/>
-                <w:sz w:val="20"/>
-                <w:szCs w:val="20"/>
-                <w:lang w:val="es-ES"/>
-              </w:rPr>
-              <w:t>(1) Data Processing Addendum</w:t>
-            </w:r>
-          </w:p>
-        </w:tc>
-        <w:tc>
-          <w:tcPr>
-            <w:tcW w:w="1294" w:type="dxa"/>
-            <w:vAlign w:val="center"/>
-          </w:tcPr>
-          <w:p>
-            <w:pPr>
-              <w:jc w:val="center"/>
-              <w:rPr>
-                <w:rFonts w:ascii="Calibri" w:hAnsi="Calibri" w:cs="Calibri"/>
-                <w:color w:val="000000" w:themeColor="text1"/>
-                <w:sz w:val="20"/>
-                <w:szCs w:val="20"/>
-                <w:lang w:val="es-ES"/>
-              </w:rPr>
-            </w:pPr>
-            <w:r>
-              <w:rPr>
-                <w:rFonts w:ascii="Calibri" w:hAnsi="Calibri" w:cs="Calibri"/>
-                <w:color w:val="000000" w:themeColor="text1"/>
-                <w:sz w:val="20"/>
-                <w:szCs w:val="20"/>
-                <w:lang w:val="es-ES"/>
-              </w:rPr>
-              <w:t>Sí cumple</w:t>
-            </w:r>
-          </w:p>
-        </w:tc>
-        <w:tc>
-          <w:tcPr>
-            <w:tcW w:w="1741" w:type="dxa"/>
-            <w:vAlign w:val="center"/>
-          </w:tcPr>
-          <w:p>
-            <w:pPr>
-              <w:jc w:val="center"/>
-              <w:rPr>
-                <w:rFonts w:ascii="Calibri" w:hAnsi="Calibri" w:cs="Calibri"/>
-                <w:color w:val="000000" w:themeColor="text1"/>
-                <w:sz w:val="20"/>
-                <w:szCs w:val="20"/>
-                <w:lang w:val="es-ES"/>
-              </w:rPr>
-            </w:pPr>
-            <w:r>
-              <w:rPr>
-                <w:rFonts w:ascii="Calibri" w:hAnsi="Calibri" w:cs="Calibri"/>
-                <w:color w:val="000000" w:themeColor="text1"/>
-                <w:sz w:val="20"/>
-                <w:szCs w:val="20"/>
-                <w:lang w:val="es-ES"/>
-              </w:rPr>
-              <w:t xml:space="preserve">La cláusula si cumplen con los requisitos de la LFPDPPP. </w:t>
+            <w:tcW w:w="1873" w:type="dxa"/>
+            <w:vAlign w:val="center"/>
+          </w:tcPr>
+          <w:p>
+            <w:pPr>
+              <w:jc w:val="center"/>
+              <w:rPr>
+                <w:rFonts w:ascii="Calibri" w:hAnsi="Calibri" w:cs="Calibri"/>
+                <w:color w:val="000000" w:themeColor="text1"/>
+                <w:sz w:val="20"/>
+                <w:szCs w:val="20"/>
+                <w:lang w:val="es-ES_tradnl"/>
+              </w:rPr>
+            </w:pPr>
+            <w:r>
+              <w:rPr>
+                <w:rFonts w:ascii="Calibri" w:hAnsi="Calibri" w:cs="Calibri"/>
+                <w:color w:val="000000" w:themeColor="text1"/>
+                <w:sz w:val="20"/>
+                <w:szCs w:val="20"/>
+                <w:lang w:val="es-ES_tradnl"/>
+              </w:rPr>
+              <w:t>La cláusula si cumplen con los requisitos de la LFPDPPP y su Reglamento</w:t>
             </w:r>
           </w:p>
         </w:tc>
@@ -21680,7 +20855,7 @@
 </file>
 
 <file path=word/endnotes.xml><?xml version="1.0" encoding="utf-8"?>
-<w:endnotes xmlns:wpc="http://schemas.microsoft.com/office/word/2010/wordprocessingCanvas" xmlns:cx="http://schemas.microsoft.com/office/drawing/2014/chartex" xmlns:cx1="http://schemas.microsoft.com/office/drawing/2015/9/8/chartex" xmlns:cx2="http://schemas.microsoft.com/office/drawing/2015/10/21/chartex" xmlns:cx3="http://schemas.microsoft.com/office/drawing/2016/5/9/chartex" xmlns:cx4="http://schemas.microsoft.com/office/drawing/2016/5/10/chartex" xmlns:cx5="http://schemas.microsoft.com/office/drawing/2016/5/11/chartex" xmlns:cx6="http://schemas.microsoft.com/office/drawing/2016/5/12/chartex" xmlns:cx7="http://schemas.microsoft.com/office/drawing/2016/5/13/chartex" xmlns:cx8="http://schemas.microsoft.com/office/drawing/2016/5/14/chartex" xmlns:mc="http://schemas.openxmlformats.org/markup-compatibility/2006" xmlns:m="http://schemas.openxmlformats.org/officeDocument/2006/math" xmlns:aink="http://schemas.microsoft.com/office/drawing/2016/ink" xmlns:am3d="http://schemas.microsoft.com/office/drawing/2017/model3d" xmlns:oel="http://schemas.microsoft.com/office/2019/extlst" xmlns:r="http://schemas.openxmlformats.org/officeDocument/2006/relationships" xmlns:wp14="http://schemas.microsoft.com/office/word/2010/wordprocessingDrawing" xmlns:wp="http://schemas.openxmlformats.org/drawingml/2006/wordprocessingDrawing" xmlns:wpg="http://schemas.microsoft.com/office/word/2010/wordprocessingGroup" xmlns:wpi="http://schemas.microsoft.com/office/word/2010/wordprocessingInk" xmlns:wps="http://schemas.microsoft.com/office/word/2010/wordprocessingShape" xmlns:o="urn:schemas-microsoft-com:office:office" xmlns:v="urn:schemas-microsoft-com:vml" xmlns:w10="urn:schemas-microsoft-com:office:word" xmlns:w="http://schemas.openxmlformats.org/wordprocessingml/2006/main" xmlns:w14="http://schemas.microsoft.com/office/word/2010/wordml" xmlns:w15="http://schemas.microsoft.com/office/word/2012/wordml" xmlns:w16cex="http://schemas.microsoft.com/office/word/2018/wordml/cex" xmlns:w16cid="http://schemas.microsoft.com/office/word/2016/wordml/cid" xmlns:w16="http://schemas.microsoft.com/office/word/2018/wordml" xmlns:w16sdtdh="http://schemas.microsoft.com/office/word/2020/wordml/sdtdatahash" xmlns:w16sdtfl="http://schemas.microsoft.com/office/word/2024/wordml/sdtformatlock" xmlns:w16se="http://schemas.microsoft.com/office/word/2015/wordml/symex" xmlns:w16du="http://schemas.microsoft.com/office/word/2023/wordml/word16du" xmlns:wne="http://schemas.microsoft.com/office/word/2006/wordml" mc:Ignorable="w14 w15 w16se w16cid w16 w16cex w16sdtdh w16sdtfl w16du wp14">
+<w:endnotes xmlns:wpc="http://schemas.microsoft.com/office/word/2010/wordprocessingCanvas" xmlns:cx="http://schemas.microsoft.com/office/drawing/2014/chartex" xmlns:cx1="http://schemas.microsoft.com/office/drawing/2015/9/8/chartex" xmlns:cx2="http://schemas.microsoft.com/office/drawing/2015/10/21/chartex" xmlns:cx3="http://schemas.microsoft.com/office/drawing/2016/5/9/chartex" xmlns:cx4="http://schemas.microsoft.com/office/drawing/2016/5/10/chartex" xmlns:cx5="http://schemas.microsoft.com/office/drawing/2016/5/11/chartex" xmlns:cx6="http://schemas.microsoft.com/office/drawing/2016/5/12/chartex" xmlns:cx7="http://schemas.microsoft.com/office/drawing/2016/5/13/chartex" xmlns:cx8="http://schemas.microsoft.com/office/drawing/2016/5/14/chartex" xmlns:mc="http://schemas.openxmlformats.org/markup-compatibility/2006" xmlns:aink="http://schemas.microsoft.com/office/drawing/2016/ink" xmlns:am3d="http://schemas.microsoft.com/office/drawing/2017/model3d" xmlns:o="urn:schemas-microsoft-com:office:office" xmlns:oel="http://schemas.microsoft.com/office/2019/extlst" xmlns:r="http://schemas.openxmlformats.org/officeDocument/2006/relationships" xmlns:m="http://schemas.openxmlformats.org/officeDocument/2006/math" xmlns:v="urn:schemas-microsoft-com:vml" xmlns:wp14="http://schemas.microsoft.com/office/word/2010/wordprocessingDrawing" xmlns:wp="http://schemas.openxmlformats.org/drawingml/2006/wordprocessingDrawing" xmlns:w10="urn:schemas-microsoft-com:office:word" xmlns:w="http://schemas.openxmlformats.org/wordprocessingml/2006/main" xmlns:w14="http://schemas.microsoft.com/office/word/2010/wordml" xmlns:w15="http://schemas.microsoft.com/office/word/2012/wordml" xmlns:w16cex="http://schemas.microsoft.com/office/word/2018/wordml/cex" xmlns:w16cid="http://schemas.microsoft.com/office/word/2016/wordml/cid" xmlns:w16="http://schemas.microsoft.com/office/word/2018/wordml" xmlns:w16du="http://schemas.microsoft.com/office/word/2023/wordml/word16du" xmlns:w16sdtdh="http://schemas.microsoft.com/office/word/2020/wordml/sdtdatahash" xmlns:w16sdtfl="http://schemas.microsoft.com/office/word/2024/wordml/sdtformatlock" xmlns:w16se="http://schemas.microsoft.com/office/word/2015/wordml/symex" xmlns:wpg="http://schemas.microsoft.com/office/word/2010/wordprocessingGroup" xmlns:wpi="http://schemas.microsoft.com/office/word/2010/wordprocessingInk" xmlns:wne="http://schemas.microsoft.com/office/word/2006/wordml" xmlns:wps="http://schemas.microsoft.com/office/word/2010/wordprocessingShape" mc:Ignorable="w14 w15 w16se w16cid w16 w16cex w16sdtdh w16sdtfl w16du wp14">
   <w:endnote w:type="separator" w:id="-1">
     <w:p>
       <w:pPr>
@@ -21705,7 +20880,7 @@
 </file>
 
 <file path=word/footer1.xml><?xml version="1.0" encoding="utf-8"?>
-<w:ftr xmlns:wpc="http://schemas.microsoft.com/office/word/2010/wordprocessingCanvas" xmlns:cx="http://schemas.microsoft.com/office/drawing/2014/chartex" xmlns:cx1="http://schemas.microsoft.com/office/drawing/2015/9/8/chartex" xmlns:cx2="http://schemas.microsoft.com/office/drawing/2015/10/21/chartex" xmlns:cx3="http://schemas.microsoft.com/office/drawing/2016/5/9/chartex" xmlns:cx4="http://schemas.microsoft.com/office/drawing/2016/5/10/chartex" xmlns:cx5="http://schemas.microsoft.com/office/drawing/2016/5/11/chartex" xmlns:cx6="http://schemas.microsoft.com/office/drawing/2016/5/12/chartex" xmlns:cx7="http://schemas.microsoft.com/office/drawing/2016/5/13/chartex" xmlns:cx8="http://schemas.microsoft.com/office/drawing/2016/5/14/chartex" xmlns:mc="http://schemas.openxmlformats.org/markup-compatibility/2006" xmlns:m="http://schemas.openxmlformats.org/officeDocument/2006/math" xmlns:aink="http://schemas.microsoft.com/office/drawing/2016/ink" xmlns:am3d="http://schemas.microsoft.com/office/drawing/2017/model3d" xmlns:oel="http://schemas.microsoft.com/office/2019/extlst" xmlns:r="http://schemas.openxmlformats.org/officeDocument/2006/relationships" xmlns:wp14="http://schemas.microsoft.com/office/word/2010/wordprocessingDrawing" xmlns:wp="http://schemas.openxmlformats.org/drawingml/2006/wordprocessingDrawing" xmlns:wpg="http://schemas.microsoft.com/office/word/2010/wordprocessingGroup" xmlns:wpi="http://schemas.microsoft.com/office/word/2010/wordprocessingInk" xmlns:wps="http://schemas.microsoft.com/office/word/2010/wordprocessingShape" xmlns:o="urn:schemas-microsoft-com:office:office" xmlns:v="urn:schemas-microsoft-com:vml" xmlns:w10="urn:schemas-microsoft-com:office:word" xmlns:w="http://schemas.openxmlformats.org/wordprocessingml/2006/main" xmlns:w14="http://schemas.microsoft.com/office/word/2010/wordml" xmlns:w15="http://schemas.microsoft.com/office/word/2012/wordml" xmlns:w16cex="http://schemas.microsoft.com/office/word/2018/wordml/cex" xmlns:w16cid="http://schemas.microsoft.com/office/word/2016/wordml/cid" xmlns:w16="http://schemas.microsoft.com/office/word/2018/wordml" xmlns:w16sdtdh="http://schemas.microsoft.com/office/word/2020/wordml/sdtdatahash" xmlns:w16sdtfl="http://schemas.microsoft.com/office/word/2024/wordml/sdtformatlock" xmlns:w16se="http://schemas.microsoft.com/office/word/2015/wordml/symex" xmlns:w16du="http://schemas.microsoft.com/office/word/2023/wordml/word16du" xmlns:wne="http://schemas.microsoft.com/office/word/2006/wordml" mc:Ignorable="w14 w15 w16se w16cid w16 w16cex w16sdtdh w16sdtfl w16du wp14">
+<w:ftr xmlns:wpc="http://schemas.microsoft.com/office/word/2010/wordprocessingCanvas" xmlns:cx="http://schemas.microsoft.com/office/drawing/2014/chartex" xmlns:cx1="http://schemas.microsoft.com/office/drawing/2015/9/8/chartex" xmlns:cx2="http://schemas.microsoft.com/office/drawing/2015/10/21/chartex" xmlns:cx3="http://schemas.microsoft.com/office/drawing/2016/5/9/chartex" xmlns:cx4="http://schemas.microsoft.com/office/drawing/2016/5/10/chartex" xmlns:cx5="http://schemas.microsoft.com/office/drawing/2016/5/11/chartex" xmlns:cx6="http://schemas.microsoft.com/office/drawing/2016/5/12/chartex" xmlns:cx7="http://schemas.microsoft.com/office/drawing/2016/5/13/chartex" xmlns:cx8="http://schemas.microsoft.com/office/drawing/2016/5/14/chartex" xmlns:mc="http://schemas.openxmlformats.org/markup-compatibility/2006" xmlns:aink="http://schemas.microsoft.com/office/drawing/2016/ink" xmlns:am3d="http://schemas.microsoft.com/office/drawing/2017/model3d" xmlns:o="urn:schemas-microsoft-com:office:office" xmlns:oel="http://schemas.microsoft.com/office/2019/extlst" xmlns:r="http://schemas.openxmlformats.org/officeDocument/2006/relationships" xmlns:m="http://schemas.openxmlformats.org/officeDocument/2006/math" xmlns:v="urn:schemas-microsoft-com:vml" xmlns:wp14="http://schemas.microsoft.com/office/word/2010/wordprocessingDrawing" xmlns:wp="http://schemas.openxmlformats.org/drawingml/2006/wordprocessingDrawing" xmlns:w10="urn:schemas-microsoft-com:office:word" xmlns:w="http://schemas.openxmlformats.org/wordprocessingml/2006/main" xmlns:w14="http://schemas.microsoft.com/office/word/2010/wordml" xmlns:w15="http://schemas.microsoft.com/office/word/2012/wordml" xmlns:w16cex="http://schemas.microsoft.com/office/word/2018/wordml/cex" xmlns:w16cid="http://schemas.microsoft.com/office/word/2016/wordml/cid" xmlns:w16="http://schemas.microsoft.com/office/word/2018/wordml" xmlns:w16du="http://schemas.microsoft.com/office/word/2023/wordml/word16du" xmlns:w16sdtdh="http://schemas.microsoft.com/office/word/2020/wordml/sdtdatahash" xmlns:w16sdtfl="http://schemas.microsoft.com/office/word/2024/wordml/sdtformatlock" xmlns:w16se="http://schemas.microsoft.com/office/word/2015/wordml/symex" xmlns:wpg="http://schemas.microsoft.com/office/word/2010/wordprocessingGroup" xmlns:wpi="http://schemas.microsoft.com/office/word/2010/wordprocessingInk" xmlns:wne="http://schemas.microsoft.com/office/word/2006/wordml" xmlns:wps="http://schemas.microsoft.com/office/word/2010/wordprocessingShape" mc:Ignorable="w14 w15 w16se w16cid w16 w16cex w16sdtdh w16sdtfl w16du wp14">
   <w:p>
     <w:pPr>
       <w:pBdr>
@@ -21833,7 +21008,7 @@
 </file>
 
 <file path=word/footer2.xml><?xml version="1.0" encoding="utf-8"?>
-<w:ftr xmlns:wpc="http://schemas.microsoft.com/office/word/2010/wordprocessingCanvas" xmlns:cx="http://schemas.microsoft.com/office/drawing/2014/chartex" xmlns:cx1="http://schemas.microsoft.com/office/drawing/2015/9/8/chartex" xmlns:cx2="http://schemas.microsoft.com/office/drawing/2015/10/21/chartex" xmlns:cx3="http://schemas.microsoft.com/office/drawing/2016/5/9/chartex" xmlns:cx4="http://schemas.microsoft.com/office/drawing/2016/5/10/chartex" xmlns:cx5="http://schemas.microsoft.com/office/drawing/2016/5/11/chartex" xmlns:cx6="http://schemas.microsoft.com/office/drawing/2016/5/12/chartex" xmlns:cx7="http://schemas.microsoft.com/office/drawing/2016/5/13/chartex" xmlns:cx8="http://schemas.microsoft.com/office/drawing/2016/5/14/chartex" xmlns:mc="http://schemas.openxmlformats.org/markup-compatibility/2006" xmlns:m="http://schemas.openxmlformats.org/officeDocument/2006/math" xmlns:aink="http://schemas.microsoft.com/office/drawing/2016/ink" xmlns:am3d="http://schemas.microsoft.com/office/drawing/2017/model3d" xmlns:oel="http://schemas.microsoft.com/office/2019/extlst" xmlns:r="http://schemas.openxmlformats.org/officeDocument/2006/relationships" xmlns:wp14="http://schemas.microsoft.com/office/word/2010/wordprocessingDrawing" xmlns:wp="http://schemas.openxmlformats.org/drawingml/2006/wordprocessingDrawing" xmlns:wpg="http://schemas.microsoft.com/office/word/2010/wordprocessingGroup" xmlns:wpi="http://schemas.microsoft.com/office/word/2010/wordprocessingInk" xmlns:wps="http://schemas.microsoft.com/office/word/2010/wordprocessingShape" xmlns:o="urn:schemas-microsoft-com:office:office" xmlns:v="urn:schemas-microsoft-com:vml" xmlns:w10="urn:schemas-microsoft-com:office:word" xmlns:w="http://schemas.openxmlformats.org/wordprocessingml/2006/main" xmlns:w14="http://schemas.microsoft.com/office/word/2010/wordml" xmlns:w15="http://schemas.microsoft.com/office/word/2012/wordml" xmlns:w16cex="http://schemas.microsoft.com/office/word/2018/wordml/cex" xmlns:w16cid="http://schemas.microsoft.com/office/word/2016/wordml/cid" xmlns:w16="http://schemas.microsoft.com/office/word/2018/wordml" xmlns:w16sdtdh="http://schemas.microsoft.com/office/word/2020/wordml/sdtdatahash" xmlns:w16sdtfl="http://schemas.microsoft.com/office/word/2024/wordml/sdtformatlock" xmlns:w16se="http://schemas.microsoft.com/office/word/2015/wordml/symex" xmlns:w16du="http://schemas.microsoft.com/office/word/2023/wordml/word16du" xmlns:wne="http://schemas.microsoft.com/office/word/2006/wordml" mc:Ignorable="w14 w15 w16se w16cid w16 w16cex w16sdtdh w16sdtfl w16du wp14">
+<w:ftr xmlns:wpc="http://schemas.microsoft.com/office/word/2010/wordprocessingCanvas" xmlns:cx="http://schemas.microsoft.com/office/drawing/2014/chartex" xmlns:cx1="http://schemas.microsoft.com/office/drawing/2015/9/8/chartex" xmlns:cx2="http://schemas.microsoft.com/office/drawing/2015/10/21/chartex" xmlns:cx3="http://schemas.microsoft.com/office/drawing/2016/5/9/chartex" xmlns:cx4="http://schemas.microsoft.com/office/drawing/2016/5/10/chartex" xmlns:cx5="http://schemas.microsoft.com/office/drawing/2016/5/11/chartex" xmlns:cx6="http://schemas.microsoft.com/office/drawing/2016/5/12/chartex" xmlns:cx7="http://schemas.microsoft.com/office/drawing/2016/5/13/chartex" xmlns:cx8="http://schemas.microsoft.com/office/drawing/2016/5/14/chartex" xmlns:mc="http://schemas.openxmlformats.org/markup-compatibility/2006" xmlns:aink="http://schemas.microsoft.com/office/drawing/2016/ink" xmlns:am3d="http://schemas.microsoft.com/office/drawing/2017/model3d" xmlns:o="urn:schemas-microsoft-com:office:office" xmlns:oel="http://schemas.microsoft.com/office/2019/extlst" xmlns:r="http://schemas.openxmlformats.org/officeDocument/2006/relationships" xmlns:m="http://schemas.openxmlformats.org/officeDocument/2006/math" xmlns:v="urn:schemas-microsoft-com:vml" xmlns:wp14="http://schemas.microsoft.com/office/word/2010/wordprocessingDrawing" xmlns:wp="http://schemas.openxmlformats.org/drawingml/2006/wordprocessingDrawing" xmlns:w10="urn:schemas-microsoft-com:office:word" xmlns:w="http://schemas.openxmlformats.org/wordprocessingml/2006/main" xmlns:w14="http://schemas.microsoft.com/office/word/2010/wordml" xmlns:w15="http://schemas.microsoft.com/office/word/2012/wordml" xmlns:w16cex="http://schemas.microsoft.com/office/word/2018/wordml/cex" xmlns:w16cid="http://schemas.microsoft.com/office/word/2016/wordml/cid" xmlns:w16="http://schemas.microsoft.com/office/word/2018/wordml" xmlns:w16du="http://schemas.microsoft.com/office/word/2023/wordml/word16du" xmlns:w16sdtdh="http://schemas.microsoft.com/office/word/2020/wordml/sdtdatahash" xmlns:w16sdtfl="http://schemas.microsoft.com/office/word/2024/wordml/sdtformatlock" xmlns:w16se="http://schemas.microsoft.com/office/word/2015/wordml/symex" xmlns:wpg="http://schemas.microsoft.com/office/word/2010/wordprocessingGroup" xmlns:wpi="http://schemas.microsoft.com/office/word/2010/wordprocessingInk" xmlns:wne="http://schemas.microsoft.com/office/word/2006/wordml" xmlns:wps="http://schemas.microsoft.com/office/word/2010/wordprocessingShape" mc:Ignorable="w14 w15 w16se w16cid w16 w16cex w16sdtdh w16sdtfl w16du wp14">
   <w:tbl>
     <w:tblPr>
       <w:tblW w:w="0" w:type="auto"/>
@@ -21895,7 +21070,7 @@
 </file>
 
 <file path=word/footnotes.xml><?xml version="1.0" encoding="utf-8"?>
-<w:footnotes xmlns:wpc="http://schemas.microsoft.com/office/word/2010/wordprocessingCanvas" xmlns:cx="http://schemas.microsoft.com/office/drawing/2014/chartex" xmlns:cx1="http://schemas.microsoft.com/office/drawing/2015/9/8/chartex" xmlns:cx2="http://schemas.microsoft.com/office/drawing/2015/10/21/chartex" xmlns:cx3="http://schemas.microsoft.com/office/drawing/2016/5/9/chartex" xmlns:cx4="http://schemas.microsoft.com/office/drawing/2016/5/10/chartex" xmlns:cx5="http://schemas.microsoft.com/office/drawing/2016/5/11/chartex" xmlns:cx6="http://schemas.microsoft.com/office/drawing/2016/5/12/chartex" xmlns:cx7="http://schemas.microsoft.com/office/drawing/2016/5/13/chartex" xmlns:cx8="http://schemas.microsoft.com/office/drawing/2016/5/14/chartex" xmlns:mc="http://schemas.openxmlformats.org/markup-compatibility/2006" xmlns:m="http://schemas.openxmlformats.org/officeDocument/2006/math" xmlns:aink="http://schemas.microsoft.com/office/drawing/2016/ink" xmlns:am3d="http://schemas.microsoft.com/office/drawing/2017/model3d" xmlns:oel="http://schemas.microsoft.com/office/2019/extlst" xmlns:r="http://schemas.openxmlformats.org/officeDocument/2006/relationships" xmlns:wp14="http://schemas.microsoft.com/office/word/2010/wordprocessingDrawing" xmlns:wp="http://schemas.openxmlformats.org/drawingml/2006/wordprocessingDrawing" xmlns:wpg="http://schemas.microsoft.com/office/word/2010/wordprocessingGroup" xmlns:wpi="http://schemas.microsoft.com/office/word/2010/wordprocessingInk" xmlns:wps="http://schemas.microsoft.com/office/word/2010/wordprocessingShape" xmlns:o="urn:schemas-microsoft-com:office:office" xmlns:v="urn:schemas-microsoft-com:vml" xmlns:w10="urn:schemas-microsoft-com:office:word" xmlns:w="http://schemas.openxmlformats.org/wordprocessingml/2006/main" xmlns:w14="http://schemas.microsoft.com/office/word/2010/wordml" xmlns:w15="http://schemas.microsoft.com/office/word/2012/wordml" xmlns:w16cex="http://schemas.microsoft.com/office/word/2018/wordml/cex" xmlns:w16cid="http://schemas.microsoft.com/office/word/2016/wordml/cid" xmlns:w16="http://schemas.microsoft.com/office/word/2018/wordml" xmlns:w16sdtdh="http://schemas.microsoft.com/office/word/2020/wordml/sdtdatahash" xmlns:w16sdtfl="http://schemas.microsoft.com/office/word/2024/wordml/sdtformatlock" xmlns:w16se="http://schemas.microsoft.com/office/word/2015/wordml/symex" xmlns:w16du="http://schemas.microsoft.com/office/word/2023/wordml/word16du" xmlns:wne="http://schemas.microsoft.com/office/word/2006/wordml" mc:Ignorable="w14 w15 w16se w16cid w16 w16cex w16sdtdh w16sdtfl w16du wp14">
+<w:footnotes xmlns:wpc="http://schemas.microsoft.com/office/word/2010/wordprocessingCanvas" xmlns:cx="http://schemas.microsoft.com/office/drawing/2014/chartex" xmlns:cx1="http://schemas.microsoft.com/office/drawing/2015/9/8/chartex" xmlns:cx2="http://schemas.microsoft.com/office/drawing/2015/10/21/chartex" xmlns:cx3="http://schemas.microsoft.com/office/drawing/2016/5/9/chartex" xmlns:cx4="http://schemas.microsoft.com/office/drawing/2016/5/10/chartex" xmlns:cx5="http://schemas.microsoft.com/office/drawing/2016/5/11/chartex" xmlns:cx6="http://schemas.microsoft.com/office/drawing/2016/5/12/chartex" xmlns:cx7="http://schemas.microsoft.com/office/drawing/2016/5/13/chartex" xmlns:cx8="http://schemas.microsoft.com/office/drawing/2016/5/14/chartex" xmlns:mc="http://schemas.openxmlformats.org/markup-compatibility/2006" xmlns:aink="http://schemas.microsoft.com/office/drawing/2016/ink" xmlns:am3d="http://schemas.microsoft.com/office/drawing/2017/model3d" xmlns:o="urn:schemas-microsoft-com:office:office" xmlns:oel="http://schemas.microsoft.com/office/2019/extlst" xmlns:r="http://schemas.openxmlformats.org/officeDocument/2006/relationships" xmlns:m="http://schemas.openxmlformats.org/officeDocument/2006/math" xmlns:v="urn:schemas-microsoft-com:vml" xmlns:wp14="http://schemas.microsoft.com/office/word/2010/wordprocessingDrawing" xmlns:wp="http://schemas.openxmlformats.org/drawingml/2006/wordprocessingDrawing" xmlns:w10="urn:schemas-microsoft-com:office:word" xmlns:w="http://schemas.openxmlformats.org/wordprocessingml/2006/main" xmlns:w14="http://schemas.microsoft.com/office/word/2010/wordml" xmlns:w15="http://schemas.microsoft.com/office/word/2012/wordml" xmlns:w16cex="http://schemas.microsoft.com/office/word/2018/wordml/cex" xmlns:w16cid="http://schemas.microsoft.com/office/word/2016/wordml/cid" xmlns:w16="http://schemas.microsoft.com/office/word/2018/wordml" xmlns:w16du="http://schemas.microsoft.com/office/word/2023/wordml/word16du" xmlns:w16sdtdh="http://schemas.microsoft.com/office/word/2020/wordml/sdtdatahash" xmlns:w16sdtfl="http://schemas.microsoft.com/office/word/2024/wordml/sdtformatlock" xmlns:w16se="http://schemas.microsoft.com/office/word/2015/wordml/symex" xmlns:wpg="http://schemas.microsoft.com/office/word/2010/wordprocessingGroup" xmlns:wpi="http://schemas.microsoft.com/office/word/2010/wordprocessingInk" xmlns:wne="http://schemas.microsoft.com/office/word/2006/wordml" xmlns:wps="http://schemas.microsoft.com/office/word/2010/wordprocessingShape" mc:Ignorable="w14 w15 w16se w16cid w16 w16cex w16sdtdh w16sdtfl w16du wp14">
   <w:footnote w:type="separator" w:id="-1">
     <w:p>
       <w:pPr>
@@ -21920,7 +21095,7 @@
 </file>
 
 <file path=word/header1.xml><?xml version="1.0" encoding="utf-8"?>
-<w:hdr xmlns:wpc="http://schemas.microsoft.com/office/word/2010/wordprocessingCanvas" xmlns:cx="http://schemas.microsoft.com/office/drawing/2014/chartex" xmlns:cx1="http://schemas.microsoft.com/office/drawing/2015/9/8/chartex" xmlns:cx2="http://schemas.microsoft.com/office/drawing/2015/10/21/chartex" xmlns:cx3="http://schemas.microsoft.com/office/drawing/2016/5/9/chartex" xmlns:cx4="http://schemas.microsoft.com/office/drawing/2016/5/10/chartex" xmlns:cx5="http://schemas.microsoft.com/office/drawing/2016/5/11/chartex" xmlns:cx6="http://schemas.microsoft.com/office/drawing/2016/5/12/chartex" xmlns:cx7="http://schemas.microsoft.com/office/drawing/2016/5/13/chartex" xmlns:cx8="http://schemas.microsoft.com/office/drawing/2016/5/14/chartex" xmlns:mc="http://schemas.openxmlformats.org/markup-compatibility/2006" xmlns:m="http://schemas.openxmlformats.org/officeDocument/2006/math" xmlns:aink="http://schemas.microsoft.com/office/drawing/2016/ink" xmlns:am3d="http://schemas.microsoft.com/office/drawing/2017/model3d" xmlns:oel="http://schemas.microsoft.com/office/2019/extlst" xmlns:r="http://schemas.openxmlformats.org/officeDocument/2006/relationships" xmlns:wp14="http://schemas.microsoft.com/office/word/2010/wordprocessingDrawing" xmlns:wp="http://schemas.openxmlformats.org/drawingml/2006/wordprocessingDrawing" xmlns:wpg="http://schemas.microsoft.com/office/word/2010/wordprocessingGroup" xmlns:wpi="http://schemas.microsoft.com/office/word/2010/wordprocessingInk" xmlns:wps="http://schemas.microsoft.com/office/word/2010/wordprocessingShape" xmlns:o="urn:schemas-microsoft-com:office:office" xmlns:v="urn:schemas-microsoft-com:vml" xmlns:w10="urn:schemas-microsoft-com:office:word" xmlns:w="http://schemas.openxmlformats.org/wordprocessingml/2006/main" xmlns:w14="http://schemas.microsoft.com/office/word/2010/wordml" xmlns:w15="http://schemas.microsoft.com/office/word/2012/wordml" xmlns:w16cex="http://schemas.microsoft.com/office/word/2018/wordml/cex" xmlns:w16cid="http://schemas.microsoft.com/office/word/2016/wordml/cid" xmlns:w16="http://schemas.microsoft.com/office/word/2018/wordml" xmlns:w16sdtdh="http://schemas.microsoft.com/office/word/2020/wordml/sdtdatahash" xmlns:w16sdtfl="http://schemas.microsoft.com/office/word/2024/wordml/sdtformatlock" xmlns:w16se="http://schemas.microsoft.com/office/word/2015/wordml/symex" xmlns:w16du="http://schemas.microsoft.com/office/word/2023/wordml/word16du" xmlns:wne="http://schemas.microsoft.com/office/word/2006/wordml" mc:Ignorable="w14 w15 w16se w16cid w16 w16cex w16sdtdh w16sdtfl w16du wp14">
+<w:hdr xmlns:wpc="http://schemas.microsoft.com/office/word/2010/wordprocessingCanvas" xmlns:cx="http://schemas.microsoft.com/office/drawing/2014/chartex" xmlns:cx1="http://schemas.microsoft.com/office/drawing/2015/9/8/chartex" xmlns:cx2="http://schemas.microsoft.com/office/drawing/2015/10/21/chartex" xmlns:cx3="http://schemas.microsoft.com/office/drawing/2016/5/9/chartex" xmlns:cx4="http://schemas.microsoft.com/office/drawing/2016/5/10/chartex" xmlns:cx5="http://schemas.microsoft.com/office/drawing/2016/5/11/chartex" xmlns:cx6="http://schemas.microsoft.com/office/drawing/2016/5/12/chartex" xmlns:cx7="http://schemas.microsoft.com/office/drawing/2016/5/13/chartex" xmlns:cx8="http://schemas.microsoft.com/office/drawing/2016/5/14/chartex" xmlns:mc="http://schemas.openxmlformats.org/markup-compatibility/2006" xmlns:aink="http://schemas.microsoft.com/office/drawing/2016/ink" xmlns:am3d="http://schemas.microsoft.com/office/drawing/2017/model3d" xmlns:o="urn:schemas-microsoft-com:office:office" xmlns:oel="http://schemas.microsoft.com/office/2019/extlst" xmlns:r="http://schemas.openxmlformats.org/officeDocument/2006/relationships" xmlns:m="http://schemas.openxmlformats.org/officeDocument/2006/math" xmlns:v="urn:schemas-microsoft-com:vml" xmlns:wp14="http://schemas.microsoft.com/office/word/2010/wordprocessingDrawing" xmlns:wp="http://schemas.openxmlformats.org/drawingml/2006/wordprocessingDrawing" xmlns:w10="urn:schemas-microsoft-com:office:word" xmlns:w="http://schemas.openxmlformats.org/wordprocessingml/2006/main" xmlns:w14="http://schemas.microsoft.com/office/word/2010/wordml" xmlns:w15="http://schemas.microsoft.com/office/word/2012/wordml" xmlns:w16cex="http://schemas.microsoft.com/office/word/2018/wordml/cex" xmlns:w16cid="http://schemas.microsoft.com/office/word/2016/wordml/cid" xmlns:w16="http://schemas.microsoft.com/office/word/2018/wordml" xmlns:w16du="http://schemas.microsoft.com/office/word/2023/wordml/word16du" xmlns:w16sdtdh="http://schemas.microsoft.com/office/word/2020/wordml/sdtdatahash" xmlns:w16sdtfl="http://schemas.microsoft.com/office/word/2024/wordml/sdtformatlock" xmlns:w16se="http://schemas.microsoft.com/office/word/2015/wordml/symex" xmlns:wpg="http://schemas.microsoft.com/office/word/2010/wordprocessingGroup" xmlns:wpi="http://schemas.microsoft.com/office/word/2010/wordprocessingInk" xmlns:wne="http://schemas.microsoft.com/office/word/2006/wordml" xmlns:wps="http://schemas.microsoft.com/office/word/2010/wordprocessingShape" mc:Ignorable="w14 w15 w16se w16cid w16 w16cex w16sdtdh w16sdtfl w16du wp14">
   <w:p>
     <w:pPr>
       <w:pStyle w:val="Encabezado"/>
@@ -21943,7 +21118,7 @@
 </file>
 
 <file path=word/header2.xml><?xml version="1.0" encoding="utf-8"?>
-<w:hdr xmlns:wpc="http://schemas.microsoft.com/office/word/2010/wordprocessingCanvas" xmlns:cx="http://schemas.microsoft.com/office/drawing/2014/chartex" xmlns:cx1="http://schemas.microsoft.com/office/drawing/2015/9/8/chartex" xmlns:cx2="http://schemas.microsoft.com/office/drawing/2015/10/21/chartex" xmlns:cx3="http://schemas.microsoft.com/office/drawing/2016/5/9/chartex" xmlns:cx4="http://schemas.microsoft.com/office/drawing/2016/5/10/chartex" xmlns:cx5="http://schemas.microsoft.com/office/drawing/2016/5/11/chartex" xmlns:cx6="http://schemas.microsoft.com/office/drawing/2016/5/12/chartex" xmlns:cx7="http://schemas.microsoft.com/office/drawing/2016/5/13/chartex" xmlns:cx8="http://schemas.microsoft.com/office/drawing/2016/5/14/chartex" xmlns:mc="http://schemas.openxmlformats.org/markup-compatibility/2006" xmlns:m="http://schemas.openxmlformats.org/officeDocument/2006/math" xmlns:aink="http://schemas.microsoft.com/office/drawing/2016/ink" xmlns:am3d="http://schemas.microsoft.com/office/drawing/2017/model3d" xmlns:oel="http://schemas.microsoft.com/office/2019/extlst" xmlns:r="http://schemas.openxmlformats.org/officeDocument/2006/relationships" xmlns:wp14="http://schemas.microsoft.com/office/word/2010/wordprocessingDrawing" xmlns:wp="http://schemas.openxmlformats.org/drawingml/2006/wordprocessingDrawing" xmlns:wpg="http://schemas.microsoft.com/office/word/2010/wordprocessingGroup" xmlns:wpi="http://schemas.microsoft.com/office/word/2010/wordprocessingInk" xmlns:wps="http://schemas.microsoft.com/office/word/2010/wordprocessingShape" xmlns:o="urn:schemas-microsoft-com:office:office" xmlns:v="urn:schemas-microsoft-com:vml" xmlns:w10="urn:schemas-microsoft-com:office:word" xmlns:w="http://schemas.openxmlformats.org/wordprocessingml/2006/main" xmlns:w14="http://schemas.microsoft.com/office/word/2010/wordml" xmlns:w15="http://schemas.microsoft.com/office/word/2012/wordml" xmlns:w16cex="http://schemas.microsoft.com/office/word/2018/wordml/cex" xmlns:w16cid="http://schemas.microsoft.com/office/word/2016/wordml/cid" xmlns:w16="http://schemas.microsoft.com/office/word/2018/wordml" xmlns:w16sdtdh="http://schemas.microsoft.com/office/word/2020/wordml/sdtdatahash" xmlns:w16sdtfl="http://schemas.microsoft.com/office/word/2024/wordml/sdtformatlock" xmlns:w16se="http://schemas.microsoft.com/office/word/2015/wordml/symex" xmlns:w16du="http://schemas.microsoft.com/office/word/2023/wordml/word16du" xmlns:wne="http://schemas.microsoft.com/office/word/2006/wordml" mc:Ignorable="w14 w15 w16se w16cid w16 w16cex w16sdtdh w16sdtfl w16du wp14">
+<w:hdr xmlns:wpc="http://schemas.microsoft.com/office/word/2010/wordprocessingCanvas" xmlns:cx="http://schemas.microsoft.com/office/drawing/2014/chartex" xmlns:cx1="http://schemas.microsoft.com/office/drawing/2015/9/8/chartex" xmlns:cx2="http://schemas.microsoft.com/office/drawing/2015/10/21/chartex" xmlns:cx3="http://schemas.microsoft.com/office/drawing/2016/5/9/chartex" xmlns:cx4="http://schemas.microsoft.com/office/drawing/2016/5/10/chartex" xmlns:cx5="http://schemas.microsoft.com/office/drawing/2016/5/11/chartex" xmlns:cx6="http://schemas.microsoft.com/office/drawing/2016/5/12/chartex" xmlns:cx7="http://schemas.microsoft.com/office/drawing/2016/5/13/chartex" xmlns:cx8="http://schemas.microsoft.com/office/drawing/2016/5/14/chartex" xmlns:mc="http://schemas.openxmlformats.org/markup-compatibility/2006" xmlns:aink="http://schemas.microsoft.com/office/drawing/2016/ink" xmlns:am3d="http://schemas.microsoft.com/office/drawing/2017/model3d" xmlns:o="urn:schemas-microsoft-com:office:office" xmlns:oel="http://schemas.microsoft.com/office/2019/extlst" xmlns:r="http://schemas.openxmlformats.org/officeDocument/2006/relationships" xmlns:m="http://schemas.openxmlformats.org/officeDocument/2006/math" xmlns:v="urn:schemas-microsoft-com:vml" xmlns:wp14="http://schemas.microsoft.com/office/word/2010/wordprocessingDrawing" xmlns:wp="http://schemas.openxmlformats.org/drawingml/2006/wordprocessingDrawing" xmlns:w10="urn:schemas-microsoft-com:office:word" xmlns:w="http://schemas.openxmlformats.org/wordprocessingml/2006/main" xmlns:w14="http://schemas.microsoft.com/office/word/2010/wordml" xmlns:w15="http://schemas.microsoft.com/office/word/2012/wordml" xmlns:w16cex="http://schemas.microsoft.com/office/word/2018/wordml/cex" xmlns:w16cid="http://schemas.microsoft.com/office/word/2016/wordml/cid" xmlns:w16="http://schemas.microsoft.com/office/word/2018/wordml" xmlns:w16du="http://schemas.microsoft.com/office/word/2023/wordml/word16du" xmlns:w16sdtdh="http://schemas.microsoft.com/office/word/2020/wordml/sdtdatahash" xmlns:w16sdtfl="http://schemas.microsoft.com/office/word/2024/wordml/sdtformatlock" xmlns:w16se="http://schemas.microsoft.com/office/word/2015/wordml/symex" xmlns:wpg="http://schemas.microsoft.com/office/word/2010/wordprocessingGroup" xmlns:wpi="http://schemas.microsoft.com/office/word/2010/wordprocessingInk" xmlns:wne="http://schemas.microsoft.com/office/word/2006/wordml" xmlns:wps="http://schemas.microsoft.com/office/word/2010/wordprocessingShape" mc:Ignorable="w14 w15 w16se w16cid w16 w16cex w16sdtdh w16sdtfl w16du wp14">
   <w:tbl>
     <w:tblPr>
       <w:tblW w:w="0" w:type="auto"/>
@@ -22005,7 +21180,7 @@
 </file>
 
 <file path=word/numbering.xml><?xml version="1.0" encoding="utf-8"?>
-<w:numbering xmlns:wpc="http://schemas.microsoft.com/office/word/2010/wordprocessingCanvas" xmlns:cx="http://schemas.microsoft.com/office/drawing/2014/chartex" xmlns:cx1="http://schemas.microsoft.com/office/drawing/2015/9/8/chartex" xmlns:cx2="http://schemas.microsoft.com/office/drawing/2015/10/21/chartex" xmlns:cx3="http://schemas.microsoft.com/office/drawing/2016/5/9/chartex" xmlns:cx4="http://schemas.microsoft.com/office/drawing/2016/5/10/chartex" xmlns:cx5="http://schemas.microsoft.com/office/drawing/2016/5/11/chartex" xmlns:cx6="http://schemas.microsoft.com/office/drawing/2016/5/12/chartex" xmlns:cx7="http://schemas.microsoft.com/office/drawing/2016/5/13/chartex" xmlns:cx8="http://schemas.microsoft.com/office/drawing/2016/5/14/chartex" xmlns:mc="http://schemas.openxmlformats.org/markup-compatibility/2006" xmlns:m="http://schemas.openxmlformats.org/officeDocument/2006/math" xmlns:aink="http://schemas.microsoft.com/office/drawing/2016/ink" xmlns:am3d="http://schemas.microsoft.com/office/drawing/2017/model3d" xmlns:oel="http://schemas.microsoft.com/office/2019/extlst" xmlns:r="http://schemas.openxmlformats.org/officeDocument/2006/relationships" xmlns:wp14="http://schemas.microsoft.com/office/word/2010/wordprocessingDrawing" xmlns:wp="http://schemas.openxmlformats.org/drawingml/2006/wordprocessingDrawing" xmlns:wpg="http://schemas.microsoft.com/office/word/2010/wordprocessingGroup" xmlns:wpi="http://schemas.microsoft.com/office/word/2010/wordprocessingInk" xmlns:wps="http://schemas.microsoft.com/office/word/2010/wordprocessingShape" xmlns:o="urn:schemas-microsoft-com:office:office" xmlns:v="urn:schemas-microsoft-com:vml" xmlns:w10="urn:schemas-microsoft-com:office:word" xmlns:w="http://schemas.openxmlformats.org/wordprocessingml/2006/main" xmlns:w14="http://schemas.microsoft.com/office/word/2010/wordml" xmlns:w15="http://schemas.microsoft.com/office/word/2012/wordml" xmlns:w16cex="http://schemas.microsoft.com/office/word/2018/wordml/cex" xmlns:w16cid="http://schemas.microsoft.com/office/word/2016/wordml/cid" xmlns:w16="http://schemas.microsoft.com/office/word/2018/wordml" xmlns:w16sdtdh="http://schemas.microsoft.com/office/word/2020/wordml/sdtdatahash" xmlns:w16sdtfl="http://schemas.microsoft.com/office/word/2024/wordml/sdtformatlock" xmlns:w16se="http://schemas.microsoft.com/office/word/2015/wordml/symex" xmlns:w16du="http://schemas.microsoft.com/office/word/2023/wordml/word16du" xmlns:wne="http://schemas.microsoft.com/office/word/2006/wordml" mc:Ignorable="w14 w15 w16se w16cid w16 w16cex w16sdtdh w16sdtfl w16du wp14">
+<w:numbering xmlns:wpc="http://schemas.microsoft.com/office/word/2010/wordprocessingCanvas" xmlns:cx="http://schemas.microsoft.com/office/drawing/2014/chartex" xmlns:cx1="http://schemas.microsoft.com/office/drawing/2015/9/8/chartex" xmlns:cx2="http://schemas.microsoft.com/office/drawing/2015/10/21/chartex" xmlns:cx3="http://schemas.microsoft.com/office/drawing/2016/5/9/chartex" xmlns:cx4="http://schemas.microsoft.com/office/drawing/2016/5/10/chartex" xmlns:cx5="http://schemas.microsoft.com/office/drawing/2016/5/11/chartex" xmlns:cx6="http://schemas.microsoft.com/office/drawing/2016/5/12/chartex" xmlns:cx7="http://schemas.microsoft.com/office/drawing/2016/5/13/chartex" xmlns:cx8="http://schemas.microsoft.com/office/drawing/2016/5/14/chartex" xmlns:mc="http://schemas.openxmlformats.org/markup-compatibility/2006" xmlns:aink="http://schemas.microsoft.com/office/drawing/2016/ink" xmlns:am3d="http://schemas.microsoft.com/office/drawing/2017/model3d" xmlns:o="urn:schemas-microsoft-com:office:office" xmlns:oel="http://schemas.microsoft.com/office/2019/extlst" xmlns:r="http://schemas.openxmlformats.org/officeDocument/2006/relationships" xmlns:m="http://schemas.openxmlformats.org/officeDocument/2006/math" xmlns:v="urn:schemas-microsoft-com:vml" xmlns:wp14="http://schemas.microsoft.com/office/word/2010/wordprocessingDrawing" xmlns:wp="http://schemas.openxmlformats.org/drawingml/2006/wordprocessingDrawing" xmlns:w10="urn:schemas-microsoft-com:office:word" xmlns:w="http://schemas.openxmlformats.org/wordprocessingml/2006/main" xmlns:w14="http://schemas.microsoft.com/office/word/2010/wordml" xmlns:w15="http://schemas.microsoft.com/office/word/2012/wordml" xmlns:w16cex="http://schemas.microsoft.com/office/word/2018/wordml/cex" xmlns:w16cid="http://schemas.microsoft.com/office/word/2016/wordml/cid" xmlns:w16="http://schemas.microsoft.com/office/word/2018/wordml" xmlns:w16du="http://schemas.microsoft.com/office/word/2023/wordml/word16du" xmlns:w16sdtdh="http://schemas.microsoft.com/office/word/2020/wordml/sdtdatahash" xmlns:w16sdtfl="http://schemas.microsoft.com/office/word/2024/wordml/sdtformatlock" xmlns:w16se="http://schemas.microsoft.com/office/word/2015/wordml/symex" xmlns:wpg="http://schemas.microsoft.com/office/word/2010/wordprocessingGroup" xmlns:wpi="http://schemas.microsoft.com/office/word/2010/wordprocessingInk" xmlns:wne="http://schemas.microsoft.com/office/word/2006/wordml" xmlns:wps="http://schemas.microsoft.com/office/word/2010/wordprocessingShape" mc:Ignorable="w14 w15 w16se w16cid w16 w16cex w16sdtdh w16sdtfl w16du wp14">
   <w:abstractNum w:abstractNumId="0" w15:restartNumberingAfterBreak="0">
     <w:nsid w:val="067AA7C9"/>
     <w:multiLevelType w:val="hybridMultilevel"/>
@@ -22206,92 +21381,6 @@
     </w:lvl>
   </w:abstractNum>
   <w:abstractNum w:abstractNumId="2" w15:restartNumberingAfterBreak="0">
-    <w:nsid w:val="28BE2E51"/>
-    <w:multiLevelType w:val="hybridMultilevel"/>
-    <w:tmpl w:val="729E91E2"/>
-    <w:lvl w:ilvl="0" w:tplc="34B6A6F6">
-      <w:start w:val="1"/>
-      <w:numFmt w:val="decimal"/>
-      <w:lvlText w:val="(%1)"/>
-      <w:lvlJc w:val="left"/>
-      <w:pPr>
-        <w:ind w:left="720" w:hanging="360"/>
-      </w:pPr>
-    </w:lvl>
-    <w:lvl w:ilvl="1" w:tplc="BC0A6672">
-      <w:start w:val="1"/>
-      <w:numFmt w:val="lowerLetter"/>
-      <w:lvlText w:val="%2."/>
-      <w:lvlJc w:val="left"/>
-      <w:pPr>
-        <w:ind w:left="1440" w:hanging="360"/>
-      </w:pPr>
-    </w:lvl>
-    <w:lvl w:ilvl="2" w:tplc="8A1E2A88">
-      <w:start w:val="1"/>
-      <w:numFmt w:val="lowerRoman"/>
-      <w:lvlText w:val="%3."/>
-      <w:lvlJc w:val="right"/>
-      <w:pPr>
-        <w:ind w:left="2160" w:hanging="180"/>
-      </w:pPr>
-    </w:lvl>
-    <w:lvl w:ilvl="3" w:tplc="182CD1BE">
-      <w:start w:val="1"/>
-      <w:numFmt w:val="decimal"/>
-      <w:lvlText w:val="%4."/>
-      <w:lvlJc w:val="left"/>
-      <w:pPr>
-        <w:ind w:left="2880" w:hanging="360"/>
-      </w:pPr>
-    </w:lvl>
-    <w:lvl w:ilvl="4" w:tplc="E530FCB0">
-      <w:start w:val="1"/>
-      <w:numFmt w:val="lowerLetter"/>
-      <w:lvlText w:val="%5."/>
-      <w:lvlJc w:val="left"/>
-      <w:pPr>
-        <w:ind w:left="3600" w:hanging="360"/>
-      </w:pPr>
-    </w:lvl>
-    <w:lvl w:ilvl="5" w:tplc="B016E5CE">
-      <w:start w:val="1"/>
-      <w:numFmt w:val="lowerRoman"/>
-      <w:lvlText w:val="%6."/>
-      <w:lvlJc w:val="right"/>
-      <w:pPr>
-        <w:ind w:left="4320" w:hanging="180"/>
-      </w:pPr>
-    </w:lvl>
-    <w:lvl w:ilvl="6" w:tplc="C95EAC82">
-      <w:start w:val="1"/>
-      <w:numFmt w:val="decimal"/>
-      <w:lvlText w:val="%7."/>
-      <w:lvlJc w:val="left"/>
-      <w:pPr>
-        <w:ind w:left="5040" w:hanging="360"/>
-      </w:pPr>
-    </w:lvl>
-    <w:lvl w:ilvl="7" w:tplc="7B40A35E">
-      <w:start w:val="1"/>
-      <w:numFmt w:val="lowerLetter"/>
-      <w:lvlText w:val="%8."/>
-      <w:lvlJc w:val="left"/>
-      <w:pPr>
-        <w:ind w:left="5760" w:hanging="360"/>
-      </w:pPr>
-    </w:lvl>
-    <w:lvl w:ilvl="8" w:tplc="E5A80964">
-      <w:start w:val="1"/>
-      <w:numFmt w:val="lowerRoman"/>
-      <w:lvlText w:val="%9."/>
-      <w:lvlJc w:val="right"/>
-      <w:pPr>
-        <w:ind w:left="6480" w:hanging="180"/>
-      </w:pPr>
-    </w:lvl>
-  </w:abstractNum>
-  <w:abstractNum w:abstractNumId="3" w15:restartNumberingAfterBreak="0">
     <w:nsid w:val="3A8A06AA"/>
     <w:multiLevelType w:val="hybridMultilevel"/>
     <w:tmpl w:val="950ED674"/>
@@ -22380,7 +21469,7 @@
       </w:pPr>
     </w:lvl>
   </w:abstractNum>
-  <w:abstractNum w:abstractNumId="4" w15:restartNumberingAfterBreak="0">
+  <w:abstractNum w:abstractNumId="3" w15:restartNumberingAfterBreak="0">
     <w:nsid w:val="47567EB8"/>
     <w:multiLevelType w:val="hybridMultilevel"/>
     <w:tmpl w:val="81B211E0"/>
@@ -22469,7 +21558,7 @@
       </w:pPr>
     </w:lvl>
   </w:abstractNum>
-  <w:abstractNum w:abstractNumId="5" w15:restartNumberingAfterBreak="0">
+  <w:abstractNum w:abstractNumId="4" w15:restartNumberingAfterBreak="0">
     <w:nsid w:val="4BFD5EA2"/>
     <w:multiLevelType w:val="hybridMultilevel"/>
     <w:tmpl w:val="28AC94E0"/>
@@ -22558,7 +21647,7 @@
       </w:pPr>
     </w:lvl>
   </w:abstractNum>
-  <w:abstractNum w:abstractNumId="6" w15:restartNumberingAfterBreak="0">
+  <w:abstractNum w:abstractNumId="5" w15:restartNumberingAfterBreak="0">
     <w:nsid w:val="62692469"/>
     <w:multiLevelType w:val="hybridMultilevel"/>
     <w:tmpl w:val="AE2ECEBA"/>
@@ -22647,93 +21736,7 @@
       </w:pPr>
     </w:lvl>
   </w:abstractNum>
-  <w:abstractNum w:abstractNumId="7" w15:restartNumberingAfterBreak="0">
-    <w:nsid w:val="6586888E"/>
-    <w:multiLevelType w:val="hybridMultilevel"/>
-    <w:tmpl w:val="3FC02DAE"/>
-    <w:lvl w:ilvl="0" w:tplc="BE30C442">
-      <w:start w:val="1"/>
-      <w:numFmt w:val="decimal"/>
-      <w:lvlText w:val="(%1)"/>
-      <w:lvlJc w:val="left"/>
-      <w:pPr>
-        <w:ind w:left="720" w:hanging="360"/>
-      </w:pPr>
-    </w:lvl>
-    <w:lvl w:ilvl="1" w:tplc="CA9AF504">
-      <w:start w:val="1"/>
-      <w:numFmt w:val="lowerLetter"/>
-      <w:lvlText w:val="%2."/>
-      <w:lvlJc w:val="left"/>
-      <w:pPr>
-        <w:ind w:left="1440" w:hanging="360"/>
-      </w:pPr>
-    </w:lvl>
-    <w:lvl w:ilvl="2" w:tplc="36BC5814">
-      <w:start w:val="1"/>
-      <w:numFmt w:val="lowerRoman"/>
-      <w:lvlText w:val="%3."/>
-      <w:lvlJc w:val="right"/>
-      <w:pPr>
-        <w:ind w:left="2160" w:hanging="180"/>
-      </w:pPr>
-    </w:lvl>
-    <w:lvl w:ilvl="3" w:tplc="81983072">
-      <w:start w:val="1"/>
-      <w:numFmt w:val="decimal"/>
-      <w:lvlText w:val="%4."/>
-      <w:lvlJc w:val="left"/>
-      <w:pPr>
-        <w:ind w:left="2880" w:hanging="360"/>
-      </w:pPr>
-    </w:lvl>
-    <w:lvl w:ilvl="4" w:tplc="E926EA06">
-      <w:start w:val="1"/>
-      <w:numFmt w:val="lowerLetter"/>
-      <w:lvlText w:val="%5."/>
-      <w:lvlJc w:val="left"/>
-      <w:pPr>
-        <w:ind w:left="3600" w:hanging="360"/>
-      </w:pPr>
-    </w:lvl>
-    <w:lvl w:ilvl="5" w:tplc="995C043E">
-      <w:start w:val="1"/>
-      <w:numFmt w:val="lowerRoman"/>
-      <w:lvlText w:val="%6."/>
-      <w:lvlJc w:val="right"/>
-      <w:pPr>
-        <w:ind w:left="4320" w:hanging="180"/>
-      </w:pPr>
-    </w:lvl>
-    <w:lvl w:ilvl="6" w:tplc="F62226E0">
-      <w:start w:val="1"/>
-      <w:numFmt w:val="decimal"/>
-      <w:lvlText w:val="%7."/>
-      <w:lvlJc w:val="left"/>
-      <w:pPr>
-        <w:ind w:left="5040" w:hanging="360"/>
-      </w:pPr>
-    </w:lvl>
-    <w:lvl w:ilvl="7" w:tplc="EB268E28">
-      <w:start w:val="1"/>
-      <w:numFmt w:val="lowerLetter"/>
-      <w:lvlText w:val="%8."/>
-      <w:lvlJc w:val="left"/>
-      <w:pPr>
-        <w:ind w:left="5760" w:hanging="360"/>
-      </w:pPr>
-    </w:lvl>
-    <w:lvl w:ilvl="8" w:tplc="3D5AF51A">
-      <w:start w:val="1"/>
-      <w:numFmt w:val="lowerRoman"/>
-      <w:lvlText w:val="%9."/>
-      <w:lvlJc w:val="right"/>
-      <w:pPr>
-        <w:ind w:left="6480" w:hanging="180"/>
-      </w:pPr>
-    </w:lvl>
-  </w:abstractNum>
-  <w:abstractNum w:abstractNumId="8" w15:restartNumberingAfterBreak="0">
+  <w:abstractNum w:abstractNumId="6" w15:restartNumberingAfterBreak="0">
     <w:nsid w:val="695B1B28"/>
     <w:multiLevelType w:val="hybridMultilevel"/>
     <w:tmpl w:val="12CA34E6"/>
@@ -22822,7 +21825,7 @@
       </w:pPr>
     </w:lvl>
   </w:abstractNum>
-  <w:abstractNum w:abstractNumId="9" w15:restartNumberingAfterBreak="0">
+  <w:abstractNum w:abstractNumId="7" w15:restartNumberingAfterBreak="0">
     <w:nsid w:val="7DFB5769"/>
     <w:multiLevelType w:val="hybridMultilevel"/>
     <w:tmpl w:val="1A34A41E"/>
@@ -22912,42 +21915,36 @@
       </w:pPr>
     </w:lvl>
   </w:abstractNum>
-  <w:num w:numId="1" w16cid:durableId="1683512109">
+  <w:num w:numId="1" w16cid:durableId="1452046558">
+    <w:abstractNumId w:val="0"/>
+  </w:num>
+  <w:num w:numId="2" w16cid:durableId="1709603898">
     <w:abstractNumId w:val="7"/>
   </w:num>
-  <w:num w:numId="2" w16cid:durableId="1401753268">
+  <w:num w:numId="3" w16cid:durableId="1537572746">
+    <w:abstractNumId w:val="4"/>
+  </w:num>
+  <w:num w:numId="4" w16cid:durableId="1691566810">
+    <w:abstractNumId w:val="1"/>
+  </w:num>
+  <w:num w:numId="5" w16cid:durableId="945772516">
     <w:abstractNumId w:val="2"/>
   </w:num>
-  <w:num w:numId="3" w16cid:durableId="1452046558">
-    <w:abstractNumId w:val="0"/>
-  </w:num>
-  <w:num w:numId="4" w16cid:durableId="1709603898">
-    <w:abstractNumId w:val="9"/>
-  </w:num>
-  <w:num w:numId="5" w16cid:durableId="1537572746">
-    <w:abstractNumId w:val="5"/>
-  </w:num>
-  <w:num w:numId="6" w16cid:durableId="1691566810">
-    <w:abstractNumId w:val="1"/>
-  </w:num>
-  <w:num w:numId="7" w16cid:durableId="945772516">
+  <w:num w:numId="6" w16cid:durableId="1983197635">
     <w:abstractNumId w:val="3"/>
   </w:num>
-  <w:num w:numId="8" w16cid:durableId="1983197635">
-    <w:abstractNumId w:val="4"/>
+  <w:num w:numId="7" w16cid:durableId="970015686">
+    <w:abstractNumId w:val="6"/>
   </w:num>
-  <w:num w:numId="9" w16cid:durableId="970015686">
-    <w:abstractNumId w:val="8"/>
-  </w:num>
-  <w:num w:numId="10" w16cid:durableId="737629545">
-    <w:abstractNumId w:val="6"/>
+  <w:num w:numId="8" w16cid:durableId="737629545">
+    <w:abstractNumId w:val="5"/>
   </w:num>
   <w:numIdMacAtCleanup w:val="2"/>
 </w:numbering>
 </file>
 
 <file path=word/styles.xml><?xml version="1.0" encoding="utf-8"?>
-<w:styles xmlns:mc="http://schemas.openxmlformats.org/markup-compatibility/2006" xmlns:r="http://schemas.openxmlformats.org/officeDocument/2006/relationships" xmlns:w="http://schemas.openxmlformats.org/wordprocessingml/2006/main" xmlns:w14="http://schemas.microsoft.com/office/word/2010/wordml" xmlns:w15="http://schemas.microsoft.com/office/word/2012/wordml" xmlns:w16cex="http://schemas.microsoft.com/office/word/2018/wordml/cex" xmlns:w16cid="http://schemas.microsoft.com/office/word/2016/wordml/cid" xmlns:w16="http://schemas.microsoft.com/office/word/2018/wordml" xmlns:w16sdtdh="http://schemas.microsoft.com/office/word/2020/wordml/sdtdatahash" xmlns:w16sdtfl="http://schemas.microsoft.com/office/word/2024/wordml/sdtformatlock" xmlns:w16se="http://schemas.microsoft.com/office/word/2015/wordml/symex" xmlns:w16du="http://schemas.microsoft.com/office/word/2023/wordml/word16du" mc:Ignorable="w14 w15 w16se w16cid w16 w16cex w16sdtdh w16sdtfl w16du">
+<w:styles xmlns:mc="http://schemas.openxmlformats.org/markup-compatibility/2006" xmlns:r="http://schemas.openxmlformats.org/officeDocument/2006/relationships" xmlns:w="http://schemas.openxmlformats.org/wordprocessingml/2006/main" xmlns:w14="http://schemas.microsoft.com/office/word/2010/wordml" xmlns:w15="http://schemas.microsoft.com/office/word/2012/wordml" xmlns:w16cex="http://schemas.microsoft.com/office/word/2018/wordml/cex" xmlns:w16cid="http://schemas.microsoft.com/office/word/2016/wordml/cid" xmlns:w16="http://schemas.microsoft.com/office/word/2018/wordml" xmlns:w16du="http://schemas.microsoft.com/office/word/2023/wordml/word16du" xmlns:w16sdtdh="http://schemas.microsoft.com/office/word/2020/wordml/sdtdatahash" xmlns:w16sdtfl="http://schemas.microsoft.com/office/word/2024/wordml/sdtformatlock" xmlns:w16se="http://schemas.microsoft.com/office/word/2015/wordml/symex" mc:Ignorable="w14 w15 w16se w16cid w16 w16cex w16sdtdh w16sdtfl w16du">
   <w:docDefaults>
     <w:rPrDefault>
       <w:rPr>
@@ -23388,7 +22385,7 @@
     <w:rsid w:val="006F350D"/>
     <w:pPr>
       <w:numPr>
-        <w:numId w:val="4"/>
+        <w:numId w:val="2"/>
       </w:numPr>
       <w:outlineLvl w:val="1"/>
     </w:pPr>
@@ -24622,30 +23619,6 @@
 </file>
 
 <file path=customXml/item1.xml><?xml version="1.0" encoding="utf-8"?>
-<?mso-contentType ?>
-<FormTemplates xmlns="http://schemas.microsoft.com/sharepoint/v3/contenttype/forms">
-  <Display>DocumentLibraryForm</Display>
-  <Edit>DocumentLibraryForm</Edit>
-  <New>DocumentLibraryForm</New>
-</FormTemplates>
-</file>
-
-<file path=customXml/item2.xml><?xml version="1.0" encoding="utf-8"?>
-<b:Sources xmlns:b="http://schemas.openxmlformats.org/officeDocument/2006/bibliography" xmlns="http://schemas.openxmlformats.org/officeDocument/2006/bibliography" SelectedStyle="/APASixthEditionOfficeOnline.xsl" StyleName="APA" Version="6"/>
-</file>
-
-<file path=customXml/item3.xml><?xml version="1.0" encoding="utf-8"?>
-<p:properties xmlns:p="http://schemas.microsoft.com/office/2006/metadata/properties" xmlns:xsi="http://www.w3.org/2001/XMLSchema-instance" xmlns:pc="http://schemas.microsoft.com/office/infopath/2007/PartnerControls">
-  <documentManagement>
-    <lcf76f155ced4ddcb4097134ff3c332f xmlns="6ed2871a-fb85-490f-96d6-5efc24751d30">
-      <Terms xmlns="http://schemas.microsoft.com/office/infopath/2007/PartnerControls"/>
-    </lcf76f155ced4ddcb4097134ff3c332f>
-    <TaxCatchAll xmlns="0dbddcdf-89e9-4140-9b8d-dbfabb47f1e9" xsi:nil="true"/>
-  </documentManagement>
-</p:properties>
-</file>
-
-<file path=customXml/item4.xml><?xml version="1.0" encoding="utf-8"?>
 <ct:contentTypeSchema xmlns:ct="http://schemas.microsoft.com/office/2006/metadata/contentType" xmlns:ma="http://schemas.microsoft.com/office/2006/metadata/properties/metaAttributes" ct:_="" ma:_="" ma:contentTypeName="Documento" ma:contentTypeID="0x010100EE0CF48B78E0254885E55935F2018255" ma:contentTypeVersion="12" ma:contentTypeDescription="Crear nuevo documento." ma:contentTypeScope="" ma:versionID="d4e26e7c8965213af1eb0bb4b99b56fb">
   <xsd:schema xmlns:xsd="http://www.w3.org/2001/XMLSchema" xmlns:xs="http://www.w3.org/2001/XMLSchema" xmlns:p="http://schemas.microsoft.com/office/2006/metadata/properties" xmlns:ns2="6ed2871a-fb85-490f-96d6-5efc24751d30" xmlns:ns3="0dbddcdf-89e9-4140-9b8d-dbfabb47f1e9" targetNamespace="http://schemas.microsoft.com/office/2006/metadata/properties" ma:root="true" ma:fieldsID="2deae8d961f0c34310364e0acc8e8d48" ns2:_="" ns3:_="">
     <xsd:import namespace="6ed2871a-fb85-490f-96d6-5efc24751d30"/>
@@ -24846,34 +23819,31 @@
 </ct:contentTypeSchema>
 </file>
 
-<file path=customXml/itemProps1.xml><?xml version="1.0" encoding="utf-8"?>
-<ds:datastoreItem xmlns:ds="http://schemas.openxmlformats.org/officeDocument/2006/customXml" ds:itemID="{2B96AB21-B603-4F01-A91B-9DE6CC710E18}">
-  <ds:schemaRefs>
-    <ds:schemaRef ds:uri="http://schemas.microsoft.com/sharepoint/v3/contenttype/forms"/>
-  </ds:schemaRefs>
-</ds:datastoreItem>
+<file path=customXml/item2.xml><?xml version="1.0" encoding="utf-8"?>
+<?mso-contentType ?>
+<FormTemplates xmlns="http://schemas.microsoft.com/sharepoint/v3/contenttype/forms">
+  <Display>DocumentLibraryForm</Display>
+  <Edit>DocumentLibraryForm</Edit>
+  <New>DocumentLibraryForm</New>
+</FormTemplates>
 </file>
 
-<file path=customXml/itemProps2.xml><?xml version="1.0" encoding="utf-8"?>
-<ds:datastoreItem xmlns:ds="http://schemas.openxmlformats.org/officeDocument/2006/customXml" ds:itemID="{DA285533-3A1A-2446-8130-75FABB62DCC8}">
-  <ds:schemaRefs>
-    <ds:schemaRef ds:uri="http://schemas.openxmlformats.org/officeDocument/2006/bibliography"/>
-  </ds:schemaRefs>
-</ds:datastoreItem>
+<file path=customXml/item3.xml><?xml version="1.0" encoding="utf-8"?>
+<b:Sources xmlns:b="http://schemas.openxmlformats.org/officeDocument/2006/bibliography" xmlns="http://schemas.openxmlformats.org/officeDocument/2006/bibliography" SelectedStyle="/APASixthEditionOfficeOnline.xsl" StyleName="APA" Version="6"/>
 </file>
 
-<file path=customXml/itemProps3.xml><?xml version="1.0" encoding="utf-8"?>
-<ds:datastoreItem xmlns:ds="http://schemas.openxmlformats.org/officeDocument/2006/customXml" ds:itemID="{5D1E2FE9-7812-437C-A9F1-244BC5FCCC33}">
-  <ds:schemaRefs>
-    <ds:schemaRef ds:uri="http://schemas.microsoft.com/office/2006/metadata/properties"/>
-    <ds:schemaRef ds:uri="http://schemas.microsoft.com/office/infopath/2007/PartnerControls"/>
-    <ds:schemaRef ds:uri="6ed2871a-fb85-490f-96d6-5efc24751d30"/>
-    <ds:schemaRef ds:uri="0dbddcdf-89e9-4140-9b8d-dbfabb47f1e9"/>
-  </ds:schemaRefs>
-</ds:datastoreItem>
+<file path=customXml/item4.xml><?xml version="1.0" encoding="utf-8"?>
+<p:properties xmlns:p="http://schemas.microsoft.com/office/2006/metadata/properties" xmlns:xsi="http://www.w3.org/2001/XMLSchema-instance" xmlns:pc="http://schemas.microsoft.com/office/infopath/2007/PartnerControls">
+  <documentManagement>
+    <lcf76f155ced4ddcb4097134ff3c332f xmlns="6ed2871a-fb85-490f-96d6-5efc24751d30">
+      <Terms xmlns="http://schemas.microsoft.com/office/infopath/2007/PartnerControls"/>
+    </lcf76f155ced4ddcb4097134ff3c332f>
+    <TaxCatchAll xmlns="0dbddcdf-89e9-4140-9b8d-dbfabb47f1e9" xsi:nil="true"/>
+  </documentManagement>
+</p:properties>
 </file>
 
-<file path=customXml/itemProps4.xml><?xml version="1.0" encoding="utf-8"?>
+<file path=customXml/itemProps1.xml><?xml version="1.0" encoding="utf-8"?>
 <ds:datastoreItem xmlns:ds="http://schemas.openxmlformats.org/officeDocument/2006/customXml" ds:itemID="{696BD704-88A4-469C-8D1C-1FC2119F6682}">
   <ds:schemaRefs>
     <ds:schemaRef ds:uri="http://schemas.microsoft.com/office/2006/metadata/contentType"/>
@@ -24890,4 +23860,31 @@
     <ds:schemaRef ds:uri="http://schemas.microsoft.com/internal/obd"/>
   </ds:schemaRefs>
 </ds:datastoreItem>
+</file>
+
+<file path=customXml/itemProps2.xml><?xml version="1.0" encoding="utf-8"?>
+<ds:datastoreItem xmlns:ds="http://schemas.openxmlformats.org/officeDocument/2006/customXml" ds:itemID="{2B96AB21-B603-4F01-A91B-9DE6CC710E18}">
+  <ds:schemaRefs>
+    <ds:schemaRef ds:uri="http://schemas.microsoft.com/sharepoint/v3/contenttype/forms"/>
+  </ds:schemaRefs>
+</ds:datastoreItem>
+</file>
+
+<file path=customXml/itemProps3.xml><?xml version="1.0" encoding="utf-8"?>
+<ds:datastoreItem xmlns:ds="http://schemas.openxmlformats.org/officeDocument/2006/customXml" ds:itemID="{DA285533-3A1A-2446-8130-75FABB62DCC8}">
+  <ds:schemaRefs>
+    <ds:schemaRef ds:uri="http://schemas.openxmlformats.org/officeDocument/2006/bibliography"/>
+  </ds:schemaRefs>
+</ds:datastoreItem>
+</file>
+
+<file path=customXml/itemProps4.xml><?xml version="1.0" encoding="utf-8"?>
+<ds:datastoreItem xmlns:ds="http://schemas.openxmlformats.org/officeDocument/2006/customXml" ds:itemID="{5D1E2FE9-7812-437C-A9F1-244BC5FCCC33}">
+  <ds:schemaRefs>
+    <ds:schemaRef ds:uri="http://schemas.microsoft.com/office/2006/metadata/properties"/>
+    <ds:schemaRef ds:uri="http://schemas.microsoft.com/office/infopath/2007/PartnerControls"/>
+    <ds:schemaRef ds:uri="6ed2871a-fb85-490f-96d6-5efc24751d30"/>
+    <ds:schemaRef ds:uri="0dbddcdf-89e9-4140-9b8d-dbfabb47f1e9"/>
+  </ds:schemaRefs>
+</ds:datastoreItem>
 </file>
</xml_diff>